<commit_message>
fix paragraph in planning paper
</commit_message>
<xml_diff>
--- a/knowledgebase/papers/wip/попереднє_планування.docx
+++ b/knowledgebase/papers/wip/попереднє_планування.docx
@@ -1601,39 +1601,15 @@
           <w:szCs w:val="24"/>
           <w:lang w:val="uk-UA" w:eastAsia="en-US"/>
         </w:rPr>
-        <w:t xml:space="preserve"> п</w:t>
-      </w:r>
-      <w:r>
-        <w:rPr>
-          <w:rFonts w:ascii="Times New Roman CYR" w:hAnsi="Times New Roman CYR" w:cs="Times New Roman CYR"/>
-          <w:szCs w:val="24"/>
-          <w:lang w:val="uk-UA" w:eastAsia="en-US"/>
-        </w:rPr>
-        <w:t>ро місцевість</w:t>
-      </w:r>
-      <w:r>
-        <w:rPr>
-          <w:rFonts w:ascii="Times New Roman CYR" w:hAnsi="Times New Roman CYR" w:cs="Times New Roman CYR"/>
-          <w:szCs w:val="24"/>
-          <w:lang w:val="uk-UA" w:eastAsia="en-US"/>
-        </w:rPr>
-        <w:t xml:space="preserve"> для виконання завдань</w:t>
-      </w:r>
-      <w:r>
-        <w:rPr>
-          <w:rFonts w:ascii="Times New Roman CYR" w:hAnsi="Times New Roman CYR" w:cs="Times New Roman CYR"/>
-          <w:szCs w:val="24"/>
-          <w:lang w:val="uk-UA" w:eastAsia="en-US"/>
-        </w:rPr>
-        <w:t>:</w:t>
-      </w:r>
-      <w:r>
-        <w:rPr>
-          <w:rFonts w:ascii="Times New Roman CYR" w:hAnsi="Times New Roman CYR" w:cs="Times New Roman CYR"/>
-          <w:szCs w:val="24"/>
-          <w:lang w:val="uk-UA" w:eastAsia="en-US"/>
-        </w:rPr>
-        <w:t xml:space="preserve"> </w:t>
+        <w:t xml:space="preserve"> про місцевість для виконання завдань</w:t>
+      </w:r>
+      <w:r>
+        <w:rPr>
+          <w:rFonts w:ascii="Times New Roman CYR" w:hAnsi="Times New Roman CYR" w:cs="Times New Roman CYR"/>
+          <w:szCs w:val="24"/>
+          <w:lang w:val="uk-UA" w:eastAsia="en-US"/>
+        </w:rPr>
+        <w:t xml:space="preserve">: </w:t>
       </w:r>
       <w:proofErr w:type="spellStart"/>
       <w:r>
@@ -3204,6 +3180,15 @@
           <w:szCs w:val="24"/>
           <w:lang w:val="uk-UA" w:eastAsia="en-US"/>
         </w:rPr>
+        <w:t xml:space="preserve"> цільову</w:t>
+      </w:r>
+      <w:r>
+        <w:rPr>
+          <w:rFonts w:eastAsiaTheme="minorEastAsia" w:cs="Times New Roman"/>
+          <w:color w:val="000000"/>
+          <w:szCs w:val="24"/>
+          <w:lang w:val="uk-UA" w:eastAsia="en-US"/>
+        </w:rPr>
         <w:t xml:space="preserve"> </w:t>
       </w:r>
       <w:r>
@@ -3213,7 +3198,7 @@
           <w:szCs w:val="24"/>
           <w:lang w:val="uk-UA" w:eastAsia="en-US"/>
         </w:rPr>
-        <w:t>функцію для</w:t>
+        <w:t>функцію</w:t>
       </w:r>
       <w:r>
         <w:rPr>
@@ -7781,16 +7766,45 @@
           <w:szCs w:val="24"/>
           <w:lang w:val="uk-UA" w:eastAsia="en-US"/>
         </w:rPr>
-        <w:t xml:space="preserve">Рішенням даної задачі має бути множина маршрутів </w:t>
-      </w:r>
-      <w:r>
-        <w:rPr>
-          <w:rFonts w:eastAsiaTheme="minorEastAsia" w:cs="Times New Roman"/>
-          <w:color w:val="000000"/>
-          <w:szCs w:val="24"/>
-          <w:lang w:val="uk-UA" w:eastAsia="en-US"/>
-        </w:rPr>
-        <w:t xml:space="preserve">з найменшим часом виконання польоту. Так як від точності локалізації під час польоту залежить точність та оперативність виконання завдання, то </w:t>
+        <w:t xml:space="preserve">Рішенням задачі має бути множина </w:t>
+      </w:r>
+      <w:proofErr w:type="spellStart"/>
+      <w:r>
+        <w:rPr>
+          <w:rFonts w:eastAsiaTheme="minorEastAsia" w:cs="Times New Roman"/>
+          <w:color w:val="000000"/>
+          <w:szCs w:val="24"/>
+          <w:lang w:val="uk-UA" w:eastAsia="en-US"/>
+        </w:rPr>
+        <w:t>Парето</w:t>
+      </w:r>
+      <w:proofErr w:type="spellEnd"/>
+      <w:r>
+        <w:rPr>
+          <w:rFonts w:eastAsiaTheme="minorEastAsia" w:cs="Times New Roman"/>
+          <w:color w:val="000000"/>
+          <w:szCs w:val="24"/>
+          <w:lang w:val="uk-UA" w:eastAsia="en-US"/>
+        </w:rPr>
+        <w:t>-оптимальних маршрутів</w:t>
+      </w:r>
+      <w:r>
+        <w:rPr>
+          <w:rFonts w:eastAsiaTheme="minorEastAsia" w:cs="Times New Roman"/>
+          <w:color w:val="000000"/>
+          <w:szCs w:val="24"/>
+          <w:lang w:val="uk-UA" w:eastAsia="en-US"/>
+        </w:rPr>
+        <w:t xml:space="preserve"> за критеріями наведеними вище. </w:t>
+      </w:r>
+      <w:r>
+        <w:rPr>
+          <w:rFonts w:eastAsiaTheme="minorEastAsia" w:cs="Times New Roman"/>
+          <w:color w:val="000000"/>
+          <w:szCs w:val="24"/>
+          <w:lang w:val="uk-UA" w:eastAsia="en-US"/>
+        </w:rPr>
+        <w:t xml:space="preserve">Так як від точності локалізації під час польоту залежить точність та оперативність виконання завдання, то </w:t>
       </w:r>
       <w:r>
         <w:rPr>
@@ -8574,6 +8588,7 @@
         </w:rPr>
         <w:t xml:space="preserve"> </w:t>
       </w:r>
+      <w:bookmarkStart w:id="0" w:name="_GoBack"/>
       <w:r>
         <w:rPr>
           <w:rFonts w:eastAsiaTheme="minorEastAsia" w:cs="Times New Roman"/>
@@ -8612,6 +8627,7 @@
         </w:rPr>
         <w:t>, зваживши можливі поступки по критеріям</w:t>
       </w:r>
+      <w:bookmarkEnd w:id="0"/>
       <w:r>
         <w:rPr>
           <w:rFonts w:eastAsiaTheme="minorEastAsia" w:cs="Times New Roman"/>
@@ -8783,8 +8799,6 @@
           <w:lang w:val="uk-UA" w:eastAsia="en-US"/>
         </w:rPr>
       </w:pPr>
-      <w:bookmarkStart w:id="0" w:name="_GoBack"/>
-      <w:bookmarkEnd w:id="0"/>
     </w:p>
     <w:p>
       <w:pPr>

</xml_diff>

<commit_message>
added orthophotos cases for evaluation
</commit_message>
<xml_diff>
--- a/knowledgebase/papers/wip/попереднє_планування.docx
+++ b/knowledgebase/papers/wip/попереднє_планування.docx
@@ -382,7 +382,6 @@
           <w:lang w:val="en-GB"/>
         </w:rPr>
       </w:pPr>
-      <w:proofErr w:type="spellStart"/>
       <w:r>
         <w:rPr>
           <w:rFonts w:ascii="Times New Roman CYR" w:hAnsi="Times New Roman CYR" w:cs="Times New Roman CYR"/>
@@ -393,46 +392,7 @@
           <w:szCs w:val="24"/>
           <w:lang w:val="en-GB"/>
         </w:rPr>
-        <w:t>Kovbasiuk</w:t>
-      </w:r>
-      <w:proofErr w:type="spellEnd"/>
-      <w:r>
-        <w:rPr>
-          <w:rFonts w:ascii="Times New Roman CYR" w:hAnsi="Times New Roman CYR" w:cs="Times New Roman CYR"/>
-          <w:b/>
-          <w:bCs/>
-          <w:color w:val="000000"/>
-          <w:sz w:val="24"/>
-          <w:szCs w:val="24"/>
-          <w:lang w:val="en-GB"/>
-        </w:rPr>
-        <w:t xml:space="preserve"> S., </w:t>
-      </w:r>
-      <w:proofErr w:type="spellStart"/>
-      <w:r>
-        <w:rPr>
-          <w:rFonts w:ascii="Times New Roman CYR" w:hAnsi="Times New Roman CYR" w:cs="Times New Roman CYR"/>
-          <w:b/>
-          <w:bCs/>
-          <w:color w:val="000000"/>
-          <w:sz w:val="24"/>
-          <w:szCs w:val="24"/>
-          <w:lang w:val="en-GB"/>
-        </w:rPr>
-        <w:t>Ukrainets</w:t>
-      </w:r>
-      <w:proofErr w:type="spellEnd"/>
-      <w:r>
-        <w:rPr>
-          <w:rFonts w:ascii="Times New Roman CYR" w:hAnsi="Times New Roman CYR" w:cs="Times New Roman CYR"/>
-          <w:b/>
-          <w:bCs/>
-          <w:color w:val="000000"/>
-          <w:sz w:val="24"/>
-          <w:szCs w:val="24"/>
-          <w:lang w:val="en-GB"/>
-        </w:rPr>
-        <w:t xml:space="preserve"> M.</w:t>
+        <w:t>Kovbasiuk S., Ukrainets M.</w:t>
       </w:r>
     </w:p>
     <w:p>
@@ -608,25 +568,7 @@
           <w:szCs w:val="24"/>
           <w:lang w:val="uk-UA" w:eastAsia="en-US"/>
         </w:rPr>
-        <w:t xml:space="preserve"> (БПС) у складі безпілотних авіаційних комплексів (</w:t>
-      </w:r>
-      <w:proofErr w:type="spellStart"/>
-      <w:r>
-        <w:rPr>
-          <w:rFonts w:ascii="Times New Roman CYR" w:hAnsi="Times New Roman CYR" w:cs="Times New Roman CYR"/>
-          <w:szCs w:val="24"/>
-          <w:lang w:val="uk-UA" w:eastAsia="en-US"/>
-        </w:rPr>
-        <w:t>БпАК</w:t>
-      </w:r>
-      <w:proofErr w:type="spellEnd"/>
-      <w:r>
-        <w:rPr>
-          <w:rFonts w:ascii="Times New Roman CYR" w:hAnsi="Times New Roman CYR" w:cs="Times New Roman CYR"/>
-          <w:szCs w:val="24"/>
-          <w:lang w:val="uk-UA" w:eastAsia="en-US"/>
-        </w:rPr>
-        <w:t>)</w:t>
+        <w:t xml:space="preserve"> (БПС) у складі безпілотних авіаційних комплексів (БпАК)</w:t>
       </w:r>
       <w:r>
         <w:rPr>
@@ -840,25 +782,7 @@
           <w:szCs w:val="24"/>
           <w:lang w:val="uk-UA" w:eastAsia="en-US"/>
         </w:rPr>
-        <w:t xml:space="preserve"> вирішує два </w:t>
-      </w:r>
-      <w:proofErr w:type="spellStart"/>
-      <w:r>
-        <w:rPr>
-          <w:rFonts w:ascii="Times New Roman CYR" w:hAnsi="Times New Roman CYR" w:cs="Times New Roman CYR"/>
-          <w:szCs w:val="24"/>
-          <w:lang w:val="uk-UA" w:eastAsia="en-US"/>
-        </w:rPr>
-        <w:t>підзавдання</w:t>
-      </w:r>
-      <w:proofErr w:type="spellEnd"/>
-      <w:r>
-        <w:rPr>
-          <w:rFonts w:ascii="Times New Roman CYR" w:hAnsi="Times New Roman CYR" w:cs="Times New Roman CYR"/>
-          <w:szCs w:val="24"/>
-          <w:lang w:val="uk-UA" w:eastAsia="en-US"/>
-        </w:rPr>
-        <w:t xml:space="preserve">: </w:t>
+        <w:t xml:space="preserve"> вирішує два підзавдання: </w:t>
       </w:r>
       <w:r>
         <w:rPr>
@@ -898,25 +822,7 @@
           <w:szCs w:val="24"/>
           <w:lang w:val="uk-UA" w:eastAsia="en-US"/>
         </w:rPr>
-        <w:t xml:space="preserve">Одним з найбільш поширених підходів до планування маршруту руху БПС в складі </w:t>
-      </w:r>
-      <w:proofErr w:type="spellStart"/>
-      <w:r>
-        <w:rPr>
-          <w:rFonts w:ascii="Times New Roman CYR" w:hAnsi="Times New Roman CYR" w:cs="Times New Roman CYR"/>
-          <w:szCs w:val="24"/>
-          <w:lang w:val="uk-UA" w:eastAsia="en-US"/>
-        </w:rPr>
-        <w:t>БпАК</w:t>
-      </w:r>
-      <w:proofErr w:type="spellEnd"/>
-      <w:r>
-        <w:rPr>
-          <w:rFonts w:ascii="Times New Roman CYR" w:hAnsi="Times New Roman CYR" w:cs="Times New Roman CYR"/>
-          <w:szCs w:val="24"/>
-          <w:lang w:val="uk-UA" w:eastAsia="en-US"/>
-        </w:rPr>
-        <w:t xml:space="preserve"> є ручна побудова маршруту</w:t>
+        <w:t>Одним з найбільш поширених підходів до планування маршруту руху БПС в складі БпАК є ручна побудова маршруту</w:t>
       </w:r>
       <w:r>
         <w:rPr>
@@ -1158,25 +1064,7 @@
           <w:szCs w:val="24"/>
           <w:lang w:val="uk-UA" w:eastAsia="en-US"/>
         </w:rPr>
-        <w:t xml:space="preserve">пошуку оптимального маршруту БПС в складі </w:t>
-      </w:r>
-      <w:proofErr w:type="spellStart"/>
-      <w:r>
-        <w:rPr>
-          <w:rFonts w:ascii="Times New Roman CYR" w:hAnsi="Times New Roman CYR" w:cs="Times New Roman CYR"/>
-          <w:szCs w:val="24"/>
-          <w:lang w:val="uk-UA" w:eastAsia="en-US"/>
-        </w:rPr>
-        <w:t>БпАК</w:t>
-      </w:r>
-      <w:proofErr w:type="spellEnd"/>
-      <w:r>
-        <w:rPr>
-          <w:rFonts w:ascii="Times New Roman CYR" w:hAnsi="Times New Roman CYR" w:cs="Times New Roman CYR"/>
-          <w:szCs w:val="24"/>
-          <w:lang w:val="uk-UA" w:eastAsia="en-US"/>
-        </w:rPr>
-        <w:t xml:space="preserve"> на основі різнорідних даних</w:t>
+        <w:t>пошуку оптимального маршруту БПС в складі БпАК на основі різнорідних даних</w:t>
       </w:r>
       <w:r>
         <w:rPr>
@@ -1238,25 +1126,7 @@
           <w:szCs w:val="24"/>
           <w:lang w:val="uk-UA" w:eastAsia="en-US"/>
         </w:rPr>
-        <w:t xml:space="preserve"> Виконання завдання покладеного на БПС в складі </w:t>
-      </w:r>
-      <w:proofErr w:type="spellStart"/>
-      <w:r>
-        <w:rPr>
-          <w:rFonts w:ascii="Times New Roman CYR" w:hAnsi="Times New Roman CYR" w:cs="Times New Roman CYR"/>
-          <w:szCs w:val="24"/>
-          <w:lang w:val="uk-UA" w:eastAsia="en-US"/>
-        </w:rPr>
-        <w:t>БпАК</w:t>
-      </w:r>
-      <w:proofErr w:type="spellEnd"/>
-      <w:r>
-        <w:rPr>
-          <w:rFonts w:ascii="Times New Roman CYR" w:hAnsi="Times New Roman CYR" w:cs="Times New Roman CYR"/>
-          <w:szCs w:val="24"/>
-          <w:lang w:val="uk-UA" w:eastAsia="en-US"/>
-        </w:rPr>
-        <w:t xml:space="preserve"> </w:t>
+        <w:t xml:space="preserve"> Виконання завдання покладеного на БПС в складі БпАК </w:t>
       </w:r>
       <w:r>
         <w:rPr>
@@ -1328,25 +1198,7 @@
           <w:szCs w:val="24"/>
           <w:lang w:val="uk-UA" w:eastAsia="en-US"/>
         </w:rPr>
-        <w:t xml:space="preserve">застосовується гібридний підхід, який поєднує візуальну навігацію на основі </w:t>
-      </w:r>
-      <w:proofErr w:type="spellStart"/>
-      <w:r>
-        <w:rPr>
-          <w:rFonts w:ascii="Times New Roman CYR" w:hAnsi="Times New Roman CYR" w:cs="Times New Roman CYR"/>
-          <w:szCs w:val="24"/>
-          <w:lang w:val="uk-UA" w:eastAsia="en-US"/>
-        </w:rPr>
-        <w:t>геоприв’язаних</w:t>
-      </w:r>
-      <w:proofErr w:type="spellEnd"/>
-      <w:r>
-        <w:rPr>
-          <w:rFonts w:ascii="Times New Roman CYR" w:hAnsi="Times New Roman CYR" w:cs="Times New Roman CYR"/>
-          <w:szCs w:val="24"/>
-          <w:lang w:val="uk-UA" w:eastAsia="en-US"/>
-        </w:rPr>
-        <w:t xml:space="preserve"> супутникових знімків та </w:t>
+        <w:t xml:space="preserve">застосовується гібридний підхід, який поєднує візуальну навігацію на основі геоприв’язаних супутникових знімків та </w:t>
       </w:r>
       <w:r>
         <w:rPr>
@@ -1609,25 +1461,7 @@
           <w:szCs w:val="24"/>
           <w:lang w:val="uk-UA" w:eastAsia="en-US"/>
         </w:rPr>
-        <w:t xml:space="preserve">: </w:t>
-      </w:r>
-      <w:proofErr w:type="spellStart"/>
-      <w:r>
-        <w:rPr>
-          <w:rFonts w:ascii="Times New Roman CYR" w:hAnsi="Times New Roman CYR" w:cs="Times New Roman CYR"/>
-          <w:szCs w:val="24"/>
-          <w:lang w:val="uk-UA" w:eastAsia="en-US"/>
-        </w:rPr>
-        <w:t>геоприв’язаний</w:t>
-      </w:r>
-      <w:proofErr w:type="spellEnd"/>
-      <w:r>
-        <w:rPr>
-          <w:rFonts w:ascii="Times New Roman CYR" w:hAnsi="Times New Roman CYR" w:cs="Times New Roman CYR"/>
-          <w:szCs w:val="24"/>
-          <w:lang w:val="uk-UA" w:eastAsia="en-US"/>
-        </w:rPr>
-        <w:t xml:space="preserve"> супутниковий знімок, карта висот, карта вітру, </w:t>
+        <w:t xml:space="preserve">: геоприв’язаний супутниковий знімок, карта висот, карта вітру, </w:t>
       </w:r>
       <w:r>
         <w:rPr>
@@ -2111,25 +1945,7 @@
           <w:szCs w:val="24"/>
           <w:lang w:val="uk-UA" w:eastAsia="en-US"/>
         </w:rPr>
-        <w:t xml:space="preserve">Множина </w:t>
-      </w:r>
-      <w:proofErr w:type="spellStart"/>
-      <w:r>
-        <w:rPr>
-          <w:rFonts w:eastAsiaTheme="minorEastAsia" w:cs="Times New Roman"/>
-          <w:szCs w:val="24"/>
-          <w:lang w:val="uk-UA" w:eastAsia="en-US"/>
-        </w:rPr>
-        <w:t>ребер</w:t>
-      </w:r>
-      <w:proofErr w:type="spellEnd"/>
-      <w:r>
-        <w:rPr>
-          <w:rFonts w:eastAsiaTheme="minorEastAsia" w:cs="Times New Roman"/>
-          <w:szCs w:val="24"/>
-          <w:lang w:val="uk-UA" w:eastAsia="en-US"/>
-        </w:rPr>
-        <w:t xml:space="preserve"> маршруту:</w:t>
+        <w:t>Множина ребер маршруту:</w:t>
       </w:r>
     </w:p>
     <w:p>
@@ -2323,27 +2139,7 @@
           <w:szCs w:val="24"/>
           <w:lang w:val="uk-UA" w:eastAsia="en-US"/>
         </w:rPr>
-        <w:t xml:space="preserve">у важливість тривалості польоту, </w:t>
-      </w:r>
-      <w:proofErr w:type="spellStart"/>
-      <w:r>
-        <w:rPr>
-          <w:rFonts w:eastAsiaTheme="minorEastAsia" w:cs="Times New Roman"/>
-          <w:color w:val="000000"/>
-          <w:szCs w:val="24"/>
-          <w:lang w:val="uk-UA" w:eastAsia="en-US"/>
-        </w:rPr>
-        <w:t>запишемо</w:t>
-      </w:r>
-      <w:proofErr w:type="spellEnd"/>
-      <w:r>
-        <w:rPr>
-          <w:rFonts w:eastAsiaTheme="minorEastAsia" w:cs="Times New Roman"/>
-          <w:color w:val="000000"/>
-          <w:szCs w:val="24"/>
-          <w:lang w:val="uk-UA" w:eastAsia="en-US"/>
-        </w:rPr>
-        <w:t xml:space="preserve"> функцію для часу польоту:</w:t>
+        <w:t>у важливість тривалості польоту, запишемо функцію для часу польоту:</w:t>
       </w:r>
     </w:p>
     <w:p>
@@ -4199,7 +3995,27 @@
           <w:szCs w:val="24"/>
           <w:lang w:val="uk-UA" w:eastAsia="en-US"/>
         </w:rPr>
-        <w:t>Так як підхід до визначення місцезнаходження БПС покладається на візуальні дані отримані з бортової камери, то слід обирати такі ребра, де погіршення видимості буде мінімальним</w:t>
+        <w:t xml:space="preserve">Так як підхід до визначення місцезнаходження БПС покладається на візуальні дані отримані з бортової камери, то слід обирати такі ребра, де погіршення видимості </w:t>
+      </w:r>
+      <w:r>
+        <w:rPr>
+          <w:rFonts w:eastAsiaTheme="minorEastAsia" w:cs="Times New Roman"/>
+          <w:color w:val="000000"/>
+          <w:szCs w:val="24"/>
+          <w:lang w:val="uk-UA" w:eastAsia="en-US"/>
+        </w:rPr>
+        <w:t>є</w:t>
+      </w:r>
+      <w:bookmarkStart w:id="0" w:name="_GoBack"/>
+      <w:bookmarkEnd w:id="0"/>
+      <w:r>
+        <w:rPr>
+          <w:rFonts w:eastAsiaTheme="minorEastAsia" w:cs="Times New Roman"/>
+          <w:color w:val="000000"/>
+          <w:szCs w:val="24"/>
+          <w:lang w:val="uk-UA" w:eastAsia="en-US"/>
+        </w:rPr>
+        <w:t xml:space="preserve"> мінімальним</w:t>
       </w:r>
       <w:r>
         <w:rPr>
@@ -4210,25 +4026,14 @@
         </w:rPr>
         <w:t xml:space="preserve">, </w:t>
       </w:r>
-      <w:proofErr w:type="spellStart"/>
-      <w:r>
-        <w:rPr>
-          <w:rFonts w:eastAsiaTheme="minorEastAsia" w:cs="Times New Roman"/>
-          <w:color w:val="000000"/>
-          <w:szCs w:val="24"/>
-          <w:lang w:val="uk-UA" w:eastAsia="en-US"/>
-        </w:rPr>
-        <w:t>запишемо</w:t>
-      </w:r>
-      <w:proofErr w:type="spellEnd"/>
-      <w:r>
-        <w:rPr>
-          <w:rFonts w:eastAsiaTheme="minorEastAsia" w:cs="Times New Roman"/>
-          <w:color w:val="000000"/>
-          <w:szCs w:val="24"/>
-          <w:lang w:val="uk-UA" w:eastAsia="en-US"/>
-        </w:rPr>
-        <w:t xml:space="preserve"> функцію для видимості</w:t>
+      <w:r>
+        <w:rPr>
+          <w:rFonts w:eastAsiaTheme="minorEastAsia" w:cs="Times New Roman"/>
+          <w:color w:val="000000"/>
+          <w:szCs w:val="24"/>
+          <w:lang w:val="uk-UA" w:eastAsia="en-US"/>
+        </w:rPr>
+        <w:t>запишемо функцію для видимості</w:t>
       </w:r>
       <w:r>
         <w:rPr>
@@ -7766,27 +7571,7 @@
           <w:szCs w:val="24"/>
           <w:lang w:val="uk-UA" w:eastAsia="en-US"/>
         </w:rPr>
-        <w:t xml:space="preserve">Рішенням задачі має бути множина </w:t>
-      </w:r>
-      <w:proofErr w:type="spellStart"/>
-      <w:r>
-        <w:rPr>
-          <w:rFonts w:eastAsiaTheme="minorEastAsia" w:cs="Times New Roman"/>
-          <w:color w:val="000000"/>
-          <w:szCs w:val="24"/>
-          <w:lang w:val="uk-UA" w:eastAsia="en-US"/>
-        </w:rPr>
-        <w:t>Парето</w:t>
-      </w:r>
-      <w:proofErr w:type="spellEnd"/>
-      <w:r>
-        <w:rPr>
-          <w:rFonts w:eastAsiaTheme="minorEastAsia" w:cs="Times New Roman"/>
-          <w:color w:val="000000"/>
-          <w:szCs w:val="24"/>
-          <w:lang w:val="uk-UA" w:eastAsia="en-US"/>
-        </w:rPr>
-        <w:t>-оптимальних маршрутів</w:t>
+        <w:t>Рішенням задачі має бути множина Парето-оптимальних маршрутів</w:t>
       </w:r>
       <w:r>
         <w:rPr>
@@ -8057,27 +7842,7 @@
           <w:szCs w:val="24"/>
           <w:lang w:val="uk-UA" w:eastAsia="en-US"/>
         </w:rPr>
-        <w:t xml:space="preserve">повинен забезпечувати множину </w:t>
-      </w:r>
-      <w:proofErr w:type="spellStart"/>
-      <w:r>
-        <w:rPr>
-          <w:rFonts w:eastAsiaTheme="minorEastAsia" w:cs="Times New Roman"/>
-          <w:color w:val="000000"/>
-          <w:szCs w:val="24"/>
-          <w:lang w:val="uk-UA" w:eastAsia="en-US"/>
-        </w:rPr>
-        <w:t>Парето</w:t>
-      </w:r>
-      <w:proofErr w:type="spellEnd"/>
-      <w:r>
-        <w:rPr>
-          <w:rFonts w:eastAsiaTheme="minorEastAsia" w:cs="Times New Roman"/>
-          <w:color w:val="000000"/>
-          <w:szCs w:val="24"/>
-          <w:lang w:val="uk-UA" w:eastAsia="en-US"/>
-        </w:rPr>
-        <w:t xml:space="preserve">-оптимальних </w:t>
+        <w:t xml:space="preserve">повинен забезпечувати множину Парето-оптимальних </w:t>
       </w:r>
       <w:r>
         <w:rPr>
@@ -8248,29 +8013,7 @@
           <w:highlight w:val="yellow"/>
           <w:lang w:val="uk-UA" w:eastAsia="en-US"/>
         </w:rPr>
-        <w:t xml:space="preserve">множини </w:t>
-      </w:r>
-      <w:proofErr w:type="spellStart"/>
-      <w:r>
-        <w:rPr>
-          <w:rFonts w:eastAsiaTheme="minorEastAsia" w:cs="Times New Roman"/>
-          <w:color w:val="000000"/>
-          <w:szCs w:val="24"/>
-          <w:highlight w:val="yellow"/>
-          <w:lang w:val="uk-UA" w:eastAsia="en-US"/>
-        </w:rPr>
-        <w:t>Парето</w:t>
-      </w:r>
-      <w:proofErr w:type="spellEnd"/>
-      <w:r>
-        <w:rPr>
-          <w:rFonts w:eastAsiaTheme="minorEastAsia" w:cs="Times New Roman"/>
-          <w:color w:val="000000"/>
-          <w:szCs w:val="24"/>
-          <w:highlight w:val="yellow"/>
-          <w:lang w:val="uk-UA" w:eastAsia="en-US"/>
-        </w:rPr>
-        <w:t>-оптимальних рішень</w:t>
+        <w:t>множини Парето-оптимальних рішень</w:t>
       </w:r>
       <w:r>
         <w:rPr>
@@ -8333,29 +8076,8 @@
           <w:szCs w:val="24"/>
           <w:lang w:val="uk-UA" w:eastAsia="en-US"/>
         </w:rPr>
-        <w:t xml:space="preserve">ена в </w:t>
-      </w:r>
-      <w:proofErr w:type="spellStart"/>
-      <w:r>
-        <w:rPr>
-          <w:rFonts w:eastAsiaTheme="minorEastAsia" w:cs="Times New Roman"/>
-          <w:color w:val="000000"/>
-          <w:szCs w:val="24"/>
-          <w:lang w:val="uk-UA" w:eastAsia="en-US"/>
-        </w:rPr>
-        <w:t>дискретизованому</w:t>
-      </w:r>
-      <w:proofErr w:type="spellEnd"/>
-      <w:r>
-        <w:rPr>
-          <w:rFonts w:eastAsiaTheme="minorEastAsia" w:cs="Times New Roman"/>
-          <w:color w:val="000000"/>
-          <w:szCs w:val="24"/>
-          <w:lang w:val="uk-UA" w:eastAsia="en-US"/>
-        </w:rPr>
-        <w:t xml:space="preserve"> просторі, для її рішення недоцільно застосовувати </w:t>
-      </w:r>
-      <w:proofErr w:type="spellStart"/>
+        <w:t xml:space="preserve">ена в дискретизованому просторі, для її рішення недоцільно застосовувати </w:t>
+      </w:r>
       <w:r>
         <w:rPr>
           <w:rFonts w:eastAsiaTheme="minorEastAsia" w:cs="Times New Roman"/>
@@ -8363,9 +8085,17 @@
           <w:szCs w:val="24"/>
           <w:lang w:val="en-US" w:eastAsia="en-US"/>
         </w:rPr>
-        <w:t>методи</w:t>
-      </w:r>
-      <w:proofErr w:type="spellEnd"/>
+        <w:t>методи, засновані на вибірці (sampling based)</w:t>
+      </w:r>
+      <w:r>
+        <w:rPr>
+          <w:rFonts w:eastAsiaTheme="minorEastAsia" w:cs="Times New Roman"/>
+          <w:color w:val="000000"/>
+          <w:szCs w:val="24"/>
+          <w:lang w:val="uk-UA" w:eastAsia="en-US"/>
+        </w:rPr>
+        <w:t xml:space="preserve"> </w:t>
+      </w:r>
       <w:r>
         <w:rPr>
           <w:rFonts w:eastAsiaTheme="minorEastAsia" w:cs="Times New Roman"/>
@@ -8373,9 +8103,17 @@
           <w:szCs w:val="24"/>
           <w:lang w:val="en-US" w:eastAsia="en-US"/>
         </w:rPr>
-        <w:t xml:space="preserve">, </w:t>
-      </w:r>
-      <w:proofErr w:type="spellStart"/>
+        <w:t>[</w:t>
+      </w:r>
+      <w:r>
+        <w:rPr>
+          <w:rFonts w:eastAsiaTheme="minorEastAsia" w:cs="Times New Roman"/>
+          <w:color w:val="000000"/>
+          <w:szCs w:val="24"/>
+          <w:lang w:val="uk-UA" w:eastAsia="en-US"/>
+        </w:rPr>
+        <w:t xml:space="preserve">посилання на тези про </w:t>
+      </w:r>
       <w:r>
         <w:rPr>
           <w:rFonts w:eastAsiaTheme="minorEastAsia" w:cs="Times New Roman"/>
@@ -8383,9 +8121,8 @@
           <w:szCs w:val="24"/>
           <w:lang w:val="en-US" w:eastAsia="en-US"/>
         </w:rPr>
-        <w:t>засновані</w:t>
-      </w:r>
-      <w:proofErr w:type="spellEnd"/>
+        <w:t>RRT*]</w:t>
+      </w:r>
       <w:r>
         <w:rPr>
           <w:rFonts w:eastAsiaTheme="minorEastAsia" w:cs="Times New Roman"/>
@@ -8393,230 +8130,124 @@
           <w:szCs w:val="24"/>
           <w:lang w:val="en-US" w:eastAsia="en-US"/>
         </w:rPr>
+        <w:t xml:space="preserve">. </w:t>
+      </w:r>
+      <w:r>
+        <w:rPr>
+          <w:rFonts w:eastAsiaTheme="minorEastAsia" w:cs="Times New Roman"/>
+          <w:color w:val="000000"/>
+          <w:szCs w:val="24"/>
+          <w:lang w:val="uk-UA" w:eastAsia="en-US"/>
+        </w:rPr>
+        <w:t xml:space="preserve">Дані методи припускають, що простір є безперервним </w:t>
+      </w:r>
+      <w:r>
+        <w:rPr>
+          <w:rFonts w:eastAsiaTheme="minorEastAsia" w:cs="Times New Roman"/>
+          <w:color w:val="000000"/>
+          <w:szCs w:val="24"/>
+          <w:lang w:val="uk-UA" w:eastAsia="en-US"/>
+        </w:rPr>
+        <w:t xml:space="preserve">та виконують пошук наближеного до оптимального рішення. </w:t>
+      </w:r>
+      <w:r>
+        <w:rPr>
+          <w:rFonts w:eastAsiaTheme="minorEastAsia" w:cs="Times New Roman"/>
+          <w:color w:val="000000"/>
+          <w:szCs w:val="24"/>
+          <w:lang w:val="uk-UA" w:eastAsia="en-US"/>
+        </w:rPr>
+        <w:t xml:space="preserve">Крім того, через свою стохастичну природу, кожен пошук даватиме </w:t>
+      </w:r>
+      <w:r>
+        <w:rPr>
+          <w:rFonts w:eastAsiaTheme="minorEastAsia" w:cs="Times New Roman"/>
+          <w:color w:val="000000"/>
+          <w:szCs w:val="24"/>
+          <w:lang w:val="uk-UA" w:eastAsia="en-US"/>
+        </w:rPr>
+        <w:t xml:space="preserve">інше рішення. </w:t>
+      </w:r>
+      <w:r>
+        <w:rPr>
+          <w:rFonts w:eastAsiaTheme="minorEastAsia" w:cs="Times New Roman"/>
+          <w:color w:val="000000"/>
+          <w:szCs w:val="24"/>
+          <w:lang w:val="uk-UA" w:eastAsia="en-US"/>
+        </w:rPr>
+        <w:t xml:space="preserve">Також такі методи непридатні для </w:t>
+      </w:r>
+      <w:r>
+        <w:rPr>
+          <w:rFonts w:eastAsiaTheme="minorEastAsia" w:cs="Times New Roman"/>
+          <w:color w:val="000000"/>
+          <w:szCs w:val="24"/>
+          <w:lang w:val="uk-UA" w:eastAsia="en-US"/>
+        </w:rPr>
+        <w:t>багатоцільової оптимізації.</w:t>
+      </w:r>
+      <w:r>
+        <w:rPr>
+          <w:rFonts w:eastAsiaTheme="minorEastAsia" w:cs="Times New Roman"/>
+          <w:color w:val="000000"/>
+          <w:szCs w:val="24"/>
+          <w:lang w:val="uk-UA" w:eastAsia="en-US"/>
+        </w:rPr>
+        <w:t xml:space="preserve"> Для </w:t>
+      </w:r>
+      <w:r>
+        <w:rPr>
+          <w:rFonts w:eastAsiaTheme="minorEastAsia" w:cs="Times New Roman"/>
+          <w:color w:val="000000"/>
+          <w:szCs w:val="24"/>
+          <w:lang w:val="uk-UA" w:eastAsia="en-US"/>
+        </w:rPr>
+        <w:t>вирішення задачі</w:t>
+      </w:r>
+      <w:r>
+        <w:rPr>
+          <w:rFonts w:eastAsiaTheme="minorEastAsia" w:cs="Times New Roman"/>
+          <w:color w:val="000000"/>
+          <w:szCs w:val="24"/>
+          <w:lang w:val="uk-UA" w:eastAsia="en-US"/>
+        </w:rPr>
+        <w:t xml:space="preserve"> доцільно застосувати алгоритм на основі </w:t>
+      </w:r>
+      <w:r>
+        <w:rPr>
+          <w:rFonts w:eastAsiaTheme="minorEastAsia" w:cs="Times New Roman"/>
+          <w:color w:val="000000"/>
+          <w:szCs w:val="24"/>
+          <w:lang w:val="en-US" w:eastAsia="en-US"/>
+        </w:rPr>
+        <w:t>Multi Objective A* (MOA*)</w:t>
+      </w:r>
+      <w:r>
+        <w:rPr>
+          <w:rFonts w:eastAsiaTheme="minorEastAsia" w:cs="Times New Roman"/>
+          <w:color w:val="000000"/>
+          <w:szCs w:val="24"/>
+          <w:lang w:val="en-US" w:eastAsia="en-US"/>
+        </w:rPr>
+        <w:t>.</w:t>
+      </w:r>
+      <w:r>
+        <w:rPr>
+          <w:rFonts w:eastAsiaTheme="minorEastAsia" w:cs="Times New Roman"/>
+          <w:color w:val="000000"/>
+          <w:szCs w:val="24"/>
+          <w:lang w:val="uk-UA" w:eastAsia="en-US"/>
+        </w:rPr>
         <w:t xml:space="preserve"> </w:t>
       </w:r>
-      <w:proofErr w:type="spellStart"/>
-      <w:r>
-        <w:rPr>
-          <w:rFonts w:eastAsiaTheme="minorEastAsia" w:cs="Times New Roman"/>
-          <w:color w:val="000000"/>
-          <w:szCs w:val="24"/>
-          <w:lang w:val="en-US" w:eastAsia="en-US"/>
-        </w:rPr>
-        <w:t>на</w:t>
-      </w:r>
-      <w:proofErr w:type="spellEnd"/>
-      <w:r>
-        <w:rPr>
-          <w:rFonts w:eastAsiaTheme="minorEastAsia" w:cs="Times New Roman"/>
-          <w:color w:val="000000"/>
-          <w:szCs w:val="24"/>
-          <w:lang w:val="en-US" w:eastAsia="en-US"/>
-        </w:rPr>
-        <w:t xml:space="preserve"> </w:t>
-      </w:r>
-      <w:proofErr w:type="spellStart"/>
-      <w:r>
-        <w:rPr>
-          <w:rFonts w:eastAsiaTheme="minorEastAsia" w:cs="Times New Roman"/>
-          <w:color w:val="000000"/>
-          <w:szCs w:val="24"/>
-          <w:lang w:val="en-US" w:eastAsia="en-US"/>
-        </w:rPr>
-        <w:t>вибірці</w:t>
-      </w:r>
-      <w:proofErr w:type="spellEnd"/>
-      <w:r>
-        <w:rPr>
-          <w:rFonts w:eastAsiaTheme="minorEastAsia" w:cs="Times New Roman"/>
-          <w:color w:val="000000"/>
-          <w:szCs w:val="24"/>
-          <w:lang w:val="en-US" w:eastAsia="en-US"/>
-        </w:rPr>
-        <w:t xml:space="preserve"> (sampling based)</w:t>
-      </w:r>
-      <w:r>
-        <w:rPr>
-          <w:rFonts w:eastAsiaTheme="minorEastAsia" w:cs="Times New Roman"/>
-          <w:color w:val="000000"/>
-          <w:szCs w:val="24"/>
-          <w:lang w:val="uk-UA" w:eastAsia="en-US"/>
-        </w:rPr>
-        <w:t xml:space="preserve"> </w:t>
-      </w:r>
-      <w:r>
-        <w:rPr>
-          <w:rFonts w:eastAsiaTheme="minorEastAsia" w:cs="Times New Roman"/>
-          <w:color w:val="000000"/>
-          <w:szCs w:val="24"/>
-          <w:lang w:val="en-US" w:eastAsia="en-US"/>
-        </w:rPr>
-        <w:t>[</w:t>
-      </w:r>
-      <w:r>
-        <w:rPr>
-          <w:rFonts w:eastAsiaTheme="minorEastAsia" w:cs="Times New Roman"/>
-          <w:color w:val="000000"/>
-          <w:szCs w:val="24"/>
-          <w:lang w:val="uk-UA" w:eastAsia="en-US"/>
-        </w:rPr>
-        <w:t xml:space="preserve">посилання на тези про </w:t>
-      </w:r>
-      <w:r>
-        <w:rPr>
-          <w:rFonts w:eastAsiaTheme="minorEastAsia" w:cs="Times New Roman"/>
-          <w:color w:val="000000"/>
-          <w:szCs w:val="24"/>
-          <w:lang w:val="en-US" w:eastAsia="en-US"/>
-        </w:rPr>
-        <w:t>RRT*]</w:t>
-      </w:r>
-      <w:r>
-        <w:rPr>
-          <w:rFonts w:eastAsiaTheme="minorEastAsia" w:cs="Times New Roman"/>
-          <w:color w:val="000000"/>
-          <w:szCs w:val="24"/>
-          <w:lang w:val="en-US" w:eastAsia="en-US"/>
-        </w:rPr>
-        <w:t xml:space="preserve">. </w:t>
-      </w:r>
-      <w:r>
-        <w:rPr>
-          <w:rFonts w:eastAsiaTheme="minorEastAsia" w:cs="Times New Roman"/>
-          <w:color w:val="000000"/>
-          <w:szCs w:val="24"/>
-          <w:lang w:val="uk-UA" w:eastAsia="en-US"/>
-        </w:rPr>
-        <w:t xml:space="preserve">Дані методи припускають, що простір є безперервним </w:t>
-      </w:r>
-      <w:r>
-        <w:rPr>
-          <w:rFonts w:eastAsiaTheme="minorEastAsia" w:cs="Times New Roman"/>
-          <w:color w:val="000000"/>
-          <w:szCs w:val="24"/>
-          <w:lang w:val="uk-UA" w:eastAsia="en-US"/>
-        </w:rPr>
-        <w:t xml:space="preserve">та виконують пошук наближеного до оптимального рішення. </w:t>
-      </w:r>
-      <w:r>
-        <w:rPr>
-          <w:rFonts w:eastAsiaTheme="minorEastAsia" w:cs="Times New Roman"/>
-          <w:color w:val="000000"/>
-          <w:szCs w:val="24"/>
-          <w:lang w:val="uk-UA" w:eastAsia="en-US"/>
-        </w:rPr>
-        <w:t xml:space="preserve">Крім того, через свою стохастичну природу, кожен пошук даватиме </w:t>
-      </w:r>
-      <w:r>
-        <w:rPr>
-          <w:rFonts w:eastAsiaTheme="minorEastAsia" w:cs="Times New Roman"/>
-          <w:color w:val="000000"/>
-          <w:szCs w:val="24"/>
-          <w:lang w:val="uk-UA" w:eastAsia="en-US"/>
-        </w:rPr>
-        <w:t xml:space="preserve">інше рішення. </w:t>
-      </w:r>
-      <w:r>
-        <w:rPr>
-          <w:rFonts w:eastAsiaTheme="minorEastAsia" w:cs="Times New Roman"/>
-          <w:color w:val="000000"/>
-          <w:szCs w:val="24"/>
-          <w:lang w:val="uk-UA" w:eastAsia="en-US"/>
-        </w:rPr>
-        <w:t xml:space="preserve">Також такі методи непридатні для </w:t>
-      </w:r>
-      <w:r>
-        <w:rPr>
-          <w:rFonts w:eastAsiaTheme="minorEastAsia" w:cs="Times New Roman"/>
-          <w:color w:val="000000"/>
-          <w:szCs w:val="24"/>
-          <w:lang w:val="uk-UA" w:eastAsia="en-US"/>
-        </w:rPr>
-        <w:t>багатоцільової оптимізації.</w:t>
-      </w:r>
-      <w:r>
-        <w:rPr>
-          <w:rFonts w:eastAsiaTheme="minorEastAsia" w:cs="Times New Roman"/>
-          <w:color w:val="000000"/>
-          <w:szCs w:val="24"/>
-          <w:lang w:val="uk-UA" w:eastAsia="en-US"/>
-        </w:rPr>
-        <w:t xml:space="preserve"> Для </w:t>
-      </w:r>
-      <w:r>
-        <w:rPr>
-          <w:rFonts w:eastAsiaTheme="minorEastAsia" w:cs="Times New Roman"/>
-          <w:color w:val="000000"/>
-          <w:szCs w:val="24"/>
-          <w:lang w:val="uk-UA" w:eastAsia="en-US"/>
-        </w:rPr>
-        <w:t>вирішення задачі</w:t>
-      </w:r>
-      <w:r>
-        <w:rPr>
-          <w:rFonts w:eastAsiaTheme="minorEastAsia" w:cs="Times New Roman"/>
-          <w:color w:val="000000"/>
-          <w:szCs w:val="24"/>
-          <w:lang w:val="uk-UA" w:eastAsia="en-US"/>
-        </w:rPr>
-        <w:t xml:space="preserve"> доцільно застосувати алгоритм на основі </w:t>
-      </w:r>
-      <w:r>
-        <w:rPr>
-          <w:rFonts w:eastAsiaTheme="minorEastAsia" w:cs="Times New Roman"/>
-          <w:color w:val="000000"/>
-          <w:szCs w:val="24"/>
-          <w:lang w:val="en-US" w:eastAsia="en-US"/>
-        </w:rPr>
-        <w:t>Multi Objective A* (MOA*)</w:t>
-      </w:r>
-      <w:r>
-        <w:rPr>
-          <w:rFonts w:eastAsiaTheme="minorEastAsia" w:cs="Times New Roman"/>
-          <w:color w:val="000000"/>
-          <w:szCs w:val="24"/>
-          <w:lang w:val="en-US" w:eastAsia="en-US"/>
-        </w:rPr>
-        <w:t>.</w:t>
-      </w:r>
-      <w:r>
-        <w:rPr>
-          <w:rFonts w:eastAsiaTheme="minorEastAsia" w:cs="Times New Roman"/>
-          <w:color w:val="000000"/>
-          <w:szCs w:val="24"/>
-          <w:lang w:val="uk-UA" w:eastAsia="en-US"/>
-        </w:rPr>
-        <w:t xml:space="preserve"> </w:t>
-      </w:r>
-      <w:bookmarkStart w:id="0" w:name="_GoBack"/>
-      <w:r>
-        <w:rPr>
-          <w:rFonts w:eastAsiaTheme="minorEastAsia" w:cs="Times New Roman"/>
-          <w:color w:val="000000"/>
-          <w:szCs w:val="24"/>
-          <w:lang w:val="uk-UA" w:eastAsia="en-US"/>
-        </w:rPr>
-        <w:t xml:space="preserve">Отримавши множину </w:t>
-      </w:r>
-      <w:proofErr w:type="spellStart"/>
-      <w:r>
-        <w:rPr>
-          <w:rFonts w:eastAsiaTheme="minorEastAsia" w:cs="Times New Roman"/>
-          <w:color w:val="000000"/>
-          <w:szCs w:val="24"/>
-          <w:lang w:val="uk-UA" w:eastAsia="en-US"/>
-        </w:rPr>
-        <w:t>Парето</w:t>
-      </w:r>
-      <w:proofErr w:type="spellEnd"/>
-      <w:r>
-        <w:rPr>
-          <w:rFonts w:eastAsiaTheme="minorEastAsia" w:cs="Times New Roman"/>
-          <w:color w:val="000000"/>
-          <w:szCs w:val="24"/>
-          <w:lang w:val="uk-UA" w:eastAsia="en-US"/>
-        </w:rPr>
-        <w:t>-оптимальних рішень відповідальна особа матиме можливість обрати один із множини маршрутів, виходячи з потреб і контексту виконання завдання</w:t>
+      <w:r>
+        <w:rPr>
+          <w:rFonts w:eastAsiaTheme="minorEastAsia" w:cs="Times New Roman"/>
+          <w:color w:val="000000"/>
+          <w:szCs w:val="24"/>
+          <w:lang w:val="uk-UA" w:eastAsia="en-US"/>
+        </w:rPr>
+        <w:t>Отримавши множину Парето-оптимальних рішень відповідальна особа матиме можливість обрати один із множини маршрутів, виходячи з потреб і контексту виконання завдання</w:t>
       </w:r>
       <w:r>
         <w:rPr>
@@ -8627,7 +8258,6 @@
         </w:rPr>
         <w:t>, зваживши можливі поступки по критеріям</w:t>
       </w:r>
-      <w:bookmarkEnd w:id="0"/>
       <w:r>
         <w:rPr>
           <w:rFonts w:eastAsiaTheme="minorEastAsia" w:cs="Times New Roman"/>

</xml_diff>

<commit_message>
described MOO approach in the article draft
</commit_message>
<xml_diff>
--- a/knowledgebase/papers/wip/попереднє_планування.docx
+++ b/knowledgebase/papers/wip/попереднє_планування.docx
@@ -382,6 +382,7 @@
           <w:lang w:val="en-GB"/>
         </w:rPr>
       </w:pPr>
+      <w:proofErr w:type="spellStart"/>
       <w:r>
         <w:rPr>
           <w:rFonts w:ascii="Times New Roman CYR" w:hAnsi="Times New Roman CYR" w:cs="Times New Roman CYR"/>
@@ -392,7 +393,46 @@
           <w:szCs w:val="24"/>
           <w:lang w:val="en-GB"/>
         </w:rPr>
-        <w:t>Kovbasiuk S., Ukrainets M.</w:t>
+        <w:t>Kovbasiuk</w:t>
+      </w:r>
+      <w:proofErr w:type="spellEnd"/>
+      <w:r>
+        <w:rPr>
+          <w:rFonts w:ascii="Times New Roman CYR" w:hAnsi="Times New Roman CYR" w:cs="Times New Roman CYR"/>
+          <w:b/>
+          <w:bCs/>
+          <w:color w:val="000000"/>
+          <w:sz w:val="24"/>
+          <w:szCs w:val="24"/>
+          <w:lang w:val="en-GB"/>
+        </w:rPr>
+        <w:t xml:space="preserve"> S., </w:t>
+      </w:r>
+      <w:proofErr w:type="spellStart"/>
+      <w:r>
+        <w:rPr>
+          <w:rFonts w:ascii="Times New Roman CYR" w:hAnsi="Times New Roman CYR" w:cs="Times New Roman CYR"/>
+          <w:b/>
+          <w:bCs/>
+          <w:color w:val="000000"/>
+          <w:sz w:val="24"/>
+          <w:szCs w:val="24"/>
+          <w:lang w:val="en-GB"/>
+        </w:rPr>
+        <w:t>Ukrainets</w:t>
+      </w:r>
+      <w:proofErr w:type="spellEnd"/>
+      <w:r>
+        <w:rPr>
+          <w:rFonts w:ascii="Times New Roman CYR" w:hAnsi="Times New Roman CYR" w:cs="Times New Roman CYR"/>
+          <w:b/>
+          <w:bCs/>
+          <w:color w:val="000000"/>
+          <w:sz w:val="24"/>
+          <w:szCs w:val="24"/>
+          <w:lang w:val="en-GB"/>
+        </w:rPr>
+        <w:t xml:space="preserve"> M.</w:t>
       </w:r>
     </w:p>
     <w:p>
@@ -568,7 +608,25 @@
           <w:szCs w:val="24"/>
           <w:lang w:val="uk-UA" w:eastAsia="en-US"/>
         </w:rPr>
-        <w:t xml:space="preserve"> (БПС) у складі безпілотних авіаційних комплексів (БпАК)</w:t>
+        <w:t xml:space="preserve"> (БПС) у складі безпілотних авіаційних комплексів (</w:t>
+      </w:r>
+      <w:proofErr w:type="spellStart"/>
+      <w:r>
+        <w:rPr>
+          <w:rFonts w:ascii="Times New Roman CYR" w:hAnsi="Times New Roman CYR" w:cs="Times New Roman CYR"/>
+          <w:szCs w:val="24"/>
+          <w:lang w:val="uk-UA" w:eastAsia="en-US"/>
+        </w:rPr>
+        <w:t>БпАК</w:t>
+      </w:r>
+      <w:proofErr w:type="spellEnd"/>
+      <w:r>
+        <w:rPr>
+          <w:rFonts w:ascii="Times New Roman CYR" w:hAnsi="Times New Roman CYR" w:cs="Times New Roman CYR"/>
+          <w:szCs w:val="24"/>
+          <w:lang w:val="uk-UA" w:eastAsia="en-US"/>
+        </w:rPr>
+        <w:t>)</w:t>
       </w:r>
       <w:r>
         <w:rPr>
@@ -786,7 +844,25 @@
           <w:szCs w:val="24"/>
           <w:lang w:val="uk-UA" w:eastAsia="en-US"/>
         </w:rPr>
-        <w:t xml:space="preserve"> вирішує два підзавдання: </w:t>
+        <w:t xml:space="preserve"> вирішує два </w:t>
+      </w:r>
+      <w:proofErr w:type="spellStart"/>
+      <w:r>
+        <w:rPr>
+          <w:rFonts w:ascii="Times New Roman CYR" w:hAnsi="Times New Roman CYR" w:cs="Times New Roman CYR"/>
+          <w:szCs w:val="24"/>
+          <w:lang w:val="uk-UA" w:eastAsia="en-US"/>
+        </w:rPr>
+        <w:t>підзавдання</w:t>
+      </w:r>
+      <w:proofErr w:type="spellEnd"/>
+      <w:r>
+        <w:rPr>
+          <w:rFonts w:ascii="Times New Roman CYR" w:hAnsi="Times New Roman CYR" w:cs="Times New Roman CYR"/>
+          <w:szCs w:val="24"/>
+          <w:lang w:val="uk-UA" w:eastAsia="en-US"/>
+        </w:rPr>
+        <w:t xml:space="preserve">: </w:t>
       </w:r>
       <w:r>
         <w:rPr>
@@ -826,7 +902,25 @@
           <w:szCs w:val="24"/>
           <w:lang w:val="uk-UA" w:eastAsia="en-US"/>
         </w:rPr>
-        <w:t>Одним з найбільш поширених підходів до планування маршруту руху БПС в складі БпАК є ручна побудова маршруту</w:t>
+        <w:t xml:space="preserve">Одним з найбільш поширених підходів до планування маршруту руху БПС в складі </w:t>
+      </w:r>
+      <w:proofErr w:type="spellStart"/>
+      <w:r>
+        <w:rPr>
+          <w:rFonts w:ascii="Times New Roman CYR" w:hAnsi="Times New Roman CYR" w:cs="Times New Roman CYR"/>
+          <w:szCs w:val="24"/>
+          <w:lang w:val="uk-UA" w:eastAsia="en-US"/>
+        </w:rPr>
+        <w:t>БпАК</w:t>
+      </w:r>
+      <w:proofErr w:type="spellEnd"/>
+      <w:r>
+        <w:rPr>
+          <w:rFonts w:ascii="Times New Roman CYR" w:hAnsi="Times New Roman CYR" w:cs="Times New Roman CYR"/>
+          <w:szCs w:val="24"/>
+          <w:lang w:val="uk-UA" w:eastAsia="en-US"/>
+        </w:rPr>
+        <w:t xml:space="preserve"> є ручна побудова маршруту</w:t>
       </w:r>
       <w:r>
         <w:rPr>
@@ -1131,6 +1225,14 @@
           <w:szCs w:val="24"/>
           <w:lang w:val="uk-UA" w:eastAsia="en-US"/>
         </w:rPr>
+        <w:t xml:space="preserve"> в</w:t>
+      </w:r>
+      <w:r>
+        <w:rPr>
+          <w:rFonts w:ascii="Times New Roman CYR" w:hAnsi="Times New Roman CYR" w:cs="Times New Roman CYR"/>
+          <w:szCs w:val="24"/>
+          <w:lang w:val="uk-UA" w:eastAsia="en-US"/>
+        </w:rPr>
         <w:t xml:space="preserve"> р</w:t>
       </w:r>
       <w:r>
@@ -1407,7 +1509,27 @@
           <w:highlight w:val="yellow"/>
           <w:lang w:val="en-US" w:eastAsia="en-US"/>
         </w:rPr>
-        <w:t>[ARENA, Poissant et al.]</w:t>
+        <w:t xml:space="preserve">[ARENA, </w:t>
+      </w:r>
+      <w:proofErr w:type="spellStart"/>
+      <w:r>
+        <w:rPr>
+          <w:rFonts w:ascii="Times New Roman CYR" w:hAnsi="Times New Roman CYR" w:cs="Times New Roman CYR"/>
+          <w:szCs w:val="24"/>
+          <w:highlight w:val="yellow"/>
+          <w:lang w:val="en-US" w:eastAsia="en-US"/>
+        </w:rPr>
+        <w:t>Poissant</w:t>
+      </w:r>
+      <w:proofErr w:type="spellEnd"/>
+      <w:r>
+        <w:rPr>
+          <w:rFonts w:ascii="Times New Roman CYR" w:hAnsi="Times New Roman CYR" w:cs="Times New Roman CYR"/>
+          <w:szCs w:val="24"/>
+          <w:highlight w:val="yellow"/>
+          <w:lang w:val="en-US" w:eastAsia="en-US"/>
+        </w:rPr>
+        <w:t xml:space="preserve"> et al.]</w:t>
       </w:r>
       <w:r>
         <w:rPr>
@@ -1575,6 +1697,7 @@
         </w:rPr>
         <w:t>[</w:t>
       </w:r>
+      <w:proofErr w:type="spellStart"/>
       <w:r>
         <w:rPr>
           <w:rFonts w:ascii="Times New Roman CYR" w:hAnsi="Times New Roman CYR" w:cs="Times New Roman CYR"/>
@@ -1582,7 +1705,17 @@
           <w:highlight w:val="yellow"/>
           <w:lang w:val="en-US" w:eastAsia="en-US"/>
         </w:rPr>
-        <w:t>Bortoff, stealt</w:t>
+        <w:t>Bortoff</w:t>
+      </w:r>
+      <w:proofErr w:type="spellEnd"/>
+      <w:r>
+        <w:rPr>
+          <w:rFonts w:ascii="Times New Roman CYR" w:hAnsi="Times New Roman CYR" w:cs="Times New Roman CYR"/>
+          <w:szCs w:val="24"/>
+          <w:highlight w:val="yellow"/>
+          <w:lang w:val="en-US" w:eastAsia="en-US"/>
+        </w:rPr>
+        <w:t>, stealt</w:t>
       </w:r>
       <w:r>
         <w:rPr>
@@ -1728,6 +1861,7 @@
         </w:rPr>
         <w:t>[</w:t>
       </w:r>
+      <w:proofErr w:type="spellStart"/>
       <w:r>
         <w:rPr>
           <w:rFonts w:ascii="Times New Roman CYR" w:hAnsi="Times New Roman CYR" w:cs="Times New Roman CYR"/>
@@ -1735,7 +1869,17 @@
           <w:highlight w:val="yellow"/>
           <w:lang w:val="uk-UA" w:eastAsia="en-US"/>
         </w:rPr>
-        <w:t>Пулеко та ін. ФЩРЦ</w:t>
+        <w:t>Пулеко</w:t>
+      </w:r>
+      <w:proofErr w:type="spellEnd"/>
+      <w:r>
+        <w:rPr>
+          <w:rFonts w:ascii="Times New Roman CYR" w:hAnsi="Times New Roman CYR" w:cs="Times New Roman CYR"/>
+          <w:szCs w:val="24"/>
+          <w:highlight w:val="yellow"/>
+          <w:lang w:val="uk-UA" w:eastAsia="en-US"/>
+        </w:rPr>
+        <w:t xml:space="preserve"> та ін. ФЩРЦ</w:t>
       </w:r>
       <w:r>
         <w:rPr>
@@ -1827,6 +1971,7 @@
         </w:rPr>
         <w:t>[</w:t>
       </w:r>
+      <w:proofErr w:type="spellStart"/>
       <w:r>
         <w:rPr>
           <w:rFonts w:ascii="Times New Roman CYR" w:hAnsi="Times New Roman CYR" w:cs="Times New Roman CYR"/>
@@ -1834,7 +1979,17 @@
           <w:highlight w:val="yellow"/>
           <w:lang w:val="uk-UA" w:eastAsia="en-US"/>
         </w:rPr>
-        <w:t xml:space="preserve">Пулеко та ін. </w:t>
+        <w:t>Пулеко</w:t>
+      </w:r>
+      <w:proofErr w:type="spellEnd"/>
+      <w:r>
+        <w:rPr>
+          <w:rFonts w:ascii="Times New Roman CYR" w:hAnsi="Times New Roman CYR" w:cs="Times New Roman CYR"/>
+          <w:szCs w:val="24"/>
+          <w:highlight w:val="yellow"/>
+          <w:lang w:val="uk-UA" w:eastAsia="en-US"/>
+        </w:rPr>
+        <w:t xml:space="preserve"> та ін. </w:t>
       </w:r>
       <w:r>
         <w:rPr>
@@ -2013,8 +2168,18 @@
           <w:szCs w:val="24"/>
           <w:lang w:val="uk-UA" w:eastAsia="en-US"/>
         </w:rPr>
-        <w:t>еднього навчання агента</w:t>
-      </w:r>
+        <w:t xml:space="preserve">еднього навчання </w:t>
+      </w:r>
+      <w:proofErr w:type="spellStart"/>
+      <w:r>
+        <w:rPr>
+          <w:rFonts w:ascii="Times New Roman CYR" w:hAnsi="Times New Roman CYR" w:cs="Times New Roman CYR"/>
+          <w:szCs w:val="24"/>
+          <w:lang w:val="uk-UA" w:eastAsia="en-US"/>
+        </w:rPr>
+        <w:t>агента</w:t>
+      </w:r>
+      <w:proofErr w:type="spellEnd"/>
       <w:r>
         <w:rPr>
           <w:rFonts w:ascii="Times New Roman CYR" w:hAnsi="Times New Roman CYR" w:cs="Times New Roman CYR"/>
@@ -2052,17 +2217,81 @@
         </w:rPr>
         <w:t>[</w:t>
       </w:r>
+      <w:proofErr w:type="spellStart"/>
       <w:r>
         <w:rPr>
           <w:highlight w:val="yellow"/>
         </w:rPr>
-        <w:t>Hohmann et a</w:t>
-      </w:r>
+        <w:t>Hohmann</w:t>
+      </w:r>
+      <w:proofErr w:type="spellEnd"/>
       <w:r>
         <w:rPr>
           <w:highlight w:val="yellow"/>
         </w:rPr>
-        <w:t>l., Hybrid Evolutionary MOPP</w:t>
+        <w:t xml:space="preserve"> </w:t>
+      </w:r>
+      <w:proofErr w:type="spellStart"/>
+      <w:r>
+        <w:rPr>
+          <w:highlight w:val="yellow"/>
+        </w:rPr>
+        <w:t>et</w:t>
+      </w:r>
+      <w:proofErr w:type="spellEnd"/>
+      <w:r>
+        <w:rPr>
+          <w:highlight w:val="yellow"/>
+        </w:rPr>
+        <w:t xml:space="preserve"> </w:t>
+      </w:r>
+      <w:proofErr w:type="spellStart"/>
+      <w:r>
+        <w:rPr>
+          <w:highlight w:val="yellow"/>
+        </w:rPr>
+        <w:t>a</w:t>
+      </w:r>
+      <w:r>
+        <w:rPr>
+          <w:highlight w:val="yellow"/>
+        </w:rPr>
+        <w:t>l</w:t>
+      </w:r>
+      <w:proofErr w:type="spellEnd"/>
+      <w:r>
+        <w:rPr>
+          <w:highlight w:val="yellow"/>
+        </w:rPr>
+        <w:t xml:space="preserve">., </w:t>
+      </w:r>
+      <w:proofErr w:type="spellStart"/>
+      <w:r>
+        <w:rPr>
+          <w:highlight w:val="yellow"/>
+        </w:rPr>
+        <w:t>Hybrid</w:t>
+      </w:r>
+      <w:proofErr w:type="spellEnd"/>
+      <w:r>
+        <w:rPr>
+          <w:highlight w:val="yellow"/>
+        </w:rPr>
+        <w:t xml:space="preserve"> </w:t>
+      </w:r>
+      <w:proofErr w:type="spellStart"/>
+      <w:r>
+        <w:rPr>
+          <w:highlight w:val="yellow"/>
+        </w:rPr>
+        <w:t>Evolutionary</w:t>
+      </w:r>
+      <w:proofErr w:type="spellEnd"/>
+      <w:r>
+        <w:rPr>
+          <w:highlight w:val="yellow"/>
+        </w:rPr>
+        <w:t xml:space="preserve"> MOPP</w:t>
       </w:r>
       <w:r>
         <w:rPr>
@@ -2137,13 +2366,23 @@
         </w:rPr>
         <w:t xml:space="preserve">на основі растрової карти з сервісу </w:t>
       </w:r>
+      <w:proofErr w:type="spellStart"/>
       <w:r>
         <w:rPr>
           <w:rFonts w:ascii="Times New Roman CYR" w:hAnsi="Times New Roman CYR" w:cs="Times New Roman CYR"/>
           <w:szCs w:val="24"/>
           <w:lang w:val="en-US" w:eastAsia="en-US"/>
         </w:rPr>
-        <w:t xml:space="preserve">OpenStreetMap </w:t>
+        <w:t>OpenStreetMap</w:t>
+      </w:r>
+      <w:proofErr w:type="spellEnd"/>
+      <w:r>
+        <w:rPr>
+          <w:rFonts w:ascii="Times New Roman CYR" w:hAnsi="Times New Roman CYR" w:cs="Times New Roman CYR"/>
+          <w:szCs w:val="24"/>
+          <w:lang w:val="en-US" w:eastAsia="en-US"/>
+        </w:rPr>
+        <w:t xml:space="preserve"> </w:t>
       </w:r>
       <w:r>
         <w:rPr>
@@ -2276,7 +2515,27 @@
           <w:highlight w:val="yellow"/>
           <w:lang w:val="en-US" w:eastAsia="en-US"/>
         </w:rPr>
-        <w:t>[Takemura, Energy and Perception]</w:t>
+        <w:t>[</w:t>
+      </w:r>
+      <w:proofErr w:type="spellStart"/>
+      <w:r>
+        <w:rPr>
+          <w:rFonts w:ascii="Times New Roman CYR" w:hAnsi="Times New Roman CYR" w:cs="Times New Roman CYR"/>
+          <w:szCs w:val="24"/>
+          <w:highlight w:val="yellow"/>
+          <w:lang w:val="en-US" w:eastAsia="en-US"/>
+        </w:rPr>
+        <w:t>Takemura</w:t>
+      </w:r>
+      <w:proofErr w:type="spellEnd"/>
+      <w:r>
+        <w:rPr>
+          <w:rFonts w:ascii="Times New Roman CYR" w:hAnsi="Times New Roman CYR" w:cs="Times New Roman CYR"/>
+          <w:szCs w:val="24"/>
+          <w:highlight w:val="yellow"/>
+          <w:lang w:val="en-US" w:eastAsia="en-US"/>
+        </w:rPr>
+        <w:t>, Energy and Perception]</w:t>
       </w:r>
       <w:r>
         <w:rPr>
@@ -2491,6 +2750,7 @@
         </w:rPr>
         <w:t>[</w:t>
       </w:r>
+      <w:proofErr w:type="spellStart"/>
       <w:r>
         <w:rPr>
           <w:rFonts w:ascii="Times New Roman CYR" w:hAnsi="Times New Roman CYR" w:cs="Times New Roman CYR"/>
@@ -2498,7 +2758,17 @@
           <w:highlight w:val="yellow"/>
           <w:lang w:val="en-US" w:eastAsia="en-US"/>
         </w:rPr>
-        <w:t>Dabin, Topology-Guided]</w:t>
+        <w:t>Dabin</w:t>
+      </w:r>
+      <w:proofErr w:type="spellEnd"/>
+      <w:r>
+        <w:rPr>
+          <w:rFonts w:ascii="Times New Roman CYR" w:hAnsi="Times New Roman CYR" w:cs="Times New Roman CYR"/>
+          <w:szCs w:val="24"/>
+          <w:highlight w:val="yellow"/>
+          <w:lang w:val="en-US" w:eastAsia="en-US"/>
+        </w:rPr>
+        <w:t>, Topology-Guided]</w:t>
       </w:r>
       <w:r>
         <w:rPr>
@@ -2727,7 +2997,27 @@
           <w:highlight w:val="yellow"/>
           <w:lang w:val="en-US" w:eastAsia="en-US"/>
         </w:rPr>
-        <w:t>[Thanh, Toward]</w:t>
+        <w:t>[</w:t>
+      </w:r>
+      <w:proofErr w:type="spellStart"/>
+      <w:r>
+        <w:rPr>
+          <w:rFonts w:ascii="Times New Roman CYR" w:hAnsi="Times New Roman CYR" w:cs="Times New Roman CYR"/>
+          <w:szCs w:val="24"/>
+          <w:highlight w:val="yellow"/>
+          <w:lang w:val="en-US" w:eastAsia="en-US"/>
+        </w:rPr>
+        <w:t>Thanh</w:t>
+      </w:r>
+      <w:proofErr w:type="spellEnd"/>
+      <w:r>
+        <w:rPr>
+          <w:rFonts w:ascii="Times New Roman CYR" w:hAnsi="Times New Roman CYR" w:cs="Times New Roman CYR"/>
+          <w:szCs w:val="24"/>
+          <w:highlight w:val="yellow"/>
+          <w:lang w:val="en-US" w:eastAsia="en-US"/>
+        </w:rPr>
+        <w:t>, Toward]</w:t>
       </w:r>
       <w:r>
         <w:rPr>
@@ -2832,7 +3122,57 @@
           <w:szCs w:val="24"/>
           <w:lang w:val="uk-UA" w:eastAsia="en-US"/>
         </w:rPr>
-        <w:t>навігаційної якості на супутникових та аерофотознімках;</w:t>
+        <w:t xml:space="preserve">навігаційної якості на супутникових та </w:t>
+      </w:r>
+      <w:proofErr w:type="spellStart"/>
+      <w:r>
+        <w:rPr>
+          <w:rFonts w:ascii="Times New Roman CYR" w:hAnsi="Times New Roman CYR" w:cs="Times New Roman CYR"/>
+          <w:szCs w:val="24"/>
+          <w:lang w:val="uk-UA" w:eastAsia="en-US"/>
+        </w:rPr>
+        <w:t>аерофотознімках</w:t>
+      </w:r>
+      <w:proofErr w:type="spellEnd"/>
+      <w:r>
+        <w:rPr>
+          <w:rFonts w:ascii="Times New Roman CYR" w:hAnsi="Times New Roman CYR" w:cs="Times New Roman CYR"/>
+          <w:szCs w:val="24"/>
+          <w:lang w:val="en-US" w:eastAsia="en-US"/>
+        </w:rPr>
+        <w:t xml:space="preserve"> </w:t>
+      </w:r>
+      <w:r>
+        <w:rPr>
+          <w:rFonts w:ascii="Times New Roman CYR" w:hAnsi="Times New Roman CYR" w:cs="Times New Roman CYR"/>
+          <w:szCs w:val="24"/>
+          <w:lang w:val="uk-UA" w:eastAsia="en-US"/>
+        </w:rPr>
+        <w:t>для планування маршруту в несприятливих</w:t>
+      </w:r>
+      <w:r>
+        <w:rPr>
+          <w:rFonts w:ascii="Times New Roman CYR" w:hAnsi="Times New Roman CYR" w:cs="Times New Roman CYR"/>
+          <w:szCs w:val="24"/>
+          <w:lang w:val="en-US" w:eastAsia="en-US"/>
+        </w:rPr>
+        <w:t xml:space="preserve"> </w:t>
+      </w:r>
+      <w:r>
+        <w:rPr>
+          <w:rFonts w:ascii="Times New Roman CYR" w:hAnsi="Times New Roman CYR" w:cs="Times New Roman CYR"/>
+          <w:szCs w:val="24"/>
+          <w:lang w:val="uk-UA" w:eastAsia="en-US"/>
+        </w:rPr>
+        <w:t>умовах</w:t>
+      </w:r>
+      <w:r>
+        <w:rPr>
+          <w:rFonts w:ascii="Times New Roman CYR" w:hAnsi="Times New Roman CYR" w:cs="Times New Roman CYR"/>
+          <w:szCs w:val="24"/>
+          <w:lang w:val="uk-UA" w:eastAsia="en-US"/>
+        </w:rPr>
+        <w:t>;</w:t>
       </w:r>
     </w:p>
     <w:p>
@@ -2852,7 +3192,15 @@
           <w:szCs w:val="24"/>
           <w:lang w:val="uk-UA" w:eastAsia="en-US"/>
         </w:rPr>
-        <w:t>врахування умов погіршення видимості в зоні виконання завдань;</w:t>
+        <w:t>у</w:t>
+      </w:r>
+      <w:r>
+        <w:rPr>
+          <w:rFonts w:ascii="Times New Roman CYR" w:hAnsi="Times New Roman CYR" w:cs="Times New Roman CYR"/>
+          <w:szCs w:val="24"/>
+          <w:lang w:val="uk-UA" w:eastAsia="en-US"/>
+        </w:rPr>
+        <w:t>рахування погіршення видимості в зоні виконання завдань;</w:t>
       </w:r>
     </w:p>
     <w:p>
@@ -2866,8 +3214,22 @@
           <w:lang w:val="uk-UA" w:eastAsia="en-US"/>
         </w:rPr>
       </w:pPr>
-      <w:bookmarkStart w:id="0" w:name="_GoBack"/>
-      <w:bookmarkEnd w:id="0"/>
+      <w:r>
+        <w:rPr>
+          <w:rFonts w:ascii="Times New Roman CYR" w:hAnsi="Times New Roman CYR" w:cs="Times New Roman CYR"/>
+          <w:szCs w:val="24"/>
+          <w:lang w:val="uk-UA" w:eastAsia="en-US"/>
+        </w:rPr>
+        <w:t>у</w:t>
+      </w:r>
+      <w:r>
+        <w:rPr>
+          <w:rFonts w:ascii="Times New Roman CYR" w:hAnsi="Times New Roman CYR" w:cs="Times New Roman CYR"/>
+          <w:szCs w:val="24"/>
+          <w:lang w:val="uk-UA" w:eastAsia="en-US"/>
+        </w:rPr>
+        <w:t>рахування висоти рельєфу місцевості в зоні виконання завдань;</w:t>
+      </w:r>
     </w:p>
     <w:p>
       <w:pPr>
@@ -2876,7 +3238,6 @@
         <w:jc w:val="both"/>
         <w:rPr>
           <w:rFonts w:ascii="Times New Roman CYR" w:hAnsi="Times New Roman CYR" w:cs="Times New Roman CYR"/>
-          <w:color w:val="000000"/>
           <w:szCs w:val="24"/>
           <w:lang w:val="uk-UA" w:eastAsia="en-US"/>
         </w:rPr>
@@ -2884,76 +3245,74 @@
       <w:r>
         <w:rPr>
           <w:rFonts w:ascii="Times New Roman CYR" w:hAnsi="Times New Roman CYR" w:cs="Times New Roman CYR"/>
-          <w:b/>
-          <w:bCs/>
-          <w:szCs w:val="24"/>
-          <w:lang w:val="uk-UA" w:eastAsia="en-US"/>
-        </w:rPr>
-        <w:t>Мета роботи</w:t>
-      </w:r>
-      <w:r>
-        <w:rPr>
-          <w:rFonts w:ascii="Times New Roman CYR" w:hAnsi="Times New Roman CYR" w:cs="Times New Roman CYR"/>
-          <w:szCs w:val="24"/>
-          <w:lang w:val="uk-UA" w:eastAsia="en-US"/>
-        </w:rPr>
-        <w:t xml:space="preserve">. </w:t>
-      </w:r>
-      <w:r>
-        <w:rPr>
-          <w:rFonts w:ascii="Times New Roman CYR" w:hAnsi="Times New Roman CYR" w:cs="Times New Roman CYR"/>
-          <w:szCs w:val="24"/>
-          <w:lang w:val="uk-UA" w:eastAsia="en-US"/>
-        </w:rPr>
-        <w:t xml:space="preserve">Метою роботи є постановка завдання </w:t>
-      </w:r>
-      <w:r>
-        <w:rPr>
-          <w:rFonts w:ascii="Times New Roman CYR" w:hAnsi="Times New Roman CYR" w:cs="Times New Roman CYR"/>
-          <w:szCs w:val="24"/>
-          <w:lang w:val="uk-UA" w:eastAsia="en-US"/>
-        </w:rPr>
-        <w:t>пошуку оптимального маршруту БПС в складі БпАК на основі різнорідних даних</w:t>
-      </w:r>
-      <w:r>
-        <w:rPr>
-          <w:rFonts w:ascii="Times New Roman CYR" w:hAnsi="Times New Roman CYR" w:cs="Times New Roman CYR"/>
-          <w:szCs w:val="24"/>
-          <w:lang w:val="uk-UA" w:eastAsia="en-US"/>
-        </w:rPr>
-        <w:t xml:space="preserve"> для виконання завдань в несприятливих умовах</w:t>
-      </w:r>
-      <w:r>
-        <w:rPr>
-          <w:rFonts w:ascii="Times New Roman CYR" w:hAnsi="Times New Roman CYR" w:cs="Times New Roman CYR"/>
-          <w:szCs w:val="24"/>
-          <w:lang w:val="uk-UA" w:eastAsia="en-US"/>
-        </w:rPr>
-        <w:t xml:space="preserve"> та </w:t>
-      </w:r>
-      <w:r>
-        <w:rPr>
-          <w:rFonts w:ascii="Times New Roman CYR" w:hAnsi="Times New Roman CYR" w:cs="Times New Roman CYR"/>
-          <w:szCs w:val="24"/>
-          <w:lang w:val="uk-UA" w:eastAsia="en-US"/>
-        </w:rPr>
-        <w:t>розробка</w:t>
-      </w:r>
-      <w:r>
-        <w:rPr>
-          <w:rFonts w:ascii="Times New Roman CYR" w:hAnsi="Times New Roman CYR" w:cs="Times New Roman CYR"/>
-          <w:szCs w:val="24"/>
-          <w:lang w:val="uk-UA" w:eastAsia="en-US"/>
-        </w:rPr>
-        <w:t xml:space="preserve"> підходу до його вирішення</w:t>
-      </w:r>
-      <w:r>
-        <w:rPr>
-          <w:rFonts w:ascii="Times New Roman CYR" w:hAnsi="Times New Roman CYR" w:cs="Times New Roman CYR"/>
-          <w:szCs w:val="24"/>
-          <w:lang w:val="uk-UA" w:eastAsia="en-US"/>
-        </w:rPr>
-        <w:t>.</w:t>
+          <w:szCs w:val="24"/>
+          <w:lang w:val="uk-UA" w:eastAsia="en-US"/>
+        </w:rPr>
+        <w:t xml:space="preserve">розробка </w:t>
+      </w:r>
+      <w:r>
+        <w:rPr>
+          <w:rFonts w:ascii="Times New Roman CYR" w:hAnsi="Times New Roman CYR" w:cs="Times New Roman CYR"/>
+          <w:szCs w:val="24"/>
+          <w:lang w:val="uk-UA" w:eastAsia="en-US"/>
+        </w:rPr>
+        <w:t>п</w:t>
+      </w:r>
+      <w:r>
+        <w:rPr>
+          <w:rFonts w:ascii="Times New Roman CYR" w:hAnsi="Times New Roman CYR" w:cs="Times New Roman CYR"/>
+          <w:szCs w:val="24"/>
+          <w:lang w:val="uk-UA" w:eastAsia="en-US"/>
+        </w:rPr>
+        <w:t>роцедури планування маршруту з</w:t>
+      </w:r>
+      <w:r>
+        <w:rPr>
+          <w:rFonts w:ascii="Times New Roman CYR" w:hAnsi="Times New Roman CYR" w:cs="Times New Roman CYR"/>
+          <w:szCs w:val="24"/>
+          <w:lang w:val="uk-UA" w:eastAsia="en-US"/>
+        </w:rPr>
+        <w:t xml:space="preserve"> забезпечення</w:t>
+      </w:r>
+      <w:r>
+        <w:rPr>
+          <w:rFonts w:ascii="Times New Roman CYR" w:hAnsi="Times New Roman CYR" w:cs="Times New Roman CYR"/>
+          <w:szCs w:val="24"/>
+          <w:lang w:val="uk-UA" w:eastAsia="en-US"/>
+        </w:rPr>
+        <w:t>м</w:t>
+      </w:r>
+      <w:r>
+        <w:rPr>
+          <w:rFonts w:ascii="Times New Roman CYR" w:hAnsi="Times New Roman CYR" w:cs="Times New Roman CYR"/>
+          <w:szCs w:val="24"/>
+          <w:lang w:val="uk-UA" w:eastAsia="en-US"/>
+        </w:rPr>
+        <w:t xml:space="preserve"> </w:t>
+      </w:r>
+      <w:r>
+        <w:rPr>
+          <w:rFonts w:ascii="Times New Roman CYR" w:hAnsi="Times New Roman CYR" w:cs="Times New Roman CYR"/>
+          <w:szCs w:val="24"/>
+          <w:lang w:val="uk-UA" w:eastAsia="en-US"/>
+        </w:rPr>
+        <w:t>достатньої навігаційної якості для роботи візуальної та рельєфної навігації</w:t>
+      </w:r>
+      <w:r>
+        <w:rPr>
+          <w:rFonts w:ascii="Times New Roman CYR" w:hAnsi="Times New Roman CYR" w:cs="Times New Roman CYR"/>
+          <w:szCs w:val="24"/>
+          <w:lang w:val="uk-UA" w:eastAsia="en-US"/>
+        </w:rPr>
+        <w:t xml:space="preserve"> в умовах недоступності ГНСС</w:t>
+      </w:r>
+      <w:r>
+        <w:rPr>
+          <w:rFonts w:ascii="Times New Roman CYR" w:hAnsi="Times New Roman CYR" w:cs="Times New Roman CYR"/>
+          <w:szCs w:val="24"/>
+          <w:lang w:val="uk-UA" w:eastAsia="en-US"/>
+        </w:rPr>
+        <w:t>;</w:t>
       </w:r>
     </w:p>
     <w:p>
@@ -2967,288 +3326,6 @@
           <w:lang w:val="uk-UA" w:eastAsia="en-US"/>
         </w:rPr>
       </w:pPr>
-      <w:r>
-        <w:rPr>
-          <w:rFonts w:ascii="Times New Roman CYR" w:hAnsi="Times New Roman CYR" w:cs="Times New Roman CYR"/>
-          <w:b/>
-          <w:bCs/>
-          <w:szCs w:val="24"/>
-          <w:lang w:val="uk-UA" w:eastAsia="en-US"/>
-        </w:rPr>
-        <w:t>Постановка задачі</w:t>
-      </w:r>
-      <w:r>
-        <w:rPr>
-          <w:rFonts w:ascii="Times New Roman CYR" w:hAnsi="Times New Roman CYR" w:cs="Times New Roman CYR"/>
-          <w:szCs w:val="24"/>
-          <w:lang w:val="uk-UA" w:eastAsia="en-US"/>
-        </w:rPr>
-        <w:t>.</w:t>
-      </w:r>
-      <w:r>
-        <w:rPr>
-          <w:rFonts w:ascii="Times New Roman CYR" w:hAnsi="Times New Roman CYR" w:cs="Times New Roman CYR"/>
-          <w:szCs w:val="24"/>
-          <w:lang w:val="uk-UA" w:eastAsia="en-US"/>
-        </w:rPr>
-        <w:t xml:space="preserve"> Виконання завдання покладеного на БПС в складі БпАК </w:t>
-      </w:r>
-      <w:r>
-        <w:rPr>
-          <w:rFonts w:ascii="Times New Roman CYR" w:hAnsi="Times New Roman CYR" w:cs="Times New Roman CYR"/>
-          <w:szCs w:val="24"/>
-          <w:lang w:val="uk-UA" w:eastAsia="en-US"/>
-        </w:rPr>
-        <w:t>полягає в переміщенні БПС з початкової точки в точку призначення з виконанням точної посадки</w:t>
-      </w:r>
-      <w:r>
-        <w:rPr>
-          <w:rFonts w:ascii="Times New Roman CYR" w:hAnsi="Times New Roman CYR" w:cs="Times New Roman CYR"/>
-          <w:szCs w:val="24"/>
-          <w:lang w:val="uk-UA" w:eastAsia="en-US"/>
-        </w:rPr>
-        <w:t xml:space="preserve">. </w:t>
-      </w:r>
-      <w:r>
-        <w:rPr>
-          <w:rFonts w:ascii="Times New Roman CYR" w:hAnsi="Times New Roman CYR" w:cs="Times New Roman CYR"/>
-          <w:szCs w:val="24"/>
-          <w:lang w:val="uk-UA" w:eastAsia="en-US"/>
-        </w:rPr>
-        <w:t xml:space="preserve">Через </w:t>
-      </w:r>
-      <w:r>
-        <w:rPr>
-          <w:rFonts w:ascii="Times New Roman CYR" w:hAnsi="Times New Roman CYR" w:cs="Times New Roman CYR"/>
-          <w:szCs w:val="24"/>
-          <w:lang w:val="uk-UA" w:eastAsia="en-US"/>
-        </w:rPr>
-        <w:t>високу ймовірність недоступності</w:t>
-      </w:r>
-      <w:r>
-        <w:rPr>
-          <w:rFonts w:ascii="Times New Roman CYR" w:hAnsi="Times New Roman CYR" w:cs="Times New Roman CYR"/>
-          <w:szCs w:val="24"/>
-          <w:lang w:val="uk-UA" w:eastAsia="en-US"/>
-        </w:rPr>
-        <w:t xml:space="preserve"> або некоректн</w:t>
-      </w:r>
-      <w:r>
-        <w:rPr>
-          <w:rFonts w:ascii="Times New Roman CYR" w:hAnsi="Times New Roman CYR" w:cs="Times New Roman CYR"/>
-          <w:szCs w:val="24"/>
-          <w:lang w:val="uk-UA" w:eastAsia="en-US"/>
-        </w:rPr>
-        <w:t>ості</w:t>
-      </w:r>
-      <w:r>
-        <w:rPr>
-          <w:rFonts w:ascii="Times New Roman CYR" w:hAnsi="Times New Roman CYR" w:cs="Times New Roman CYR"/>
-          <w:szCs w:val="24"/>
-          <w:lang w:val="uk-UA" w:eastAsia="en-US"/>
-        </w:rPr>
-        <w:t xml:space="preserve"> роботи ГНСС</w:t>
-      </w:r>
-      <w:r>
-        <w:rPr>
-          <w:rFonts w:ascii="Times New Roman CYR" w:hAnsi="Times New Roman CYR" w:cs="Times New Roman CYR"/>
-          <w:szCs w:val="24"/>
-          <w:lang w:val="uk-UA" w:eastAsia="en-US"/>
-        </w:rPr>
-        <w:t xml:space="preserve"> </w:t>
-      </w:r>
-      <w:r>
-        <w:rPr>
-          <w:rFonts w:ascii="Times New Roman CYR" w:hAnsi="Times New Roman CYR" w:cs="Times New Roman CYR"/>
-          <w:szCs w:val="24"/>
-          <w:lang w:val="uk-UA" w:eastAsia="en-US"/>
-        </w:rPr>
-        <w:t xml:space="preserve">в зоні виконання завдань для визначення місцезнаходження БПС </w:t>
-      </w:r>
-      <w:r>
-        <w:rPr>
-          <w:rFonts w:ascii="Times New Roman CYR" w:hAnsi="Times New Roman CYR" w:cs="Times New Roman CYR"/>
-          <w:szCs w:val="24"/>
-          <w:lang w:val="uk-UA" w:eastAsia="en-US"/>
-        </w:rPr>
-        <w:t xml:space="preserve">застосовується гібридний підхід, який поєднує візуальну навігацію на основі геоприв’язаних супутникових знімків та </w:t>
-      </w:r>
-      <w:r>
-        <w:rPr>
-          <w:rFonts w:ascii="Times New Roman CYR" w:hAnsi="Times New Roman CYR" w:cs="Times New Roman CYR"/>
-          <w:szCs w:val="24"/>
-          <w:lang w:val="uk-UA" w:eastAsia="en-US"/>
-        </w:rPr>
-        <w:t>карти висот з методом числення координат.</w:t>
-      </w:r>
-      <w:r>
-        <w:rPr>
-          <w:rFonts w:ascii="Times New Roman CYR" w:hAnsi="Times New Roman CYR" w:cs="Times New Roman CYR"/>
-          <w:szCs w:val="24"/>
-          <w:lang w:val="uk-UA"/>
-        </w:rPr>
-        <w:t xml:space="preserve"> </w:t>
-      </w:r>
-      <w:r>
-        <w:rPr>
-          <w:rFonts w:ascii="Times New Roman CYR" w:hAnsi="Times New Roman CYR" w:cs="Times New Roman CYR"/>
-          <w:szCs w:val="24"/>
-          <w:lang w:val="uk-UA"/>
-        </w:rPr>
-        <w:t xml:space="preserve">Вимоги до планування маршруту руху БПС в несприятливих умовах визначаються необхідністю оперативного виконання завдань для збереження життя та здоров’я людей, мінімізації втрат матеріальних ресурсів. </w:t>
-      </w:r>
-      <w:r>
-        <w:rPr>
-          <w:rFonts w:ascii="Times New Roman CYR" w:hAnsi="Times New Roman CYR" w:cs="Times New Roman CYR"/>
-          <w:szCs w:val="24"/>
-          <w:lang w:val="uk-UA"/>
-        </w:rPr>
-        <w:t>Тому результатом планування БПС має бути такий маршрут, який першочергово забезпечує мінімальний час виконання польот</w:t>
-      </w:r>
-      <w:r>
-        <w:rPr>
-          <w:rFonts w:ascii="Times New Roman CYR" w:hAnsi="Times New Roman CYR" w:cs="Times New Roman CYR"/>
-          <w:szCs w:val="24"/>
-          <w:lang w:val="uk-UA"/>
-        </w:rPr>
-        <w:t xml:space="preserve">у. </w:t>
-      </w:r>
-      <w:r>
-        <w:rPr>
-          <w:rFonts w:ascii="Times New Roman CYR" w:hAnsi="Times New Roman CYR" w:cs="Times New Roman CYR"/>
-          <w:szCs w:val="24"/>
-          <w:lang w:val="uk-UA"/>
-        </w:rPr>
-        <w:t xml:space="preserve">Однак, зважаючи на те, що визначення місцезнаходження БПС ускладнене </w:t>
-      </w:r>
-      <w:r>
-        <w:rPr>
-          <w:rFonts w:ascii="Times New Roman CYR" w:hAnsi="Times New Roman CYR" w:cs="Times New Roman CYR"/>
-          <w:szCs w:val="24"/>
-          <w:lang w:val="uk-UA"/>
-        </w:rPr>
-        <w:t xml:space="preserve">несприятливими умовами, важливим аспектом є </w:t>
-      </w:r>
-      <w:r>
-        <w:rPr>
-          <w:rFonts w:ascii="Times New Roman CYR" w:hAnsi="Times New Roman CYR" w:cs="Times New Roman CYR"/>
-          <w:szCs w:val="24"/>
-          <w:lang w:val="uk-UA"/>
-        </w:rPr>
-        <w:t xml:space="preserve">придатність запланованого маршруту для застосування </w:t>
-      </w:r>
-      <w:r>
-        <w:rPr>
-          <w:rFonts w:ascii="Times New Roman CYR" w:hAnsi="Times New Roman CYR" w:cs="Times New Roman CYR"/>
-          <w:szCs w:val="24"/>
-          <w:lang w:val="uk-UA"/>
-        </w:rPr>
-        <w:t>візуальної та рельєфної навігації</w:t>
-      </w:r>
-      <w:r>
-        <w:rPr>
-          <w:rFonts w:ascii="Times New Roman CYR" w:hAnsi="Times New Roman CYR" w:cs="Times New Roman CYR"/>
-          <w:szCs w:val="24"/>
-          <w:lang w:val="uk-UA"/>
-        </w:rPr>
-        <w:t>. Від того наскільки багатою на візуальні</w:t>
-      </w:r>
-      <w:r>
-        <w:rPr>
-          <w:rFonts w:ascii="Times New Roman CYR" w:hAnsi="Times New Roman CYR" w:cs="Times New Roman CYR"/>
-          <w:szCs w:val="24"/>
-          <w:lang w:val="uk-UA"/>
-        </w:rPr>
-        <w:t xml:space="preserve"> та рельєфні</w:t>
-      </w:r>
-      <w:r>
-        <w:rPr>
-          <w:rFonts w:ascii="Times New Roman CYR" w:hAnsi="Times New Roman CYR" w:cs="Times New Roman CYR"/>
-          <w:szCs w:val="24"/>
-          <w:lang w:val="uk-UA"/>
-        </w:rPr>
-        <w:t xml:space="preserve"> особливості є поверхня над якою проходить маршрут залежить точність визначення місцезнаходження під час польоту, відповідно, точність</w:t>
-      </w:r>
-      <w:r>
-        <w:rPr>
-          <w:rFonts w:ascii="Times New Roman CYR" w:hAnsi="Times New Roman CYR" w:cs="Times New Roman CYR"/>
-          <w:szCs w:val="24"/>
-          <w:lang w:val="uk-UA"/>
-        </w:rPr>
-        <w:t xml:space="preserve"> та швидкість</w:t>
-      </w:r>
-      <w:r>
-        <w:rPr>
-          <w:rFonts w:ascii="Times New Roman CYR" w:hAnsi="Times New Roman CYR" w:cs="Times New Roman CYR"/>
-          <w:szCs w:val="24"/>
-          <w:lang w:val="uk-UA"/>
-        </w:rPr>
-        <w:t xml:space="preserve"> вик</w:t>
-      </w:r>
-      <w:r>
-        <w:rPr>
-          <w:rFonts w:ascii="Times New Roman CYR" w:hAnsi="Times New Roman CYR" w:cs="Times New Roman CYR"/>
-          <w:szCs w:val="24"/>
-          <w:lang w:val="uk-UA"/>
-        </w:rPr>
-        <w:t>онання поставленого завдання.</w:t>
-      </w:r>
-      <w:r>
-        <w:rPr>
-          <w:rFonts w:ascii="Times New Roman CYR" w:hAnsi="Times New Roman CYR" w:cs="Times New Roman CYR"/>
-          <w:szCs w:val="24"/>
-          <w:lang w:val="en-US"/>
-        </w:rPr>
-        <w:t xml:space="preserve"> </w:t>
-      </w:r>
-      <w:r>
-        <w:rPr>
-          <w:rFonts w:ascii="Times New Roman CYR" w:hAnsi="Times New Roman CYR" w:cs="Times New Roman CYR"/>
-          <w:szCs w:val="24"/>
-          <w:lang w:val="uk-UA"/>
-        </w:rPr>
-        <w:t>Отже</w:t>
-      </w:r>
-      <w:r>
-        <w:rPr>
-          <w:rFonts w:ascii="Times New Roman CYR" w:hAnsi="Times New Roman CYR" w:cs="Times New Roman CYR"/>
-          <w:szCs w:val="24"/>
-          <w:lang w:val="uk-UA"/>
-        </w:rPr>
-        <w:t>,</w:t>
-      </w:r>
-      <w:r>
-        <w:rPr>
-          <w:rFonts w:ascii="Times New Roman CYR" w:hAnsi="Times New Roman CYR" w:cs="Times New Roman CYR"/>
-          <w:szCs w:val="24"/>
-          <w:lang w:val="uk-UA"/>
-        </w:rPr>
-        <w:t xml:space="preserve"> маршрут отриманий в результаті планування має мінімізувати час виконання польоту</w:t>
-      </w:r>
-      <w:r>
-        <w:rPr>
-          <w:rFonts w:ascii="Times New Roman CYR" w:hAnsi="Times New Roman CYR" w:cs="Times New Roman CYR"/>
-          <w:szCs w:val="24"/>
-          <w:lang w:val="uk-UA"/>
-        </w:rPr>
-        <w:t xml:space="preserve"> з початкової точки в кінцеву та забезпечувати належну </w:t>
-      </w:r>
-      <w:r>
-        <w:rPr>
-          <w:rFonts w:ascii="Times New Roman CYR" w:hAnsi="Times New Roman CYR" w:cs="Times New Roman CYR"/>
-          <w:szCs w:val="24"/>
-          <w:lang w:val="uk-UA"/>
-        </w:rPr>
-        <w:t xml:space="preserve">деталізацію </w:t>
-      </w:r>
-      <w:r>
-        <w:rPr>
-          <w:rFonts w:ascii="Times New Roman CYR" w:hAnsi="Times New Roman CYR" w:cs="Times New Roman CYR"/>
-          <w:szCs w:val="24"/>
-          <w:lang w:val="uk-UA"/>
-        </w:rPr>
-        <w:t>місцевості для визначення місцезнаходження під час польоту.</w:t>
-      </w:r>
     </w:p>
     <w:p>
       <w:pPr>
@@ -3257,6 +3334,7 @@
         <w:jc w:val="both"/>
         <w:rPr>
           <w:rFonts w:ascii="Times New Roman CYR" w:hAnsi="Times New Roman CYR" w:cs="Times New Roman CYR"/>
+          <w:color w:val="000000"/>
           <w:szCs w:val="24"/>
           <w:lang w:val="uk-UA" w:eastAsia="en-US"/>
         </w:rPr>
@@ -3269,7 +3347,7 @@
           <w:szCs w:val="24"/>
           <w:lang w:val="uk-UA" w:eastAsia="en-US"/>
         </w:rPr>
-        <w:t>Вирішення проблеми</w:t>
+        <w:t>Мета роботи</w:t>
       </w:r>
       <w:r>
         <w:rPr>
@@ -3285,111 +3363,108 @@
           <w:szCs w:val="24"/>
           <w:lang w:val="uk-UA" w:eastAsia="en-US"/>
         </w:rPr>
-        <w:t xml:space="preserve">Для постановки задачі багатокритеріальної оптимізації слід визначити </w:t>
-      </w:r>
-      <w:r>
-        <w:rPr>
-          <w:rFonts w:ascii="Times New Roman CYR" w:hAnsi="Times New Roman CYR" w:cs="Times New Roman CYR"/>
-          <w:szCs w:val="24"/>
-          <w:lang w:val="uk-UA" w:eastAsia="en-US"/>
-        </w:rPr>
-        <w:t xml:space="preserve">набір вхідних даних, які мають надаватися для планування маршруту. </w:t>
-      </w:r>
-      <w:r>
-        <w:rPr>
-          <w:rFonts w:ascii="Times New Roman CYR" w:hAnsi="Times New Roman CYR" w:cs="Times New Roman CYR"/>
-          <w:szCs w:val="24"/>
-          <w:lang w:val="uk-UA" w:eastAsia="en-US"/>
-        </w:rPr>
-        <w:t>С</w:t>
-      </w:r>
-      <w:r>
-        <w:rPr>
-          <w:rFonts w:ascii="Times New Roman CYR" w:hAnsi="Times New Roman CYR" w:cs="Times New Roman CYR"/>
-          <w:szCs w:val="24"/>
-          <w:lang w:val="uk-UA" w:eastAsia="en-US"/>
-        </w:rPr>
-        <w:t>лід мати наступний набір даних</w:t>
-      </w:r>
-      <w:r>
-        <w:rPr>
-          <w:rFonts w:ascii="Times New Roman CYR" w:hAnsi="Times New Roman CYR" w:cs="Times New Roman CYR"/>
-          <w:szCs w:val="24"/>
-          <w:lang w:val="uk-UA" w:eastAsia="en-US"/>
-        </w:rPr>
-        <w:t xml:space="preserve"> про місцевість для виконання завдань</w:t>
-      </w:r>
-      <w:r>
-        <w:rPr>
-          <w:rFonts w:ascii="Times New Roman CYR" w:hAnsi="Times New Roman CYR" w:cs="Times New Roman CYR"/>
-          <w:szCs w:val="24"/>
-          <w:lang w:val="uk-UA" w:eastAsia="en-US"/>
-        </w:rPr>
-        <w:t xml:space="preserve">: геоприв’язаний супутниковий знімок, карта висот, карта вітру, </w:t>
-      </w:r>
-      <w:r>
-        <w:rPr>
-          <w:rFonts w:ascii="Times New Roman CYR" w:hAnsi="Times New Roman CYR" w:cs="Times New Roman CYR"/>
-          <w:szCs w:val="24"/>
-          <w:lang w:val="uk-UA" w:eastAsia="en-US"/>
-        </w:rPr>
-        <w:t xml:space="preserve">зони, де проліт заборонено, зони з погіршеною видимістю. </w:t>
-      </w:r>
-      <w:r>
-        <w:rPr>
-          <w:rFonts w:ascii="Times New Roman CYR" w:hAnsi="Times New Roman CYR" w:cs="Times New Roman CYR"/>
-          <w:szCs w:val="24"/>
-          <w:lang w:val="uk-UA" w:eastAsia="en-US"/>
-        </w:rPr>
-        <w:t>Для забезпечення допустимого маршруту для конкретного</w:t>
-      </w:r>
-      <w:r>
-        <w:rPr>
-          <w:rFonts w:ascii="Times New Roman CYR" w:hAnsi="Times New Roman CYR" w:cs="Times New Roman CYR"/>
-          <w:szCs w:val="24"/>
-          <w:lang w:val="uk-UA" w:eastAsia="en-US"/>
-        </w:rPr>
-        <w:t xml:space="preserve"> виду БПС, слід на</w:t>
-      </w:r>
-      <w:r>
-        <w:rPr>
-          <w:rFonts w:ascii="Times New Roman CYR" w:hAnsi="Times New Roman CYR" w:cs="Times New Roman CYR"/>
-          <w:szCs w:val="24"/>
-          <w:lang w:val="uk-UA" w:eastAsia="en-US"/>
-        </w:rPr>
-        <w:t>дати кінематичну</w:t>
-      </w:r>
-      <w:r>
-        <w:rPr>
-          <w:rFonts w:ascii="Times New Roman CYR" w:hAnsi="Times New Roman CYR" w:cs="Times New Roman CYR"/>
-          <w:szCs w:val="24"/>
-          <w:lang w:val="uk-UA" w:eastAsia="en-US"/>
-        </w:rPr>
-        <w:t xml:space="preserve"> модель БПС та </w:t>
-      </w:r>
-      <w:r>
-        <w:rPr>
-          <w:rFonts w:ascii="Times New Roman CYR" w:hAnsi="Times New Roman CYR" w:cs="Times New Roman CYR"/>
-          <w:szCs w:val="24"/>
-          <w:lang w:val="uk-UA" w:eastAsia="en-US"/>
-        </w:rPr>
-        <w:t>набір обмежень його льотних характеристик, таких як максимальна</w:t>
-      </w:r>
-      <w:r>
-        <w:rPr>
-          <w:rFonts w:ascii="Times New Roman CYR" w:hAnsi="Times New Roman CYR" w:cs="Times New Roman CYR"/>
-          <w:szCs w:val="24"/>
-          <w:lang w:val="uk-UA" w:eastAsia="en-US"/>
-        </w:rPr>
-        <w:t>, мінімальна</w:t>
-      </w:r>
-      <w:r>
-        <w:rPr>
-          <w:rFonts w:ascii="Times New Roman CYR" w:hAnsi="Times New Roman CYR" w:cs="Times New Roman CYR"/>
-          <w:szCs w:val="24"/>
-          <w:lang w:val="uk-UA" w:eastAsia="en-US"/>
-        </w:rPr>
-        <w:t xml:space="preserve"> швидкість</w:t>
+        <w:t xml:space="preserve">Метою роботи є </w:t>
+      </w:r>
+      <w:r>
+        <w:rPr>
+          <w:rFonts w:ascii="Times New Roman CYR" w:hAnsi="Times New Roman CYR" w:cs="Times New Roman CYR"/>
+          <w:szCs w:val="24"/>
+          <w:highlight w:val="yellow"/>
+          <w:lang w:val="uk-UA" w:eastAsia="en-US"/>
+        </w:rPr>
+        <w:t>постановка завдання</w:t>
+      </w:r>
+      <w:r>
+        <w:rPr>
+          <w:rFonts w:ascii="Times New Roman CYR" w:hAnsi="Times New Roman CYR" w:cs="Times New Roman CYR"/>
+          <w:szCs w:val="24"/>
+          <w:lang w:val="uk-UA" w:eastAsia="en-US"/>
+        </w:rPr>
+        <w:t xml:space="preserve"> </w:t>
+      </w:r>
+      <w:r>
+        <w:rPr>
+          <w:rFonts w:ascii="Times New Roman CYR" w:hAnsi="Times New Roman CYR" w:cs="Times New Roman CYR"/>
+          <w:szCs w:val="24"/>
+          <w:lang w:val="uk-UA" w:eastAsia="en-US"/>
+        </w:rPr>
+        <w:t>пошуку</w:t>
+      </w:r>
+      <w:r>
+        <w:rPr>
+          <w:rFonts w:ascii="Times New Roman CYR" w:hAnsi="Times New Roman CYR" w:cs="Times New Roman CYR"/>
+          <w:szCs w:val="24"/>
+          <w:lang w:val="uk-UA" w:eastAsia="en-US"/>
+        </w:rPr>
+        <w:t xml:space="preserve"> множини </w:t>
+      </w:r>
+      <w:proofErr w:type="spellStart"/>
+      <w:r>
+        <w:rPr>
+          <w:rFonts w:ascii="Times New Roman CYR" w:hAnsi="Times New Roman CYR" w:cs="Times New Roman CYR"/>
+          <w:szCs w:val="24"/>
+          <w:lang w:val="uk-UA" w:eastAsia="en-US"/>
+        </w:rPr>
+        <w:t>Парето</w:t>
+      </w:r>
+      <w:proofErr w:type="spellEnd"/>
+      <w:r>
+        <w:rPr>
+          <w:rFonts w:ascii="Times New Roman CYR" w:hAnsi="Times New Roman CYR" w:cs="Times New Roman CYR"/>
+          <w:szCs w:val="24"/>
+          <w:lang w:val="uk-UA" w:eastAsia="en-US"/>
+        </w:rPr>
+        <w:t>-оптимальних</w:t>
+      </w:r>
+      <w:r>
+        <w:rPr>
+          <w:rFonts w:ascii="Times New Roman CYR" w:hAnsi="Times New Roman CYR" w:cs="Times New Roman CYR"/>
+          <w:szCs w:val="24"/>
+          <w:lang w:val="uk-UA" w:eastAsia="en-US"/>
+        </w:rPr>
+        <w:t xml:space="preserve"> </w:t>
+      </w:r>
+      <w:r>
+        <w:rPr>
+          <w:rFonts w:ascii="Times New Roman CYR" w:hAnsi="Times New Roman CYR" w:cs="Times New Roman CYR"/>
+          <w:szCs w:val="24"/>
+          <w:lang w:val="uk-UA" w:eastAsia="en-US"/>
+        </w:rPr>
+        <w:t>маршрутів для</w:t>
+      </w:r>
+      <w:r>
+        <w:rPr>
+          <w:rFonts w:ascii="Times New Roman CYR" w:hAnsi="Times New Roman CYR" w:cs="Times New Roman CYR"/>
+          <w:szCs w:val="24"/>
+          <w:lang w:val="uk-UA" w:eastAsia="en-US"/>
+        </w:rPr>
+        <w:t xml:space="preserve"> БПС в складі </w:t>
+      </w:r>
+      <w:proofErr w:type="spellStart"/>
+      <w:r>
+        <w:rPr>
+          <w:rFonts w:ascii="Times New Roman CYR" w:hAnsi="Times New Roman CYR" w:cs="Times New Roman CYR"/>
+          <w:szCs w:val="24"/>
+          <w:lang w:val="uk-UA" w:eastAsia="en-US"/>
+        </w:rPr>
+        <w:t>БпАК</w:t>
+      </w:r>
+      <w:proofErr w:type="spellEnd"/>
+      <w:r>
+        <w:rPr>
+          <w:rFonts w:ascii="Times New Roman CYR" w:hAnsi="Times New Roman CYR" w:cs="Times New Roman CYR"/>
+          <w:szCs w:val="24"/>
+          <w:lang w:val="uk-UA" w:eastAsia="en-US"/>
+        </w:rPr>
+        <w:t xml:space="preserve"> на основі різнорідних даних</w:t>
+      </w:r>
+      <w:r>
+        <w:rPr>
+          <w:rFonts w:ascii="Times New Roman CYR" w:hAnsi="Times New Roman CYR" w:cs="Times New Roman CYR"/>
+          <w:szCs w:val="24"/>
+          <w:lang w:val="uk-UA" w:eastAsia="en-US"/>
+        </w:rPr>
+        <w:t xml:space="preserve"> для виконання завдань в несприятливих умовах</w:t>
       </w:r>
       <w:r>
         <w:rPr>
@@ -3405,15 +3480,23 @@
           <w:szCs w:val="24"/>
           <w:lang w:val="uk-UA" w:eastAsia="en-US"/>
         </w:rPr>
-        <w:t xml:space="preserve">висота </w:t>
-      </w:r>
-      <w:r>
-        <w:rPr>
-          <w:rFonts w:ascii="Times New Roman CYR" w:hAnsi="Times New Roman CYR" w:cs="Times New Roman CYR"/>
-          <w:szCs w:val="24"/>
-          <w:lang w:val="uk-UA" w:eastAsia="en-US"/>
-        </w:rPr>
-        <w:t>польоту.</w:t>
+        <w:t>розробка</w:t>
+      </w:r>
+      <w:r>
+        <w:rPr>
+          <w:rFonts w:ascii="Times New Roman CYR" w:hAnsi="Times New Roman CYR" w:cs="Times New Roman CYR"/>
+          <w:szCs w:val="24"/>
+          <w:lang w:val="uk-UA" w:eastAsia="en-US"/>
+        </w:rPr>
+        <w:t xml:space="preserve"> підходу до його вирішення</w:t>
+      </w:r>
+      <w:r>
+        <w:rPr>
+          <w:rFonts w:ascii="Times New Roman CYR" w:hAnsi="Times New Roman CYR" w:cs="Times New Roman CYR"/>
+          <w:szCs w:val="24"/>
+          <w:lang w:val="uk-UA" w:eastAsia="en-US"/>
+        </w:rPr>
+        <w:t>.</w:t>
       </w:r>
     </w:p>
     <w:p>
@@ -3430,10 +3513,2119 @@
       <w:r>
         <w:rPr>
           <w:rFonts w:ascii="Times New Roman CYR" w:hAnsi="Times New Roman CYR" w:cs="Times New Roman CYR"/>
-          <w:szCs w:val="24"/>
-          <w:lang w:val="uk-UA" w:eastAsia="en-US"/>
-        </w:rPr>
-        <w:t>Наведемо формалізований запис завдання планування маршруту руху. Маршрут являє собою шлях</w:t>
+          <w:b/>
+          <w:bCs/>
+          <w:szCs w:val="24"/>
+          <w:lang w:val="uk-UA" w:eastAsia="en-US"/>
+        </w:rPr>
+        <w:t>Постановка задачі</w:t>
+      </w:r>
+      <w:r>
+        <w:rPr>
+          <w:rFonts w:ascii="Times New Roman CYR" w:hAnsi="Times New Roman CYR" w:cs="Times New Roman CYR"/>
+          <w:szCs w:val="24"/>
+          <w:lang w:val="uk-UA" w:eastAsia="en-US"/>
+        </w:rPr>
+        <w:t>.</w:t>
+      </w:r>
+      <w:r>
+        <w:rPr>
+          <w:rFonts w:ascii="Times New Roman CYR" w:hAnsi="Times New Roman CYR" w:cs="Times New Roman CYR"/>
+          <w:szCs w:val="24"/>
+          <w:lang w:val="uk-UA" w:eastAsia="en-US"/>
+        </w:rPr>
+        <w:t xml:space="preserve"> </w:t>
+      </w:r>
+      <w:r>
+        <w:rPr>
+          <w:rFonts w:ascii="Times New Roman CYR" w:hAnsi="Times New Roman CYR" w:cs="Times New Roman CYR"/>
+          <w:szCs w:val="24"/>
+          <w:lang w:val="uk-UA" w:eastAsia="en-US"/>
+        </w:rPr>
+        <w:t xml:space="preserve">У роботі розглядається планування маршруту для виконання </w:t>
+      </w:r>
+      <w:r>
+        <w:rPr>
+          <w:rFonts w:ascii="Times New Roman CYR" w:hAnsi="Times New Roman CYR" w:cs="Times New Roman CYR"/>
+          <w:szCs w:val="24"/>
+          <w:lang w:val="uk-UA" w:eastAsia="en-US"/>
+        </w:rPr>
+        <w:t xml:space="preserve">завдання </w:t>
+      </w:r>
+      <w:r>
+        <w:rPr>
+          <w:rFonts w:ascii="Times New Roman CYR" w:hAnsi="Times New Roman CYR" w:cs="Times New Roman CYR"/>
+          <w:szCs w:val="24"/>
+          <w:lang w:val="uk-UA" w:eastAsia="en-US"/>
+        </w:rPr>
+        <w:t>переміщення</w:t>
+      </w:r>
+      <w:r>
+        <w:rPr>
+          <w:rFonts w:ascii="Times New Roman CYR" w:hAnsi="Times New Roman CYR" w:cs="Times New Roman CYR"/>
+          <w:szCs w:val="24"/>
+          <w:lang w:val="uk-UA" w:eastAsia="en-US"/>
+        </w:rPr>
+        <w:t xml:space="preserve"> БПС в складі </w:t>
+      </w:r>
+      <w:proofErr w:type="spellStart"/>
+      <w:r>
+        <w:rPr>
+          <w:rFonts w:ascii="Times New Roman CYR" w:hAnsi="Times New Roman CYR" w:cs="Times New Roman CYR"/>
+          <w:szCs w:val="24"/>
+          <w:lang w:val="uk-UA" w:eastAsia="en-US"/>
+        </w:rPr>
+        <w:t>БпАК</w:t>
+      </w:r>
+      <w:proofErr w:type="spellEnd"/>
+      <w:r>
+        <w:rPr>
+          <w:rFonts w:ascii="Times New Roman CYR" w:hAnsi="Times New Roman CYR" w:cs="Times New Roman CYR"/>
+          <w:szCs w:val="24"/>
+          <w:lang w:val="uk-UA" w:eastAsia="en-US"/>
+        </w:rPr>
+        <w:t xml:space="preserve"> з початкової точки в точку призначення з виконанням точної посадки</w:t>
+      </w:r>
+      <w:r>
+        <w:rPr>
+          <w:rFonts w:ascii="Times New Roman CYR" w:hAnsi="Times New Roman CYR" w:cs="Times New Roman CYR"/>
+          <w:szCs w:val="24"/>
+          <w:lang w:val="uk-UA" w:eastAsia="en-US"/>
+        </w:rPr>
+        <w:t xml:space="preserve"> в несприятливих умовах</w:t>
+      </w:r>
+      <w:r>
+        <w:rPr>
+          <w:rFonts w:ascii="Times New Roman CYR" w:hAnsi="Times New Roman CYR" w:cs="Times New Roman CYR"/>
+          <w:szCs w:val="24"/>
+          <w:lang w:val="uk-UA" w:eastAsia="en-US"/>
+        </w:rPr>
+        <w:t xml:space="preserve">. </w:t>
+      </w:r>
+      <w:r>
+        <w:rPr>
+          <w:rFonts w:ascii="Times New Roman CYR" w:hAnsi="Times New Roman CYR" w:cs="Times New Roman CYR"/>
+          <w:szCs w:val="24"/>
+          <w:lang w:val="uk-UA" w:eastAsia="en-US"/>
+        </w:rPr>
+        <w:t xml:space="preserve">Через </w:t>
+      </w:r>
+      <w:r>
+        <w:rPr>
+          <w:rFonts w:ascii="Times New Roman CYR" w:hAnsi="Times New Roman CYR" w:cs="Times New Roman CYR"/>
+          <w:szCs w:val="24"/>
+          <w:lang w:val="uk-UA" w:eastAsia="en-US"/>
+        </w:rPr>
+        <w:t>високу ймовірність недоступності</w:t>
+      </w:r>
+      <w:r>
+        <w:rPr>
+          <w:rFonts w:ascii="Times New Roman CYR" w:hAnsi="Times New Roman CYR" w:cs="Times New Roman CYR"/>
+          <w:szCs w:val="24"/>
+          <w:lang w:val="uk-UA" w:eastAsia="en-US"/>
+        </w:rPr>
+        <w:t xml:space="preserve"> або некоректн</w:t>
+      </w:r>
+      <w:r>
+        <w:rPr>
+          <w:rFonts w:ascii="Times New Roman CYR" w:hAnsi="Times New Roman CYR" w:cs="Times New Roman CYR"/>
+          <w:szCs w:val="24"/>
+          <w:lang w:val="uk-UA" w:eastAsia="en-US"/>
+        </w:rPr>
+        <w:t>ості</w:t>
+      </w:r>
+      <w:r>
+        <w:rPr>
+          <w:rFonts w:ascii="Times New Roman CYR" w:hAnsi="Times New Roman CYR" w:cs="Times New Roman CYR"/>
+          <w:szCs w:val="24"/>
+          <w:lang w:val="uk-UA" w:eastAsia="en-US"/>
+        </w:rPr>
+        <w:t xml:space="preserve"> роботи ГНСС</w:t>
+      </w:r>
+      <w:r>
+        <w:rPr>
+          <w:rFonts w:ascii="Times New Roman CYR" w:hAnsi="Times New Roman CYR" w:cs="Times New Roman CYR"/>
+          <w:szCs w:val="24"/>
+          <w:lang w:val="uk-UA" w:eastAsia="en-US"/>
+        </w:rPr>
+        <w:t xml:space="preserve"> </w:t>
+      </w:r>
+      <w:r>
+        <w:rPr>
+          <w:rFonts w:ascii="Times New Roman CYR" w:hAnsi="Times New Roman CYR" w:cs="Times New Roman CYR"/>
+          <w:szCs w:val="24"/>
+          <w:lang w:val="uk-UA" w:eastAsia="en-US"/>
+        </w:rPr>
+        <w:t xml:space="preserve">в зоні виконання завдань для визначення місцезнаходження БПС </w:t>
+      </w:r>
+      <w:r>
+        <w:rPr>
+          <w:rFonts w:ascii="Times New Roman CYR" w:hAnsi="Times New Roman CYR" w:cs="Times New Roman CYR"/>
+          <w:szCs w:val="24"/>
+          <w:lang w:val="uk-UA" w:eastAsia="en-US"/>
+        </w:rPr>
+        <w:t>застосовується гібридний підхід, який поєднує візуальну</w:t>
+      </w:r>
+      <w:r>
+        <w:rPr>
+          <w:rFonts w:ascii="Times New Roman CYR" w:hAnsi="Times New Roman CYR" w:cs="Times New Roman CYR"/>
+          <w:szCs w:val="24"/>
+          <w:lang w:val="uk-UA" w:eastAsia="en-US"/>
+        </w:rPr>
+        <w:t xml:space="preserve"> та рельєфну</w:t>
+      </w:r>
+      <w:r>
+        <w:rPr>
+          <w:rFonts w:ascii="Times New Roman CYR" w:hAnsi="Times New Roman CYR" w:cs="Times New Roman CYR"/>
+          <w:szCs w:val="24"/>
+          <w:lang w:val="uk-UA" w:eastAsia="en-US"/>
+        </w:rPr>
+        <w:t xml:space="preserve"> навігацію </w:t>
+      </w:r>
+      <w:r>
+        <w:rPr>
+          <w:rFonts w:ascii="Times New Roman CYR" w:hAnsi="Times New Roman CYR" w:cs="Times New Roman CYR"/>
+          <w:szCs w:val="24"/>
+          <w:lang w:val="uk-UA" w:eastAsia="en-US"/>
+        </w:rPr>
+        <w:t>в поєднанні</w:t>
+      </w:r>
+      <w:r>
+        <w:rPr>
+          <w:rFonts w:ascii="Times New Roman CYR" w:hAnsi="Times New Roman CYR" w:cs="Times New Roman CYR"/>
+          <w:szCs w:val="24"/>
+          <w:lang w:val="uk-UA" w:eastAsia="en-US"/>
+        </w:rPr>
+        <w:t xml:space="preserve"> з методом числення координат.</w:t>
+      </w:r>
+      <w:r>
+        <w:rPr>
+          <w:rFonts w:ascii="Times New Roman CYR" w:hAnsi="Times New Roman CYR" w:cs="Times New Roman CYR"/>
+          <w:szCs w:val="24"/>
+          <w:lang w:val="uk-UA"/>
+        </w:rPr>
+        <w:t xml:space="preserve"> </w:t>
+      </w:r>
+      <w:r>
+        <w:rPr>
+          <w:rFonts w:ascii="Times New Roman CYR" w:hAnsi="Times New Roman CYR" w:cs="Times New Roman CYR"/>
+          <w:szCs w:val="24"/>
+          <w:lang w:val="uk-UA"/>
+        </w:rPr>
+        <w:t xml:space="preserve">Вимоги до планування маршруту руху БПС в несприятливих умовах визначаються необхідністю оперативного виконання завдань для збереження життя та здоров’я людей, мінімізації втрат матеріальних ресурсів. </w:t>
+      </w:r>
+      <w:r>
+        <w:rPr>
+          <w:rFonts w:ascii="Times New Roman CYR" w:hAnsi="Times New Roman CYR" w:cs="Times New Roman CYR"/>
+          <w:szCs w:val="24"/>
+          <w:lang w:val="uk-UA"/>
+        </w:rPr>
+        <w:t>Тому результатом планування БПС має бути такий маршрут, який першочергово забезпечує мінімальний час виконання польот</w:t>
+      </w:r>
+      <w:r>
+        <w:rPr>
+          <w:rFonts w:ascii="Times New Roman CYR" w:hAnsi="Times New Roman CYR" w:cs="Times New Roman CYR"/>
+          <w:szCs w:val="24"/>
+          <w:lang w:val="uk-UA"/>
+        </w:rPr>
+        <w:t xml:space="preserve">у. </w:t>
+      </w:r>
+      <w:r>
+        <w:rPr>
+          <w:rFonts w:ascii="Times New Roman CYR" w:hAnsi="Times New Roman CYR" w:cs="Times New Roman CYR"/>
+          <w:szCs w:val="24"/>
+          <w:lang w:val="uk-UA"/>
+        </w:rPr>
+        <w:t xml:space="preserve">Однак, зважаючи на те, що визначення місцезнаходження БПС ускладнене </w:t>
+      </w:r>
+      <w:r>
+        <w:rPr>
+          <w:rFonts w:ascii="Times New Roman CYR" w:hAnsi="Times New Roman CYR" w:cs="Times New Roman CYR"/>
+          <w:szCs w:val="24"/>
+          <w:lang w:val="uk-UA"/>
+        </w:rPr>
+        <w:t xml:space="preserve">несприятливими умовами, важливим аспектом є </w:t>
+      </w:r>
+      <w:r>
+        <w:rPr>
+          <w:rFonts w:ascii="Times New Roman CYR" w:hAnsi="Times New Roman CYR" w:cs="Times New Roman CYR"/>
+          <w:szCs w:val="24"/>
+          <w:lang w:val="uk-UA"/>
+        </w:rPr>
+        <w:t xml:space="preserve">придатність запланованого маршруту для застосування </w:t>
+      </w:r>
+      <w:r>
+        <w:rPr>
+          <w:rFonts w:ascii="Times New Roman CYR" w:hAnsi="Times New Roman CYR" w:cs="Times New Roman CYR"/>
+          <w:szCs w:val="24"/>
+          <w:lang w:val="uk-UA"/>
+        </w:rPr>
+        <w:t>візуальної та рельєфної навігації</w:t>
+      </w:r>
+      <w:r>
+        <w:rPr>
+          <w:rFonts w:ascii="Times New Roman CYR" w:hAnsi="Times New Roman CYR" w:cs="Times New Roman CYR"/>
+          <w:szCs w:val="24"/>
+          <w:lang w:val="uk-UA"/>
+        </w:rPr>
+        <w:t>. Від того наскільки багатою на візуальні</w:t>
+      </w:r>
+      <w:r>
+        <w:rPr>
+          <w:rFonts w:ascii="Times New Roman CYR" w:hAnsi="Times New Roman CYR" w:cs="Times New Roman CYR"/>
+          <w:szCs w:val="24"/>
+          <w:lang w:val="uk-UA"/>
+        </w:rPr>
+        <w:t xml:space="preserve"> та рельєфні</w:t>
+      </w:r>
+      <w:r>
+        <w:rPr>
+          <w:rFonts w:ascii="Times New Roman CYR" w:hAnsi="Times New Roman CYR" w:cs="Times New Roman CYR"/>
+          <w:szCs w:val="24"/>
+          <w:lang w:val="uk-UA"/>
+        </w:rPr>
+        <w:t xml:space="preserve"> особливості є поверхня над якою проходить маршрут залежить точність визначення місцезнаходження під час польоту, відповідно, точність</w:t>
+      </w:r>
+      <w:r>
+        <w:rPr>
+          <w:rFonts w:ascii="Times New Roman CYR" w:hAnsi="Times New Roman CYR" w:cs="Times New Roman CYR"/>
+          <w:szCs w:val="24"/>
+          <w:lang w:val="uk-UA"/>
+        </w:rPr>
+        <w:t xml:space="preserve"> та швидкість</w:t>
+      </w:r>
+      <w:r>
+        <w:rPr>
+          <w:rFonts w:ascii="Times New Roman CYR" w:hAnsi="Times New Roman CYR" w:cs="Times New Roman CYR"/>
+          <w:szCs w:val="24"/>
+          <w:lang w:val="uk-UA"/>
+        </w:rPr>
+        <w:t xml:space="preserve"> вик</w:t>
+      </w:r>
+      <w:r>
+        <w:rPr>
+          <w:rFonts w:ascii="Times New Roman CYR" w:hAnsi="Times New Roman CYR" w:cs="Times New Roman CYR"/>
+          <w:szCs w:val="24"/>
+          <w:lang w:val="uk-UA"/>
+        </w:rPr>
+        <w:t>онання поставленого завдання.</w:t>
+      </w:r>
+      <w:r>
+        <w:rPr>
+          <w:rFonts w:ascii="Times New Roman CYR" w:hAnsi="Times New Roman CYR" w:cs="Times New Roman CYR"/>
+          <w:szCs w:val="24"/>
+          <w:lang w:val="en-US"/>
+        </w:rPr>
+        <w:t xml:space="preserve"> </w:t>
+      </w:r>
+      <w:r>
+        <w:rPr>
+          <w:rFonts w:ascii="Times New Roman CYR" w:hAnsi="Times New Roman CYR" w:cs="Times New Roman CYR"/>
+          <w:szCs w:val="24"/>
+          <w:lang w:val="uk-UA"/>
+        </w:rPr>
+        <w:t>Отже</w:t>
+      </w:r>
+      <w:r>
+        <w:rPr>
+          <w:rFonts w:ascii="Times New Roman CYR" w:hAnsi="Times New Roman CYR" w:cs="Times New Roman CYR"/>
+          <w:szCs w:val="24"/>
+          <w:lang w:val="uk-UA"/>
+        </w:rPr>
+        <w:t>,</w:t>
+      </w:r>
+      <w:r>
+        <w:rPr>
+          <w:rFonts w:ascii="Times New Roman CYR" w:hAnsi="Times New Roman CYR" w:cs="Times New Roman CYR"/>
+          <w:szCs w:val="24"/>
+          <w:lang w:val="uk-UA"/>
+        </w:rPr>
+        <w:t xml:space="preserve"> маршрут отриманий в результаті планування має мінімізувати час виконання польоту</w:t>
+      </w:r>
+      <w:r>
+        <w:rPr>
+          <w:rFonts w:ascii="Times New Roman CYR" w:hAnsi="Times New Roman CYR" w:cs="Times New Roman CYR"/>
+          <w:szCs w:val="24"/>
+          <w:lang w:val="uk-UA"/>
+        </w:rPr>
+        <w:t xml:space="preserve"> з початкової точки в кінцеву та забезпечувати належну </w:t>
+      </w:r>
+      <w:r>
+        <w:rPr>
+          <w:rFonts w:ascii="Times New Roman CYR" w:hAnsi="Times New Roman CYR" w:cs="Times New Roman CYR"/>
+          <w:szCs w:val="24"/>
+          <w:lang w:val="uk-UA"/>
+        </w:rPr>
+        <w:t>навігаційну якість</w:t>
+      </w:r>
+      <w:r>
+        <w:rPr>
+          <w:rFonts w:ascii="Times New Roman CYR" w:hAnsi="Times New Roman CYR" w:cs="Times New Roman CYR"/>
+          <w:szCs w:val="24"/>
+          <w:lang w:val="uk-UA"/>
+        </w:rPr>
+        <w:t xml:space="preserve"> </w:t>
+      </w:r>
+      <w:r>
+        <w:rPr>
+          <w:rFonts w:ascii="Times New Roman CYR" w:hAnsi="Times New Roman CYR" w:cs="Times New Roman CYR"/>
+          <w:szCs w:val="24"/>
+          <w:lang w:val="uk-UA"/>
+        </w:rPr>
+        <w:t>місцевості для визначення місцезнаходження під час польоту.</w:t>
+      </w:r>
+    </w:p>
+    <w:p>
+      <w:pPr>
+        <w:pStyle w:val="BodyTextIndent"/>
+        <w:ind w:firstLine="567"/>
+        <w:jc w:val="both"/>
+        <w:rPr>
+          <w:rFonts w:ascii="Times New Roman CYR" w:hAnsi="Times New Roman CYR" w:cs="Times New Roman CYR"/>
+          <w:szCs w:val="24"/>
+          <w:lang w:val="uk-UA" w:eastAsia="en-US"/>
+        </w:rPr>
+      </w:pPr>
+      <w:r>
+        <w:rPr>
+          <w:rFonts w:ascii="Times New Roman CYR" w:hAnsi="Times New Roman CYR" w:cs="Times New Roman CYR"/>
+          <w:b/>
+          <w:bCs/>
+          <w:szCs w:val="24"/>
+          <w:lang w:val="uk-UA" w:eastAsia="en-US"/>
+        </w:rPr>
+        <w:t>Вирішення проблеми</w:t>
+      </w:r>
+      <w:r>
+        <w:rPr>
+          <w:rFonts w:ascii="Times New Roman CYR" w:hAnsi="Times New Roman CYR" w:cs="Times New Roman CYR"/>
+          <w:szCs w:val="24"/>
+          <w:lang w:val="uk-UA" w:eastAsia="en-US"/>
+        </w:rPr>
+        <w:t xml:space="preserve">. </w:t>
+      </w:r>
+      <w:r>
+        <w:rPr>
+          <w:rFonts w:ascii="Times New Roman CYR" w:hAnsi="Times New Roman CYR" w:cs="Times New Roman CYR"/>
+          <w:szCs w:val="24"/>
+          <w:lang w:val="uk-UA" w:eastAsia="en-US"/>
+        </w:rPr>
+        <w:t>Традиційно завдання планування маршруту  зводиться до пошуку найкоротшого або найшвидшого шля</w:t>
+      </w:r>
+      <w:r>
+        <w:rPr>
+          <w:rFonts w:ascii="Times New Roman CYR" w:hAnsi="Times New Roman CYR" w:cs="Times New Roman CYR"/>
+          <w:szCs w:val="24"/>
+          <w:lang w:val="uk-UA" w:eastAsia="en-US"/>
+        </w:rPr>
+        <w:t>ху між початковою та кінцевою точкою. Однак таке формулювання є недостатнім для виконання завдань в несприятливих умовах</w:t>
+      </w:r>
+      <w:r>
+        <w:rPr>
+          <w:rFonts w:ascii="Times New Roman CYR" w:hAnsi="Times New Roman CYR" w:cs="Times New Roman CYR"/>
+          <w:szCs w:val="24"/>
+          <w:lang w:val="uk-UA" w:eastAsia="en-US"/>
+        </w:rPr>
+        <w:t xml:space="preserve"> через необхідність забезпечення </w:t>
+      </w:r>
+      <w:r>
+        <w:rPr>
+          <w:rFonts w:ascii="Times New Roman CYR" w:hAnsi="Times New Roman CYR" w:cs="Times New Roman CYR"/>
+          <w:szCs w:val="24"/>
+          <w:lang w:val="uk-UA" w:eastAsia="en-US"/>
+        </w:rPr>
+        <w:t xml:space="preserve">можливості дотримання визначеного маршруту </w:t>
+      </w:r>
+      <w:r>
+        <w:rPr>
+          <w:rFonts w:ascii="Times New Roman CYR" w:hAnsi="Times New Roman CYR" w:cs="Times New Roman CYR"/>
+          <w:szCs w:val="24"/>
+          <w:lang w:val="uk-UA" w:eastAsia="en-US"/>
+        </w:rPr>
+        <w:t>у разі недоступності ГНСС</w:t>
+      </w:r>
+      <w:r>
+        <w:rPr>
+          <w:rFonts w:ascii="Times New Roman CYR" w:hAnsi="Times New Roman CYR" w:cs="Times New Roman CYR"/>
+          <w:szCs w:val="24"/>
+          <w:lang w:val="uk-UA" w:eastAsia="en-US"/>
+        </w:rPr>
+        <w:t>.</w:t>
+      </w:r>
+      <w:r>
+        <w:rPr>
+          <w:rFonts w:ascii="Times New Roman CYR" w:hAnsi="Times New Roman CYR" w:cs="Times New Roman CYR"/>
+          <w:szCs w:val="24"/>
+          <w:lang w:val="uk-UA" w:eastAsia="en-US"/>
+        </w:rPr>
+        <w:t xml:space="preserve"> </w:t>
+      </w:r>
+      <w:r>
+        <w:rPr>
+          <w:rFonts w:ascii="Times New Roman CYR" w:hAnsi="Times New Roman CYR" w:cs="Times New Roman CYR"/>
+          <w:szCs w:val="24"/>
+          <w:lang w:val="uk-UA" w:eastAsia="en-US"/>
+        </w:rPr>
+        <w:t xml:space="preserve">Для цього маршрут повинен проходити через ділянки придатні для ефективного застосування візуальної та рельєфної навігації, враховувати </w:t>
+      </w:r>
+      <w:r>
+        <w:rPr>
+          <w:rFonts w:ascii="Times New Roman CYR" w:hAnsi="Times New Roman CYR" w:cs="Times New Roman CYR"/>
+          <w:szCs w:val="24"/>
+          <w:lang w:val="uk-UA" w:eastAsia="en-US"/>
+        </w:rPr>
+        <w:t xml:space="preserve">зони погіршеної видимості та зони, де політ заборонено. </w:t>
+      </w:r>
+    </w:p>
+    <w:p>
+      <w:pPr>
+        <w:pStyle w:val="BodyTextIndent"/>
+        <w:ind w:firstLine="567"/>
+        <w:jc w:val="both"/>
+        <w:rPr>
+          <w:rFonts w:ascii="Times New Roman CYR" w:hAnsi="Times New Roman CYR" w:cs="Times New Roman CYR"/>
+          <w:szCs w:val="24"/>
+          <w:lang w:val="uk-UA" w:eastAsia="en-US"/>
+        </w:rPr>
+      </w:pPr>
+      <w:r>
+        <w:rPr>
+          <w:rFonts w:ascii="Times New Roman CYR" w:hAnsi="Times New Roman CYR" w:cs="Times New Roman CYR"/>
+          <w:szCs w:val="24"/>
+          <w:lang w:val="uk-UA" w:eastAsia="en-US"/>
+        </w:rPr>
+        <w:t xml:space="preserve">Зазначені вимоги формують взаємно суперечливі критерії. Маршрут з мінімальною тривалістю польоту з великою ймовірністю може проходити над місцевістю з недостатньою кількістю візуальних та рельєфних ознак, що погіршує якість визначення місцезнаходження БПС. </w:t>
+      </w:r>
+      <w:r>
+        <w:rPr>
+          <w:rFonts w:ascii="Times New Roman CYR" w:hAnsi="Times New Roman CYR" w:cs="Times New Roman CYR"/>
+          <w:szCs w:val="24"/>
+          <w:lang w:val="uk-UA" w:eastAsia="en-US"/>
+        </w:rPr>
+        <w:t xml:space="preserve">Натомість, маршрут з сприятливий для використання візуальної та рельєфної навігації може мати більшу довжину та вимагати більше енергії на його виконання. </w:t>
+      </w:r>
+      <w:r>
+        <w:rPr>
+          <w:rFonts w:ascii="Times New Roman CYR" w:hAnsi="Times New Roman CYR" w:cs="Times New Roman CYR"/>
+          <w:szCs w:val="24"/>
+          <w:lang w:val="uk-UA" w:eastAsia="en-US"/>
+        </w:rPr>
+        <w:t>Зважаючи на це, придатність маршруту для виконання завдання не може бути оцінена лише за одним із показників.</w:t>
+      </w:r>
+      <w:r>
+        <w:rPr>
+          <w:rFonts w:ascii="Times New Roman CYR" w:hAnsi="Times New Roman CYR" w:cs="Times New Roman CYR"/>
+          <w:szCs w:val="24"/>
+          <w:lang w:val="uk-UA" w:eastAsia="en-US"/>
+        </w:rPr>
+        <w:t xml:space="preserve"> </w:t>
+      </w:r>
+      <w:r>
+        <w:rPr>
+          <w:rFonts w:ascii="Times New Roman CYR" w:hAnsi="Times New Roman CYR" w:cs="Times New Roman CYR"/>
+          <w:szCs w:val="24"/>
+          <w:lang w:val="uk-UA" w:eastAsia="en-US"/>
+        </w:rPr>
+        <w:t xml:space="preserve">Тому планування маршруту доцільно розглядати як задачу багатокритеріальної оптимізації рішенням якої є множина </w:t>
+      </w:r>
+      <w:proofErr w:type="spellStart"/>
+      <w:r>
+        <w:rPr>
+          <w:rFonts w:ascii="Times New Roman CYR" w:hAnsi="Times New Roman CYR" w:cs="Times New Roman CYR"/>
+          <w:szCs w:val="24"/>
+          <w:lang w:val="uk-UA" w:eastAsia="en-US"/>
+        </w:rPr>
+        <w:t>Паре</w:t>
+      </w:r>
+      <w:r>
+        <w:rPr>
+          <w:rFonts w:ascii="Times New Roman CYR" w:hAnsi="Times New Roman CYR" w:cs="Times New Roman CYR"/>
+          <w:szCs w:val="24"/>
+          <w:lang w:val="uk-UA" w:eastAsia="en-US"/>
+        </w:rPr>
+        <w:t>то</w:t>
+      </w:r>
+      <w:proofErr w:type="spellEnd"/>
+      <w:r>
+        <w:rPr>
+          <w:rFonts w:ascii="Times New Roman CYR" w:hAnsi="Times New Roman CYR" w:cs="Times New Roman CYR"/>
+          <w:szCs w:val="24"/>
+          <w:lang w:val="uk-UA" w:eastAsia="en-US"/>
+        </w:rPr>
+        <w:t xml:space="preserve">-оптимальних маршрутів. Таким чином остаточний маршрут може бути вибраний з результуючої множини відповідно до поточних умов виконання завдання. </w:t>
+      </w:r>
+    </w:p>
+    <w:p>
+      <w:pPr>
+        <w:pStyle w:val="BodyTextIndent"/>
+        <w:ind w:firstLine="567"/>
+        <w:jc w:val="both"/>
+        <w:rPr>
+          <w:rFonts w:ascii="Times New Roman CYR" w:hAnsi="Times New Roman CYR" w:cs="Times New Roman CYR"/>
+          <w:szCs w:val="24"/>
+          <w:lang w:val="uk-UA" w:eastAsia="en-US"/>
+        </w:rPr>
+      </w:pPr>
+      <w:r>
+        <w:rPr>
+          <w:rFonts w:ascii="Times New Roman CYR" w:hAnsi="Times New Roman CYR" w:cs="Times New Roman CYR"/>
+          <w:szCs w:val="24"/>
+          <w:highlight w:val="yellow"/>
+          <w:lang w:val="uk-UA" w:eastAsia="en-US"/>
+        </w:rPr>
+        <w:t xml:space="preserve">Згорткові методи дозволяють звести задачу до однокритеріальної, однак </w:t>
+      </w:r>
+      <w:r>
+        <w:rPr>
+          <w:rFonts w:ascii="Times New Roman CYR" w:hAnsi="Times New Roman CYR" w:cs="Times New Roman CYR"/>
+          <w:szCs w:val="24"/>
+          <w:highlight w:val="yellow"/>
+          <w:lang w:val="uk-UA" w:eastAsia="en-US"/>
+        </w:rPr>
+        <w:t xml:space="preserve">вони вимагають попереднього </w:t>
+      </w:r>
+      <w:r>
+        <w:rPr>
+          <w:rFonts w:ascii="Times New Roman CYR" w:hAnsi="Times New Roman CYR" w:cs="Times New Roman CYR"/>
+          <w:szCs w:val="24"/>
+          <w:highlight w:val="yellow"/>
+          <w:lang w:val="uk-UA" w:eastAsia="en-US"/>
+        </w:rPr>
+        <w:t>визначення вагових коефіці</w:t>
+      </w:r>
+      <w:r>
+        <w:rPr>
+          <w:rFonts w:ascii="Times New Roman CYR" w:hAnsi="Times New Roman CYR" w:cs="Times New Roman CYR"/>
+          <w:szCs w:val="24"/>
+          <w:highlight w:val="yellow"/>
+          <w:lang w:val="uk-UA" w:eastAsia="en-US"/>
+        </w:rPr>
+        <w:t xml:space="preserve">єнтів, що залежить від суб’єктивних оцінок та умов завдання. </w:t>
+      </w:r>
+      <w:r>
+        <w:rPr>
+          <w:rFonts w:ascii="Times New Roman CYR" w:hAnsi="Times New Roman CYR" w:cs="Times New Roman CYR"/>
+          <w:szCs w:val="24"/>
+          <w:highlight w:val="yellow"/>
+          <w:lang w:val="uk-UA" w:eastAsia="en-US"/>
+        </w:rPr>
+        <w:t xml:space="preserve">Лінійна згортка передбачає наперед визначену взаємозамінність критеріїв, що означає, що погіршення одного показника може бути компенсованим покращенням іншого. </w:t>
+      </w:r>
+      <w:r>
+        <w:rPr>
+          <w:rFonts w:ascii="Times New Roman CYR" w:hAnsi="Times New Roman CYR" w:cs="Times New Roman CYR"/>
+          <w:szCs w:val="24"/>
+          <w:highlight w:val="yellow"/>
+          <w:lang w:val="uk-UA" w:eastAsia="en-US"/>
+        </w:rPr>
+        <w:t>Проте</w:t>
+      </w:r>
+      <w:r>
+        <w:rPr>
+          <w:rFonts w:ascii="Times New Roman CYR" w:hAnsi="Times New Roman CYR" w:cs="Times New Roman CYR"/>
+          <w:szCs w:val="24"/>
+          <w:highlight w:val="yellow"/>
+          <w:lang w:val="uk-UA" w:eastAsia="en-US"/>
+        </w:rPr>
+        <w:t xml:space="preserve"> у контексті даної задачі кількісне співвідношення між тривалістю польоту та навігаційною якістю наперед не встановлене, тому застосування вагових коефіцієнтів призвело б до внесення суб’єктивних припущень у </w:t>
+      </w:r>
+      <w:r>
+        <w:rPr>
+          <w:rFonts w:ascii="Times New Roman CYR" w:hAnsi="Times New Roman CYR" w:cs="Times New Roman CYR"/>
+          <w:szCs w:val="24"/>
+          <w:highlight w:val="yellow"/>
+          <w:lang w:val="uk-UA" w:eastAsia="en-US"/>
+        </w:rPr>
+        <w:t xml:space="preserve">цільову функцію. Тому доцільно працювати з окремими критеріями </w:t>
+      </w:r>
+      <w:r>
+        <w:rPr>
+          <w:rFonts w:ascii="Times New Roman CYR" w:hAnsi="Times New Roman CYR" w:cs="Times New Roman CYR"/>
+          <w:szCs w:val="24"/>
+          <w:highlight w:val="yellow"/>
+          <w:lang w:val="uk-UA" w:eastAsia="en-US"/>
+        </w:rPr>
+        <w:t xml:space="preserve">та формувати множину </w:t>
+      </w:r>
+      <w:proofErr w:type="spellStart"/>
+      <w:r>
+        <w:rPr>
+          <w:rFonts w:ascii="Times New Roman CYR" w:hAnsi="Times New Roman CYR" w:cs="Times New Roman CYR"/>
+          <w:szCs w:val="24"/>
+          <w:highlight w:val="yellow"/>
+          <w:lang w:val="uk-UA" w:eastAsia="en-US"/>
+        </w:rPr>
+        <w:t>Парето</w:t>
+      </w:r>
+      <w:proofErr w:type="spellEnd"/>
+      <w:r>
+        <w:rPr>
+          <w:rFonts w:ascii="Times New Roman CYR" w:hAnsi="Times New Roman CYR" w:cs="Times New Roman CYR"/>
+          <w:szCs w:val="24"/>
+          <w:highlight w:val="yellow"/>
+          <w:lang w:val="uk-UA" w:eastAsia="en-US"/>
+        </w:rPr>
+        <w:t>-оптимальних маршрутів.</w:t>
+      </w:r>
+      <w:r>
+        <w:rPr>
+          <w:rFonts w:ascii="Times New Roman CYR" w:hAnsi="Times New Roman CYR" w:cs="Times New Roman CYR"/>
+          <w:szCs w:val="24"/>
+          <w:lang w:val="uk-UA" w:eastAsia="en-US"/>
+        </w:rPr>
+        <w:t xml:space="preserve"> </w:t>
+      </w:r>
+    </w:p>
+    <w:p>
+      <w:pPr>
+        <w:pStyle w:val="BodyTextIndent"/>
+        <w:ind w:firstLine="567"/>
+        <w:jc w:val="both"/>
+        <w:rPr>
+          <w:rFonts w:ascii="Times New Roman CYR" w:hAnsi="Times New Roman CYR" w:cs="Times New Roman CYR"/>
+          <w:szCs w:val="24"/>
+          <w:lang w:val="uk-UA" w:eastAsia="en-US"/>
+        </w:rPr>
+      </w:pPr>
+      <w:r>
+        <w:rPr>
+          <w:rFonts w:ascii="Times New Roman CYR" w:hAnsi="Times New Roman CYR" w:cs="Times New Roman CYR"/>
+          <w:szCs w:val="24"/>
+          <w:lang w:val="uk-UA" w:eastAsia="en-US"/>
+        </w:rPr>
+        <w:lastRenderedPageBreak/>
+        <w:t xml:space="preserve">Для постановки задачі багатокритеріальної оптимізації слід визначити </w:t>
+      </w:r>
+      <w:r>
+        <w:rPr>
+          <w:rFonts w:ascii="Times New Roman CYR" w:hAnsi="Times New Roman CYR" w:cs="Times New Roman CYR"/>
+          <w:szCs w:val="24"/>
+          <w:lang w:val="uk-UA" w:eastAsia="en-US"/>
+        </w:rPr>
+        <w:t xml:space="preserve">набір вхідних даних, які мають надаватися для планування маршруту. </w:t>
+      </w:r>
+      <w:r>
+        <w:rPr>
+          <w:rFonts w:ascii="Times New Roman CYR" w:hAnsi="Times New Roman CYR" w:cs="Times New Roman CYR"/>
+          <w:szCs w:val="24"/>
+          <w:lang w:val="uk-UA" w:eastAsia="en-US"/>
+        </w:rPr>
+        <w:t>Подається</w:t>
+      </w:r>
+      <w:r>
+        <w:rPr>
+          <w:rFonts w:ascii="Times New Roman CYR" w:hAnsi="Times New Roman CYR" w:cs="Times New Roman CYR"/>
+          <w:szCs w:val="24"/>
+          <w:lang w:val="uk-UA" w:eastAsia="en-US"/>
+        </w:rPr>
+        <w:t xml:space="preserve"> наступний набір даних</w:t>
+      </w:r>
+      <w:r>
+        <w:rPr>
+          <w:rFonts w:ascii="Times New Roman CYR" w:hAnsi="Times New Roman CYR" w:cs="Times New Roman CYR"/>
+          <w:szCs w:val="24"/>
+          <w:lang w:val="uk-UA" w:eastAsia="en-US"/>
+        </w:rPr>
+        <w:t xml:space="preserve"> про місцевість для виконання завдань</w:t>
+      </w:r>
+      <w:r>
+        <w:rPr>
+          <w:rFonts w:ascii="Times New Roman CYR" w:hAnsi="Times New Roman CYR" w:cs="Times New Roman CYR"/>
+          <w:szCs w:val="24"/>
+          <w:lang w:val="uk-UA" w:eastAsia="en-US"/>
+        </w:rPr>
+        <w:t xml:space="preserve">: </w:t>
+      </w:r>
+      <w:proofErr w:type="spellStart"/>
+      <w:r>
+        <w:rPr>
+          <w:rFonts w:ascii="Times New Roman CYR" w:hAnsi="Times New Roman CYR" w:cs="Times New Roman CYR"/>
+          <w:szCs w:val="24"/>
+          <w:lang w:val="uk-UA" w:eastAsia="en-US"/>
+        </w:rPr>
+        <w:t>геоприв’язаний</w:t>
+      </w:r>
+      <w:proofErr w:type="spellEnd"/>
+      <w:r>
+        <w:rPr>
+          <w:rFonts w:ascii="Times New Roman CYR" w:hAnsi="Times New Roman CYR" w:cs="Times New Roman CYR"/>
+          <w:szCs w:val="24"/>
+          <w:lang w:val="uk-UA" w:eastAsia="en-US"/>
+        </w:rPr>
+        <w:t xml:space="preserve"> супутниковий </w:t>
+      </w:r>
+      <w:r>
+        <w:rPr>
+          <w:rFonts w:ascii="Times New Roman CYR" w:hAnsi="Times New Roman CYR" w:cs="Times New Roman CYR"/>
+          <w:szCs w:val="24"/>
+          <w:lang w:val="uk-UA" w:eastAsia="en-US"/>
+        </w:rPr>
+        <w:t xml:space="preserve">або </w:t>
+      </w:r>
+      <w:proofErr w:type="spellStart"/>
+      <w:r>
+        <w:rPr>
+          <w:rFonts w:ascii="Times New Roman CYR" w:hAnsi="Times New Roman CYR" w:cs="Times New Roman CYR"/>
+          <w:szCs w:val="24"/>
+          <w:lang w:val="uk-UA" w:eastAsia="en-US"/>
+        </w:rPr>
+        <w:t>аерофото</w:t>
+      </w:r>
+      <w:r>
+        <w:rPr>
+          <w:rFonts w:ascii="Times New Roman CYR" w:hAnsi="Times New Roman CYR" w:cs="Times New Roman CYR"/>
+          <w:szCs w:val="24"/>
+          <w:lang w:val="uk-UA" w:eastAsia="en-US"/>
+        </w:rPr>
+        <w:t>знімок</w:t>
+      </w:r>
+      <w:proofErr w:type="spellEnd"/>
+      <w:r>
+        <w:rPr>
+          <w:rFonts w:ascii="Times New Roman CYR" w:hAnsi="Times New Roman CYR" w:cs="Times New Roman CYR"/>
+          <w:szCs w:val="24"/>
+          <w:lang w:val="uk-UA" w:eastAsia="en-US"/>
+        </w:rPr>
+        <w:t xml:space="preserve">, карта висот, карта вітру, </w:t>
+      </w:r>
+      <w:r>
+        <w:rPr>
+          <w:rFonts w:ascii="Times New Roman CYR" w:hAnsi="Times New Roman CYR" w:cs="Times New Roman CYR"/>
+          <w:szCs w:val="24"/>
+          <w:lang w:val="uk-UA" w:eastAsia="en-US"/>
+        </w:rPr>
+        <w:t>зони, де проліт заборонено, зони з погіршеною видимістю</w:t>
+      </w:r>
+      <w:r>
+        <w:rPr>
+          <w:rFonts w:ascii="Times New Roman CYR" w:hAnsi="Times New Roman CYR" w:cs="Times New Roman CYR"/>
+          <w:szCs w:val="24"/>
+          <w:lang w:val="uk-UA" w:eastAsia="en-US"/>
+        </w:rPr>
+        <w:t>, початкова і кінцева точка, висота польоту над рельєфом та запас енергії</w:t>
+      </w:r>
+      <w:r>
+        <w:rPr>
+          <w:rFonts w:ascii="Times New Roman CYR" w:hAnsi="Times New Roman CYR" w:cs="Times New Roman CYR"/>
+          <w:szCs w:val="24"/>
+          <w:lang w:val="uk-UA" w:eastAsia="en-US"/>
+        </w:rPr>
+        <w:t xml:space="preserve">. </w:t>
+      </w:r>
+      <w:r>
+        <w:rPr>
+          <w:rFonts w:ascii="Times New Roman CYR" w:hAnsi="Times New Roman CYR" w:cs="Times New Roman CYR"/>
+          <w:szCs w:val="24"/>
+          <w:lang w:val="uk-UA" w:eastAsia="en-US"/>
+        </w:rPr>
+        <w:t>Для забезпечення допустимого маршруту для конкретного</w:t>
+      </w:r>
+      <w:r>
+        <w:rPr>
+          <w:rFonts w:ascii="Times New Roman CYR" w:hAnsi="Times New Roman CYR" w:cs="Times New Roman CYR"/>
+          <w:szCs w:val="24"/>
+          <w:lang w:val="uk-UA" w:eastAsia="en-US"/>
+        </w:rPr>
+        <w:t xml:space="preserve"> виду БПС, </w:t>
+      </w:r>
+      <w:r>
+        <w:rPr>
+          <w:rFonts w:ascii="Times New Roman CYR" w:hAnsi="Times New Roman CYR" w:cs="Times New Roman CYR"/>
+          <w:szCs w:val="24"/>
+          <w:lang w:val="uk-UA" w:eastAsia="en-US"/>
+        </w:rPr>
+        <w:t>надається</w:t>
+      </w:r>
+      <w:r>
+        <w:rPr>
+          <w:rFonts w:ascii="Times New Roman CYR" w:hAnsi="Times New Roman CYR" w:cs="Times New Roman CYR"/>
+          <w:szCs w:val="24"/>
+          <w:lang w:val="uk-UA" w:eastAsia="en-US"/>
+        </w:rPr>
+        <w:t xml:space="preserve"> </w:t>
+      </w:r>
+      <w:r>
+        <w:rPr>
+          <w:rFonts w:ascii="Times New Roman CYR" w:hAnsi="Times New Roman CYR" w:cs="Times New Roman CYR"/>
+          <w:szCs w:val="24"/>
+          <w:lang w:val="uk-UA" w:eastAsia="en-US"/>
+        </w:rPr>
+        <w:t>мінімальний радіус повороту</w:t>
+      </w:r>
+      <w:r>
+        <w:rPr>
+          <w:rFonts w:ascii="Times New Roman CYR" w:hAnsi="Times New Roman CYR" w:cs="Times New Roman CYR"/>
+          <w:szCs w:val="24"/>
+          <w:lang w:val="uk-UA" w:eastAsia="en-US"/>
+        </w:rPr>
+        <w:t xml:space="preserve"> та </w:t>
+      </w:r>
+      <w:r>
+        <w:rPr>
+          <w:rFonts w:ascii="Times New Roman CYR" w:hAnsi="Times New Roman CYR" w:cs="Times New Roman CYR"/>
+          <w:szCs w:val="24"/>
+          <w:lang w:val="uk-UA" w:eastAsia="en-US"/>
+        </w:rPr>
+        <w:t>набір обмежень його льотних характеристик, таких як максимальна</w:t>
+      </w:r>
+      <w:r>
+        <w:rPr>
+          <w:rFonts w:ascii="Times New Roman CYR" w:hAnsi="Times New Roman CYR" w:cs="Times New Roman CYR"/>
+          <w:szCs w:val="24"/>
+          <w:lang w:val="uk-UA" w:eastAsia="en-US"/>
+        </w:rPr>
+        <w:t xml:space="preserve"> швидкість</w:t>
+      </w:r>
+      <w:r>
+        <w:rPr>
+          <w:rFonts w:ascii="Times New Roman CYR" w:hAnsi="Times New Roman CYR" w:cs="Times New Roman CYR"/>
+          <w:szCs w:val="24"/>
+          <w:lang w:val="uk-UA" w:eastAsia="en-US"/>
+        </w:rPr>
+        <w:t xml:space="preserve"> </w:t>
+      </w:r>
+      <w:r>
+        <w:rPr>
+          <w:rFonts w:ascii="Times New Roman CYR" w:hAnsi="Times New Roman CYR" w:cs="Times New Roman CYR"/>
+          <w:szCs w:val="24"/>
+          <w:lang w:val="uk-UA" w:eastAsia="en-US"/>
+        </w:rPr>
+        <w:t xml:space="preserve">та </w:t>
+      </w:r>
+      <w:r>
+        <w:rPr>
+          <w:rFonts w:ascii="Times New Roman CYR" w:hAnsi="Times New Roman CYR" w:cs="Times New Roman CYR"/>
+          <w:szCs w:val="24"/>
+          <w:lang w:val="uk-UA" w:eastAsia="en-US"/>
+        </w:rPr>
+        <w:t xml:space="preserve">висота </w:t>
+      </w:r>
+      <w:r>
+        <w:rPr>
+          <w:rFonts w:ascii="Times New Roman CYR" w:hAnsi="Times New Roman CYR" w:cs="Times New Roman CYR"/>
+          <w:szCs w:val="24"/>
+          <w:lang w:val="uk-UA" w:eastAsia="en-US"/>
+        </w:rPr>
+        <w:t>польоту.</w:t>
+      </w:r>
+    </w:p>
+    <w:p>
+      <w:pPr>
+        <w:pStyle w:val="BodyTextIndent"/>
+        <w:ind w:firstLine="567"/>
+        <w:jc w:val="both"/>
+        <w:rPr>
+          <w:rFonts w:ascii="Times New Roman CYR" w:eastAsiaTheme="minorEastAsia" w:hAnsi="Times New Roman CYR" w:cs="Times New Roman CYR"/>
+          <w:szCs w:val="24"/>
+          <w:lang w:val="uk-UA" w:eastAsia="en-US"/>
+        </w:rPr>
+      </w:pPr>
+      <w:bookmarkStart w:id="0" w:name="_GoBack"/>
+      <w:bookmarkEnd w:id="0"/>
+      <w:r>
+        <w:rPr>
+          <w:rFonts w:ascii="Times New Roman CYR" w:hAnsi="Times New Roman CYR" w:cs="Times New Roman CYR"/>
+          <w:szCs w:val="24"/>
+          <w:lang w:val="uk-UA" w:eastAsia="en-US"/>
+        </w:rPr>
+        <w:t xml:space="preserve">Для використання різнорідних </w:t>
+      </w:r>
+      <w:proofErr w:type="spellStart"/>
+      <w:r>
+        <w:rPr>
+          <w:rFonts w:ascii="Times New Roman CYR" w:hAnsi="Times New Roman CYR" w:cs="Times New Roman CYR"/>
+          <w:szCs w:val="24"/>
+          <w:lang w:val="uk-UA" w:eastAsia="en-US"/>
+        </w:rPr>
+        <w:t>геопросторових</w:t>
+      </w:r>
+      <w:proofErr w:type="spellEnd"/>
+      <w:r>
+        <w:rPr>
+          <w:rFonts w:ascii="Times New Roman CYR" w:hAnsi="Times New Roman CYR" w:cs="Times New Roman CYR"/>
+          <w:szCs w:val="24"/>
+          <w:lang w:val="uk-UA" w:eastAsia="en-US"/>
+        </w:rPr>
+        <w:t xml:space="preserve"> даних </w:t>
+      </w:r>
+      <w:r>
+        <w:rPr>
+          <w:rFonts w:ascii="Times New Roman CYR" w:hAnsi="Times New Roman CYR" w:cs="Times New Roman CYR"/>
+          <w:szCs w:val="24"/>
+          <w:lang w:val="uk-UA" w:eastAsia="en-US"/>
+        </w:rPr>
+        <w:t xml:space="preserve">область планування ділиться на сітку з </w:t>
+      </w:r>
+      <w:r>
+        <w:rPr>
+          <w:rFonts w:ascii="Times New Roman CYR" w:hAnsi="Times New Roman CYR" w:cs="Times New Roman CYR"/>
+          <w:szCs w:val="24"/>
+          <w:lang w:val="uk-UA" w:eastAsia="en-US"/>
+        </w:rPr>
+        <w:t>заданим</w:t>
+      </w:r>
+      <w:r>
+        <w:rPr>
+          <w:rFonts w:ascii="Times New Roman CYR" w:hAnsi="Times New Roman CYR" w:cs="Times New Roman CYR"/>
+          <w:szCs w:val="24"/>
+          <w:lang w:val="uk-UA" w:eastAsia="en-US"/>
+        </w:rPr>
+        <w:t xml:space="preserve"> кроком дискретизації</w:t>
+      </w:r>
+      <w:r>
+        <w:rPr>
+          <w:rFonts w:ascii="Times New Roman CYR" w:hAnsi="Times New Roman CYR" w:cs="Times New Roman CYR"/>
+          <w:szCs w:val="24"/>
+          <w:lang w:val="uk-UA" w:eastAsia="en-US"/>
+        </w:rPr>
+        <w:t xml:space="preserve"> з попереднім приведенням </w:t>
+      </w:r>
+      <w:proofErr w:type="spellStart"/>
+      <w:r>
+        <w:rPr>
+          <w:rFonts w:ascii="Times New Roman CYR" w:hAnsi="Times New Roman CYR" w:cs="Times New Roman CYR"/>
+          <w:szCs w:val="24"/>
+          <w:lang w:val="uk-UA" w:eastAsia="en-US"/>
+        </w:rPr>
+        <w:t>геопросторових</w:t>
+      </w:r>
+      <w:proofErr w:type="spellEnd"/>
+      <w:r>
+        <w:rPr>
+          <w:rFonts w:ascii="Times New Roman CYR" w:hAnsi="Times New Roman CYR" w:cs="Times New Roman CYR"/>
+          <w:szCs w:val="24"/>
+          <w:lang w:val="uk-UA" w:eastAsia="en-US"/>
+        </w:rPr>
+        <w:t xml:space="preserve"> даних до єдиної системи координат</w:t>
+      </w:r>
+      <w:r>
+        <w:rPr>
+          <w:rFonts w:ascii="Times New Roman CYR" w:hAnsi="Times New Roman CYR" w:cs="Times New Roman CYR"/>
+          <w:szCs w:val="24"/>
+          <w:lang w:val="uk-UA" w:eastAsia="en-US"/>
+        </w:rPr>
+        <w:t>.</w:t>
+      </w:r>
+      <w:r>
+        <w:rPr>
+          <w:rFonts w:ascii="Times New Roman CYR" w:hAnsi="Times New Roman CYR" w:cs="Times New Roman CYR"/>
+          <w:szCs w:val="24"/>
+          <w:lang w:val="uk-UA" w:eastAsia="en-US"/>
+        </w:rPr>
+        <w:t xml:space="preserve"> </w:t>
+      </w:r>
+      <w:r>
+        <w:rPr>
+          <w:rFonts w:ascii="Times New Roman CYR" w:hAnsi="Times New Roman CYR" w:cs="Times New Roman CYR"/>
+          <w:szCs w:val="24"/>
+          <w:lang w:val="uk-UA" w:eastAsia="en-US"/>
+        </w:rPr>
+        <w:t xml:space="preserve">Після цього кожній комірці </w:t>
+      </w:r>
+      <m:oMath>
+        <m:r>
+          <w:rPr>
+            <w:rFonts w:ascii="Cambria Math" w:hAnsi="Cambria Math" w:cs="Times New Roman CYR"/>
+            <w:szCs w:val="24"/>
+            <w:lang w:val="uk-UA" w:eastAsia="en-US"/>
+          </w:rPr>
+          <m:t>(</m:t>
+        </m:r>
+        <m:r>
+          <w:rPr>
+            <w:rFonts w:ascii="Cambria Math" w:hAnsi="Cambria Math" w:cs="Times New Roman CYR"/>
+            <w:szCs w:val="24"/>
+            <w:lang w:val="en-US" w:eastAsia="en-US"/>
+          </w:rPr>
+          <m:t>i, j)</m:t>
+        </m:r>
+      </m:oMath>
+      <w:r>
+        <w:rPr>
+          <w:rFonts w:ascii="Times New Roman CYR" w:eastAsiaTheme="minorEastAsia" w:hAnsi="Times New Roman CYR" w:cs="Times New Roman CYR"/>
+          <w:szCs w:val="24"/>
+          <w:lang w:val="en-US" w:eastAsia="en-US"/>
+        </w:rPr>
+        <w:t xml:space="preserve"> </w:t>
+      </w:r>
+      <w:r>
+        <w:rPr>
+          <w:rFonts w:ascii="Times New Roman CYR" w:eastAsiaTheme="minorEastAsia" w:hAnsi="Times New Roman CYR" w:cs="Times New Roman CYR"/>
+          <w:szCs w:val="24"/>
+          <w:lang w:val="uk-UA" w:eastAsia="en-US"/>
+        </w:rPr>
+        <w:t xml:space="preserve">багатошарової растрової моделі ставиться у відповідність вектор характеристик </w:t>
+      </w:r>
+      <m:oMath>
+        <m:sSub>
+          <m:sSubPr>
+            <m:ctrlPr>
+              <w:rPr>
+                <w:rFonts w:ascii="Cambria Math" w:eastAsiaTheme="minorEastAsia" w:hAnsi="Cambria Math" w:cs="Times New Roman CYR"/>
+                <w:i/>
+                <w:szCs w:val="24"/>
+                <w:lang w:val="uk-UA" w:eastAsia="en-US"/>
+              </w:rPr>
+            </m:ctrlPr>
+          </m:sSubPr>
+          <m:e>
+            <m:r>
+              <w:rPr>
+                <w:rFonts w:ascii="Cambria Math" w:eastAsiaTheme="minorEastAsia" w:hAnsi="Cambria Math" w:cs="Times New Roman CYR"/>
+                <w:szCs w:val="24"/>
+                <w:lang w:val="en-US" w:eastAsia="en-US"/>
+              </w:rPr>
+              <m:t>a</m:t>
+            </m:r>
+          </m:e>
+          <m:sub>
+            <m:r>
+              <w:rPr>
+                <w:rFonts w:ascii="Cambria Math" w:eastAsiaTheme="minorEastAsia" w:hAnsi="Cambria Math" w:cs="Times New Roman CYR"/>
+                <w:szCs w:val="24"/>
+                <w:lang w:val="uk-UA" w:eastAsia="en-US"/>
+              </w:rPr>
+              <m:t>ij</m:t>
+            </m:r>
+          </m:sub>
+        </m:sSub>
+        <m:r>
+          <w:rPr>
+            <w:rFonts w:ascii="Cambria Math" w:eastAsiaTheme="minorEastAsia" w:hAnsi="Cambria Math" w:cs="Times New Roman CYR"/>
+            <w:szCs w:val="24"/>
+            <w:lang w:val="uk-UA" w:eastAsia="en-US"/>
+          </w:rPr>
+          <m:t>=</m:t>
+        </m:r>
+        <m:d>
+          <m:dPr>
+            <m:ctrlPr>
+              <w:rPr>
+                <w:rFonts w:ascii="Cambria Math" w:eastAsiaTheme="minorEastAsia" w:hAnsi="Cambria Math" w:cs="Times New Roman CYR"/>
+                <w:i/>
+                <w:szCs w:val="24"/>
+                <w:lang w:val="uk-UA" w:eastAsia="en-US"/>
+              </w:rPr>
+            </m:ctrlPr>
+          </m:dPr>
+          <m:e>
+            <m:sSubSup>
+              <m:sSubSupPr>
+                <m:ctrlPr>
+                  <w:rPr>
+                    <w:rFonts w:ascii="Cambria Math" w:eastAsiaTheme="minorEastAsia" w:hAnsi="Cambria Math" w:cs="Times New Roman CYR"/>
+                    <w:i/>
+                    <w:szCs w:val="24"/>
+                    <w:lang w:val="uk-UA" w:eastAsia="en-US"/>
+                  </w:rPr>
+                </m:ctrlPr>
+              </m:sSubSupPr>
+              <m:e>
+                <m:r>
+                  <w:rPr>
+                    <w:rFonts w:ascii="Cambria Math" w:eastAsiaTheme="minorEastAsia" w:hAnsi="Cambria Math" w:cs="Times New Roman CYR"/>
+                    <w:szCs w:val="24"/>
+                    <w:lang w:val="uk-UA" w:eastAsia="en-US"/>
+                  </w:rPr>
+                  <m:t>h</m:t>
+                </m:r>
+              </m:e>
+              <m:sub>
+                <m:r>
+                  <w:rPr>
+                    <w:rFonts w:ascii="Cambria Math" w:eastAsiaTheme="minorEastAsia" w:hAnsi="Cambria Math" w:cs="Times New Roman CYR"/>
+                    <w:szCs w:val="24"/>
+                    <w:lang w:val="uk-UA" w:eastAsia="en-US"/>
+                  </w:rPr>
+                  <m:t>ij</m:t>
+                </m:r>
+              </m:sub>
+              <m:sup>
+                <m:r>
+                  <w:rPr>
+                    <w:rFonts w:ascii="Cambria Math" w:eastAsiaTheme="minorEastAsia" w:hAnsi="Cambria Math" w:cs="Times New Roman CYR"/>
+                    <w:szCs w:val="24"/>
+                    <w:lang w:val="uk-UA" w:eastAsia="en-US"/>
+                  </w:rPr>
+                  <m:t>c</m:t>
+                </m:r>
+              </m:sup>
+            </m:sSubSup>
+            <m:r>
+              <w:rPr>
+                <w:rFonts w:ascii="Cambria Math" w:eastAsiaTheme="minorEastAsia" w:hAnsi="Cambria Math" w:cs="Times New Roman CYR"/>
+                <w:szCs w:val="24"/>
+                <w:lang w:val="uk-UA" w:eastAsia="en-US"/>
+              </w:rPr>
+              <m:t xml:space="preserve">, </m:t>
+            </m:r>
+            <m:sSubSup>
+              <m:sSubSupPr>
+                <m:ctrlPr>
+                  <w:rPr>
+                    <w:rFonts w:ascii="Cambria Math" w:eastAsiaTheme="minorEastAsia" w:hAnsi="Cambria Math" w:cs="Times New Roman CYR"/>
+                    <w:i/>
+                    <w:szCs w:val="24"/>
+                    <w:lang w:val="uk-UA" w:eastAsia="en-US"/>
+                  </w:rPr>
+                </m:ctrlPr>
+              </m:sSubSupPr>
+              <m:e>
+                <m:r>
+                  <w:rPr>
+                    <w:rFonts w:ascii="Cambria Math" w:eastAsiaTheme="minorEastAsia" w:hAnsi="Cambria Math" w:cs="Times New Roman CYR"/>
+                    <w:szCs w:val="24"/>
+                    <w:lang w:val="uk-UA" w:eastAsia="en-US"/>
+                  </w:rPr>
+                  <m:t>h</m:t>
+                </m:r>
+              </m:e>
+              <m:sub>
+                <m:r>
+                  <w:rPr>
+                    <w:rFonts w:ascii="Cambria Math" w:eastAsiaTheme="minorEastAsia" w:hAnsi="Cambria Math" w:cs="Times New Roman CYR"/>
+                    <w:szCs w:val="24"/>
+                    <w:lang w:val="uk-UA" w:eastAsia="en-US"/>
+                  </w:rPr>
+                  <m:t>ij</m:t>
+                </m:r>
+              </m:sub>
+              <m:sup>
+                <m:r>
+                  <w:rPr>
+                    <w:rFonts w:ascii="Cambria Math" w:eastAsiaTheme="minorEastAsia" w:hAnsi="Cambria Math" w:cs="Times New Roman CYR"/>
+                    <w:szCs w:val="24"/>
+                    <w:lang w:val="uk-UA" w:eastAsia="en-US"/>
+                  </w:rPr>
+                  <m:t>max</m:t>
+                </m:r>
+              </m:sup>
+            </m:sSubSup>
+            <m:r>
+              <w:rPr>
+                <w:rFonts w:ascii="Cambria Math" w:eastAsiaTheme="minorEastAsia" w:hAnsi="Cambria Math" w:cs="Times New Roman CYR"/>
+                <w:szCs w:val="24"/>
+                <w:lang w:val="uk-UA" w:eastAsia="en-US"/>
+              </w:rPr>
+              <m:t>,</m:t>
+            </m:r>
+            <m:sSub>
+              <m:sSubPr>
+                <m:ctrlPr>
+                  <w:rPr>
+                    <w:rFonts w:ascii="Cambria Math" w:hAnsi="Cambria Math" w:cs="Times New Roman"/>
+                    <w:i/>
+                    <w:color w:val="000000"/>
+                    <w:szCs w:val="24"/>
+                    <w:lang w:val="uk-UA" w:eastAsia="en-US"/>
+                  </w:rPr>
+                </m:ctrlPr>
+              </m:sSubPr>
+              <m:e>
+                <m:r>
+                  <w:rPr>
+                    <w:rFonts w:ascii="Cambria Math" w:hAnsi="Cambria Math" w:cs="Times New Roman"/>
+                    <w:color w:val="000000"/>
+                    <w:szCs w:val="24"/>
+                    <w:lang w:val="uk-UA" w:eastAsia="en-US"/>
+                  </w:rPr>
+                  <m:t>φ</m:t>
+                </m:r>
+              </m:e>
+              <m:sub>
+                <m:r>
+                  <w:rPr>
+                    <w:rFonts w:ascii="Cambria Math" w:hAnsi="Cambria Math" w:cs="Times New Roman"/>
+                    <w:color w:val="000000"/>
+                    <w:szCs w:val="24"/>
+                    <w:lang w:val="uk-UA" w:eastAsia="en-US"/>
+                  </w:rPr>
+                  <m:t>vis</m:t>
+                </m:r>
+                <m:r>
+                  <w:rPr>
+                    <w:rFonts w:ascii="Cambria Math" w:hAnsi="Cambria Math" w:cs="Times New Roman"/>
+                    <w:color w:val="000000"/>
+                    <w:szCs w:val="24"/>
+                    <w:lang w:val="uk-UA" w:eastAsia="en-US"/>
+                  </w:rPr>
+                  <m:t>,ij</m:t>
+                </m:r>
+              </m:sub>
+            </m:sSub>
+            <m:r>
+              <w:rPr>
+                <w:rFonts w:ascii="Cambria Math" w:hAnsi="Cambria Math" w:cs="Times New Roman"/>
+                <w:color w:val="000000"/>
+                <w:szCs w:val="24"/>
+                <w:lang w:val="uk-UA" w:eastAsia="en-US"/>
+              </w:rPr>
+              <m:t xml:space="preserve">, </m:t>
+            </m:r>
+            <m:sSub>
+              <m:sSubPr>
+                <m:ctrlPr>
+                  <w:rPr>
+                    <w:rFonts w:ascii="Cambria Math" w:hAnsi="Cambria Math" w:cs="Times New Roman"/>
+                    <w:i/>
+                    <w:color w:val="000000"/>
+                    <w:szCs w:val="24"/>
+                    <w:lang w:val="uk-UA" w:eastAsia="en-US"/>
+                  </w:rPr>
+                </m:ctrlPr>
+              </m:sSubPr>
+              <m:e>
+                <m:r>
+                  <w:rPr>
+                    <w:rFonts w:ascii="Cambria Math" w:hAnsi="Cambria Math" w:cs="Times New Roman"/>
+                    <w:color w:val="000000"/>
+                    <w:szCs w:val="24"/>
+                    <w:lang w:val="uk-UA" w:eastAsia="en-US"/>
+                  </w:rPr>
+                  <m:t>φ</m:t>
+                </m:r>
+              </m:e>
+              <m:sub>
+                <m:r>
+                  <w:rPr>
+                    <w:rFonts w:ascii="Cambria Math" w:hAnsi="Cambria Math" w:cs="Times New Roman"/>
+                    <w:color w:val="000000"/>
+                    <w:szCs w:val="24"/>
+                    <w:lang w:val="uk-UA" w:eastAsia="en-US"/>
+                  </w:rPr>
+                  <m:t>ter</m:t>
+                </m:r>
+                <m:r>
+                  <w:rPr>
+                    <w:rFonts w:ascii="Cambria Math" w:hAnsi="Cambria Math" w:cs="Times New Roman"/>
+                    <w:color w:val="000000"/>
+                    <w:szCs w:val="24"/>
+                    <w:lang w:val="uk-UA" w:eastAsia="en-US"/>
+                  </w:rPr>
+                  <m:t>,ij</m:t>
+                </m:r>
+              </m:sub>
+            </m:sSub>
+            <m:r>
+              <w:rPr>
+                <w:rFonts w:ascii="Cambria Math" w:eastAsiaTheme="minorEastAsia" w:hAnsi="Cambria Math" w:cs="Times New Roman CYR"/>
+                <w:szCs w:val="24"/>
+                <w:lang w:val="uk-UA" w:eastAsia="en-US"/>
+              </w:rPr>
+              <m:t xml:space="preserve">, </m:t>
+            </m:r>
+            <m:sSub>
+              <m:sSubPr>
+                <m:ctrlPr>
+                  <w:rPr>
+                    <w:rFonts w:ascii="Cambria Math" w:hAnsi="Cambria Math" w:cs="Times New Roman"/>
+                    <w:i/>
+                    <w:color w:val="000000"/>
+                    <w:szCs w:val="24"/>
+                    <w:lang w:val="uk-UA" w:eastAsia="en-US"/>
+                  </w:rPr>
+                </m:ctrlPr>
+              </m:sSubPr>
+              <m:e>
+                <m:r>
+                  <w:rPr>
+                    <w:rFonts w:ascii="Cambria Math" w:hAnsi="Cambria Math" w:cs="Times New Roman"/>
+                    <w:color w:val="000000"/>
+                    <w:szCs w:val="24"/>
+                    <w:lang w:val="uk-UA" w:eastAsia="en-US"/>
+                  </w:rPr>
+                  <m:t>φ</m:t>
+                </m:r>
+              </m:e>
+              <m:sub>
+                <m:r>
+                  <w:rPr>
+                    <w:rFonts w:ascii="Cambria Math" w:hAnsi="Cambria Math" w:cs="Times New Roman"/>
+                    <w:color w:val="000000"/>
+                    <w:szCs w:val="24"/>
+                    <w:lang w:val="uk-UA" w:eastAsia="en-US"/>
+                  </w:rPr>
+                  <m:t>v</m:t>
+                </m:r>
+                <m:r>
+                  <w:rPr>
+                    <w:rFonts w:ascii="Cambria Math" w:hAnsi="Cambria Math" w:cs="Times New Roman"/>
+                    <w:color w:val="000000"/>
+                    <w:szCs w:val="24"/>
+                    <w:lang w:val="en-US" w:eastAsia="en-US"/>
+                  </w:rPr>
+                  <m:t>sb</m:t>
+                </m:r>
+                <m:r>
+                  <w:rPr>
+                    <w:rFonts w:ascii="Cambria Math" w:hAnsi="Cambria Math" w:cs="Times New Roman"/>
+                    <w:color w:val="000000"/>
+                    <w:szCs w:val="24"/>
+                    <w:lang w:val="en-US" w:eastAsia="en-US"/>
+                  </w:rPr>
+                  <m:t>,ij</m:t>
+                </m:r>
+              </m:sub>
+            </m:sSub>
+            <m:r>
+              <w:rPr>
+                <w:rFonts w:ascii="Cambria Math" w:eastAsiaTheme="minorEastAsia" w:hAnsi="Cambria Math" w:cs="Times New Roman CYR"/>
+                <w:szCs w:val="24"/>
+                <w:lang w:val="uk-UA" w:eastAsia="en-US"/>
+              </w:rPr>
+              <m:t>,</m:t>
+            </m:r>
+            <m:sSub>
+              <m:sSubPr>
+                <m:ctrlPr>
+                  <w:rPr>
+                    <w:rFonts w:ascii="Cambria Math" w:eastAsiaTheme="minorEastAsia" w:hAnsi="Cambria Math" w:cs="Times New Roman CYR"/>
+                    <w:i/>
+                    <w:szCs w:val="24"/>
+                    <w:lang w:val="uk-UA" w:eastAsia="en-US"/>
+                  </w:rPr>
+                </m:ctrlPr>
+              </m:sSubPr>
+              <m:e>
+                <m:r>
+                  <w:rPr>
+                    <w:rFonts w:ascii="Cambria Math" w:eastAsiaTheme="minorEastAsia" w:hAnsi="Cambria Math" w:cs="Times New Roman CYR"/>
+                    <w:szCs w:val="24"/>
+                    <w:lang w:val="uk-UA" w:eastAsia="en-US"/>
+                  </w:rPr>
+                  <m:t>u</m:t>
+                </m:r>
+              </m:e>
+              <m:sub>
+                <m:r>
+                  <w:rPr>
+                    <w:rFonts w:ascii="Cambria Math" w:eastAsiaTheme="minorEastAsia" w:hAnsi="Cambria Math" w:cs="Times New Roman CYR"/>
+                    <w:szCs w:val="24"/>
+                    <w:lang w:val="uk-UA" w:eastAsia="en-US"/>
+                  </w:rPr>
+                  <m:t>E,ij</m:t>
+                </m:r>
+              </m:sub>
+            </m:sSub>
+            <m:r>
+              <w:rPr>
+                <w:rFonts w:ascii="Cambria Math" w:eastAsiaTheme="minorEastAsia" w:hAnsi="Cambria Math" w:cs="Times New Roman CYR"/>
+                <w:szCs w:val="24"/>
+                <w:lang w:val="uk-UA" w:eastAsia="en-US"/>
+              </w:rPr>
+              <m:t>,</m:t>
+            </m:r>
+            <m:sSub>
+              <m:sSubPr>
+                <m:ctrlPr>
+                  <w:rPr>
+                    <w:rFonts w:ascii="Cambria Math" w:eastAsiaTheme="minorEastAsia" w:hAnsi="Cambria Math" w:cs="Times New Roman CYR"/>
+                    <w:i/>
+                    <w:szCs w:val="24"/>
+                    <w:lang w:val="uk-UA" w:eastAsia="en-US"/>
+                  </w:rPr>
+                </m:ctrlPr>
+              </m:sSubPr>
+              <m:e>
+                <m:r>
+                  <w:rPr>
+                    <w:rFonts w:ascii="Cambria Math" w:eastAsiaTheme="minorEastAsia" w:hAnsi="Cambria Math" w:cs="Times New Roman CYR"/>
+                    <w:szCs w:val="24"/>
+                    <w:lang w:val="uk-UA" w:eastAsia="en-US"/>
+                  </w:rPr>
+                  <m:t>u</m:t>
+                </m:r>
+              </m:e>
+              <m:sub>
+                <m:r>
+                  <w:rPr>
+                    <w:rFonts w:ascii="Cambria Math" w:eastAsiaTheme="minorEastAsia" w:hAnsi="Cambria Math" w:cs="Times New Roman CYR"/>
+                    <w:szCs w:val="24"/>
+                    <w:lang w:val="uk-UA" w:eastAsia="en-US"/>
+                  </w:rPr>
+                  <m:t>N,ij</m:t>
+                </m:r>
+              </m:sub>
+            </m:sSub>
+            <m:r>
+              <w:rPr>
+                <w:rFonts w:ascii="Cambria Math" w:eastAsiaTheme="minorEastAsia" w:hAnsi="Cambria Math" w:cs="Times New Roman CYR"/>
+                <w:szCs w:val="24"/>
+                <w:lang w:val="uk-UA" w:eastAsia="en-US"/>
+              </w:rPr>
+              <m:t>,</m:t>
+            </m:r>
+            <m:sSub>
+              <m:sSubPr>
+                <m:ctrlPr>
+                  <w:rPr>
+                    <w:rFonts w:ascii="Cambria Math" w:eastAsiaTheme="minorEastAsia" w:hAnsi="Cambria Math" w:cs="Times New Roman CYR"/>
+                    <w:i/>
+                    <w:szCs w:val="24"/>
+                    <w:lang w:val="uk-UA" w:eastAsia="en-US"/>
+                  </w:rPr>
+                </m:ctrlPr>
+              </m:sSubPr>
+              <m:e>
+                <m:r>
+                  <w:rPr>
+                    <w:rFonts w:ascii="Cambria Math" w:eastAsiaTheme="minorEastAsia" w:hAnsi="Cambria Math" w:cs="Times New Roman CYR"/>
+                    <w:szCs w:val="24"/>
+                    <w:lang w:val="uk-UA" w:eastAsia="en-US"/>
+                  </w:rPr>
+                  <m:t>χ</m:t>
+                </m:r>
+              </m:e>
+              <m:sub>
+                <m:r>
+                  <w:rPr>
+                    <w:rFonts w:ascii="Cambria Math" w:eastAsiaTheme="minorEastAsia" w:hAnsi="Cambria Math" w:cs="Times New Roman CYR"/>
+                    <w:szCs w:val="24"/>
+                    <w:lang w:val="uk-UA" w:eastAsia="en-US"/>
+                  </w:rPr>
+                  <m:t>F,ij</m:t>
+                </m:r>
+              </m:sub>
+            </m:sSub>
+          </m:e>
+        </m:d>
+      </m:oMath>
+      <w:r>
+        <w:rPr>
+          <w:rFonts w:ascii="Times New Roman CYR" w:eastAsiaTheme="minorEastAsia" w:hAnsi="Times New Roman CYR" w:cs="Times New Roman CYR"/>
+          <w:szCs w:val="24"/>
+          <w:lang w:val="en-US" w:eastAsia="en-US"/>
+        </w:rPr>
+        <w:t xml:space="preserve">, </w:t>
+      </w:r>
+      <w:r>
+        <w:rPr>
+          <w:rFonts w:ascii="Times New Roman CYR" w:eastAsiaTheme="minorEastAsia" w:hAnsi="Times New Roman CYR" w:cs="Times New Roman CYR"/>
+          <w:szCs w:val="24"/>
+          <w:lang w:val="uk-UA" w:eastAsia="en-US"/>
+        </w:rPr>
+        <w:t xml:space="preserve">де </w:t>
+      </w:r>
+      <m:oMath>
+        <m:sSubSup>
+          <m:sSubSupPr>
+            <m:ctrlPr>
+              <w:rPr>
+                <w:rFonts w:ascii="Cambria Math" w:eastAsiaTheme="minorEastAsia" w:hAnsi="Cambria Math" w:cs="Times New Roman CYR"/>
+                <w:i/>
+                <w:szCs w:val="24"/>
+                <w:lang w:val="uk-UA" w:eastAsia="en-US"/>
+              </w:rPr>
+            </m:ctrlPr>
+          </m:sSubSupPr>
+          <m:e>
+            <m:r>
+              <w:rPr>
+                <w:rFonts w:ascii="Cambria Math" w:eastAsiaTheme="minorEastAsia" w:hAnsi="Cambria Math" w:cs="Times New Roman CYR"/>
+                <w:szCs w:val="24"/>
+                <w:lang w:val="uk-UA" w:eastAsia="en-US"/>
+              </w:rPr>
+              <m:t>h</m:t>
+            </m:r>
+          </m:e>
+          <m:sub>
+            <m:r>
+              <w:rPr>
+                <w:rFonts w:ascii="Cambria Math" w:eastAsiaTheme="minorEastAsia" w:hAnsi="Cambria Math" w:cs="Times New Roman CYR"/>
+                <w:szCs w:val="24"/>
+                <w:lang w:val="uk-UA" w:eastAsia="en-US"/>
+              </w:rPr>
+              <m:t>ij</m:t>
+            </m:r>
+          </m:sub>
+          <m:sup>
+            <m:r>
+              <w:rPr>
+                <w:rFonts w:ascii="Cambria Math" w:eastAsiaTheme="minorEastAsia" w:hAnsi="Cambria Math" w:cs="Times New Roman CYR"/>
+                <w:szCs w:val="24"/>
+                <w:lang w:val="uk-UA" w:eastAsia="en-US"/>
+              </w:rPr>
+              <m:t>c</m:t>
+            </m:r>
+          </m:sup>
+        </m:sSubSup>
+      </m:oMath>
+      <w:r>
+        <w:rPr>
+          <w:rFonts w:ascii="Times New Roman CYR" w:eastAsiaTheme="minorEastAsia" w:hAnsi="Times New Roman CYR" w:cs="Times New Roman CYR"/>
+          <w:szCs w:val="24"/>
+          <w:lang w:val="uk-UA" w:eastAsia="en-US"/>
+        </w:rPr>
+        <w:t xml:space="preserve"> – висота в центрі комірки</w:t>
+      </w:r>
+      <w:r>
+        <w:rPr>
+          <w:rFonts w:ascii="Times New Roman CYR" w:eastAsiaTheme="minorEastAsia" w:hAnsi="Times New Roman CYR" w:cs="Times New Roman CYR"/>
+          <w:szCs w:val="24"/>
+          <w:lang w:val="uk-UA" w:eastAsia="en-US"/>
+        </w:rPr>
+        <w:t xml:space="preserve"> за цифровою моделлю висоти (ЦМВ)</w:t>
+      </w:r>
+      <w:r>
+        <w:rPr>
+          <w:rFonts w:ascii="Times New Roman CYR" w:eastAsiaTheme="minorEastAsia" w:hAnsi="Times New Roman CYR" w:cs="Times New Roman CYR"/>
+          <w:szCs w:val="24"/>
+          <w:lang w:val="uk-UA" w:eastAsia="en-US"/>
+        </w:rPr>
+        <w:t xml:space="preserve">, </w:t>
+      </w:r>
+      <m:oMath>
+        <m:sSubSup>
+          <m:sSubSupPr>
+            <m:ctrlPr>
+              <w:rPr>
+                <w:rFonts w:ascii="Cambria Math" w:eastAsiaTheme="minorEastAsia" w:hAnsi="Cambria Math" w:cs="Times New Roman CYR"/>
+                <w:i/>
+                <w:szCs w:val="24"/>
+                <w:lang w:val="uk-UA" w:eastAsia="en-US"/>
+              </w:rPr>
+            </m:ctrlPr>
+          </m:sSubSupPr>
+          <m:e>
+            <m:r>
+              <w:rPr>
+                <w:rFonts w:ascii="Cambria Math" w:eastAsiaTheme="minorEastAsia" w:hAnsi="Cambria Math" w:cs="Times New Roman CYR"/>
+                <w:szCs w:val="24"/>
+                <w:lang w:val="uk-UA" w:eastAsia="en-US"/>
+              </w:rPr>
+              <m:t>h</m:t>
+            </m:r>
+          </m:e>
+          <m:sub>
+            <m:r>
+              <w:rPr>
+                <w:rFonts w:ascii="Cambria Math" w:eastAsiaTheme="minorEastAsia" w:hAnsi="Cambria Math" w:cs="Times New Roman CYR"/>
+                <w:szCs w:val="24"/>
+                <w:lang w:val="uk-UA" w:eastAsia="en-US"/>
+              </w:rPr>
+              <m:t>ij</m:t>
+            </m:r>
+          </m:sub>
+          <m:sup>
+            <m:r>
+              <w:rPr>
+                <w:rFonts w:ascii="Cambria Math" w:eastAsiaTheme="minorEastAsia" w:hAnsi="Cambria Math" w:cs="Times New Roman CYR"/>
+                <w:szCs w:val="24"/>
+                <w:lang w:val="uk-UA" w:eastAsia="en-US"/>
+              </w:rPr>
+              <m:t>max</m:t>
+            </m:r>
+          </m:sup>
+        </m:sSubSup>
+      </m:oMath>
+      <w:r>
+        <w:rPr>
+          <w:rFonts w:ascii="Times New Roman CYR" w:eastAsiaTheme="minorEastAsia" w:hAnsi="Times New Roman CYR" w:cs="Times New Roman CYR"/>
+          <w:szCs w:val="24"/>
+          <w:lang w:val="uk-UA" w:eastAsia="en-US"/>
+        </w:rPr>
+        <w:t xml:space="preserve"> – максимальна висота комірки за ЦМВ, </w:t>
+      </w:r>
+      <m:oMath>
+        <m:sSub>
+          <m:sSubPr>
+            <m:ctrlPr>
+              <w:rPr>
+                <w:rFonts w:ascii="Cambria Math" w:hAnsi="Cambria Math" w:cs="Times New Roman"/>
+                <w:i/>
+                <w:color w:val="000000"/>
+                <w:szCs w:val="24"/>
+                <w:lang w:val="uk-UA" w:eastAsia="en-US"/>
+              </w:rPr>
+            </m:ctrlPr>
+          </m:sSubPr>
+          <m:e>
+            <m:r>
+              <w:rPr>
+                <w:rFonts w:ascii="Cambria Math" w:hAnsi="Cambria Math" w:cs="Times New Roman"/>
+                <w:color w:val="000000"/>
+                <w:szCs w:val="24"/>
+                <w:lang w:val="uk-UA" w:eastAsia="en-US"/>
+              </w:rPr>
+              <m:t>φ</m:t>
+            </m:r>
+          </m:e>
+          <m:sub>
+            <m:r>
+              <w:rPr>
+                <w:rFonts w:ascii="Cambria Math" w:hAnsi="Cambria Math" w:cs="Times New Roman"/>
+                <w:color w:val="000000"/>
+                <w:szCs w:val="24"/>
+                <w:lang w:val="uk-UA" w:eastAsia="en-US"/>
+              </w:rPr>
+              <m:t>vis,ij</m:t>
+            </m:r>
+          </m:sub>
+        </m:sSub>
+      </m:oMath>
+      <w:r>
+        <w:rPr>
+          <w:rFonts w:ascii="Times New Roman CYR" w:eastAsiaTheme="minorEastAsia" w:hAnsi="Times New Roman CYR" w:cs="Times New Roman CYR"/>
+          <w:color w:val="000000"/>
+          <w:szCs w:val="24"/>
+          <w:lang w:val="uk-UA" w:eastAsia="en-US"/>
+        </w:rPr>
+        <w:t xml:space="preserve"> –</w:t>
+      </w:r>
+      <w:r>
+        <w:rPr>
+          <w:rFonts w:ascii="Times New Roman CYR" w:eastAsiaTheme="minorEastAsia" w:hAnsi="Times New Roman CYR" w:cs="Times New Roman CYR"/>
+          <w:color w:val="000000"/>
+          <w:szCs w:val="24"/>
+          <w:lang w:val="uk-UA" w:eastAsia="en-US"/>
+        </w:rPr>
+        <w:t xml:space="preserve"> насиченість візуальними ознаками, </w:t>
+      </w:r>
+      <m:oMath>
+        <m:sSub>
+          <m:sSubPr>
+            <m:ctrlPr>
+              <w:rPr>
+                <w:rFonts w:ascii="Cambria Math" w:hAnsi="Cambria Math" w:cs="Times New Roman"/>
+                <w:i/>
+                <w:color w:val="000000"/>
+                <w:szCs w:val="24"/>
+                <w:lang w:val="uk-UA" w:eastAsia="en-US"/>
+              </w:rPr>
+            </m:ctrlPr>
+          </m:sSubPr>
+          <m:e>
+            <m:r>
+              <w:rPr>
+                <w:rFonts w:ascii="Cambria Math" w:hAnsi="Cambria Math" w:cs="Times New Roman"/>
+                <w:color w:val="000000"/>
+                <w:szCs w:val="24"/>
+                <w:lang w:val="uk-UA" w:eastAsia="en-US"/>
+              </w:rPr>
+              <m:t>φ</m:t>
+            </m:r>
+          </m:e>
+          <m:sub>
+            <m:r>
+              <w:rPr>
+                <w:rFonts w:ascii="Cambria Math" w:hAnsi="Cambria Math" w:cs="Times New Roman"/>
+                <w:color w:val="000000"/>
+                <w:szCs w:val="24"/>
+                <w:lang w:val="uk-UA" w:eastAsia="en-US"/>
+              </w:rPr>
+              <m:t>ter,ij</m:t>
+            </m:r>
+          </m:sub>
+        </m:sSub>
+      </m:oMath>
+      <w:r>
+        <w:rPr>
+          <w:rFonts w:ascii="Times New Roman CYR" w:eastAsiaTheme="minorEastAsia" w:hAnsi="Times New Roman CYR" w:cs="Times New Roman CYR"/>
+          <w:color w:val="000000"/>
+          <w:szCs w:val="24"/>
+          <w:lang w:val="uk-UA" w:eastAsia="en-US"/>
+        </w:rPr>
+        <w:t xml:space="preserve"> – насиченість рельєфними ознаками,</w:t>
+      </w:r>
+      <w:r>
+        <w:rPr>
+          <w:rFonts w:ascii="Times New Roman CYR" w:eastAsiaTheme="minorEastAsia" w:hAnsi="Times New Roman CYR" w:cs="Times New Roman CYR"/>
+          <w:color w:val="000000"/>
+          <w:szCs w:val="24"/>
+          <w:lang w:val="uk-UA" w:eastAsia="en-US"/>
+        </w:rPr>
+        <w:t xml:space="preserve"> </w:t>
+      </w:r>
+      <m:oMath>
+        <m:sSub>
+          <m:sSubPr>
+            <m:ctrlPr>
+              <w:rPr>
+                <w:rFonts w:ascii="Cambria Math" w:hAnsi="Cambria Math" w:cs="Times New Roman"/>
+                <w:i/>
+                <w:color w:val="000000"/>
+                <w:szCs w:val="24"/>
+                <w:lang w:val="uk-UA" w:eastAsia="en-US"/>
+              </w:rPr>
+            </m:ctrlPr>
+          </m:sSubPr>
+          <m:e>
+            <m:r>
+              <w:rPr>
+                <w:rFonts w:ascii="Cambria Math" w:hAnsi="Cambria Math" w:cs="Times New Roman"/>
+                <w:color w:val="000000"/>
+                <w:szCs w:val="24"/>
+                <w:lang w:val="uk-UA" w:eastAsia="en-US"/>
+              </w:rPr>
+              <m:t>φ</m:t>
+            </m:r>
+          </m:e>
+          <m:sub>
+            <m:r>
+              <w:rPr>
+                <w:rFonts w:ascii="Cambria Math" w:hAnsi="Cambria Math" w:cs="Times New Roman"/>
+                <w:color w:val="000000"/>
+                <w:szCs w:val="24"/>
+                <w:lang w:val="uk-UA" w:eastAsia="en-US"/>
+              </w:rPr>
+              <m:t>v</m:t>
+            </m:r>
+            <m:r>
+              <w:rPr>
+                <w:rFonts w:ascii="Cambria Math" w:hAnsi="Cambria Math" w:cs="Times New Roman"/>
+                <w:color w:val="000000"/>
+                <w:szCs w:val="24"/>
+                <w:lang w:val="en-US" w:eastAsia="en-US"/>
+              </w:rPr>
+              <m:t>sb,ij</m:t>
+            </m:r>
+          </m:sub>
+        </m:sSub>
+      </m:oMath>
+      <w:r>
+        <w:rPr>
+          <w:rFonts w:ascii="Times New Roman CYR" w:eastAsiaTheme="minorEastAsia" w:hAnsi="Times New Roman CYR" w:cs="Times New Roman CYR"/>
+          <w:color w:val="000000"/>
+          <w:szCs w:val="24"/>
+          <w:lang w:val="uk-UA" w:eastAsia="en-US"/>
+        </w:rPr>
+        <w:t xml:space="preserve"> </w:t>
+      </w:r>
+      <w:r>
+        <w:rPr>
+          <w:rFonts w:ascii="Times New Roman CYR" w:eastAsiaTheme="minorEastAsia" w:hAnsi="Times New Roman CYR" w:cs="Times New Roman CYR"/>
+          <w:color w:val="000000"/>
+          <w:szCs w:val="24"/>
+          <w:lang w:val="uk-UA" w:eastAsia="en-US"/>
+        </w:rPr>
+        <w:t xml:space="preserve">– видимість, </w:t>
+      </w:r>
+      <m:oMath>
+        <m:sSub>
+          <m:sSubPr>
+            <m:ctrlPr>
+              <w:rPr>
+                <w:rFonts w:ascii="Cambria Math" w:eastAsiaTheme="minorEastAsia" w:hAnsi="Cambria Math" w:cs="Times New Roman CYR"/>
+                <w:i/>
+                <w:szCs w:val="24"/>
+                <w:lang w:val="uk-UA" w:eastAsia="en-US"/>
+              </w:rPr>
+            </m:ctrlPr>
+          </m:sSubPr>
+          <m:e>
+            <m:r>
+              <w:rPr>
+                <w:rFonts w:ascii="Cambria Math" w:eastAsiaTheme="minorEastAsia" w:hAnsi="Cambria Math" w:cs="Times New Roman CYR"/>
+                <w:szCs w:val="24"/>
+                <w:lang w:val="uk-UA" w:eastAsia="en-US"/>
+              </w:rPr>
+              <m:t>u</m:t>
+            </m:r>
+          </m:e>
+          <m:sub>
+            <m:r>
+              <w:rPr>
+                <w:rFonts w:ascii="Cambria Math" w:eastAsiaTheme="minorEastAsia" w:hAnsi="Cambria Math" w:cs="Times New Roman CYR"/>
+                <w:szCs w:val="24"/>
+                <w:lang w:val="uk-UA" w:eastAsia="en-US"/>
+              </w:rPr>
+              <m:t>E,ij</m:t>
+            </m:r>
+          </m:sub>
+        </m:sSub>
+      </m:oMath>
+      <w:r>
+        <w:rPr>
+          <w:rFonts w:ascii="Times New Roman CYR" w:eastAsiaTheme="minorEastAsia" w:hAnsi="Times New Roman CYR" w:cs="Times New Roman CYR"/>
+          <w:szCs w:val="24"/>
+          <w:lang w:val="uk-UA" w:eastAsia="en-US"/>
+        </w:rPr>
+        <w:t xml:space="preserve"> </w:t>
+      </w:r>
+      <w:r>
+        <w:rPr>
+          <w:rFonts w:ascii="Times New Roman CYR" w:eastAsiaTheme="minorEastAsia" w:hAnsi="Times New Roman CYR" w:cs="Times New Roman CYR"/>
+          <w:szCs w:val="24"/>
+          <w:lang w:val="uk-UA" w:eastAsia="en-US"/>
+        </w:rPr>
+        <w:t>–</w:t>
+      </w:r>
+      <w:r>
+        <w:rPr>
+          <w:rFonts w:ascii="Times New Roman CYR" w:eastAsiaTheme="minorEastAsia" w:hAnsi="Times New Roman CYR" w:cs="Times New Roman CYR"/>
+          <w:szCs w:val="24"/>
+          <w:lang w:val="uk-UA" w:eastAsia="en-US"/>
+        </w:rPr>
+        <w:t xml:space="preserve"> </w:t>
+      </w:r>
+      <w:r>
+        <w:rPr>
+          <w:rFonts w:ascii="Times New Roman CYR" w:eastAsiaTheme="minorEastAsia" w:hAnsi="Times New Roman CYR" w:cs="Times New Roman CYR"/>
+          <w:szCs w:val="24"/>
+          <w:lang w:val="uk-UA" w:eastAsia="en-US"/>
+        </w:rPr>
+        <w:t xml:space="preserve">східна складова вітру, </w:t>
+      </w:r>
+      <m:oMath>
+        <m:sSub>
+          <m:sSubPr>
+            <m:ctrlPr>
+              <w:rPr>
+                <w:rFonts w:ascii="Cambria Math" w:eastAsiaTheme="minorEastAsia" w:hAnsi="Cambria Math" w:cs="Times New Roman CYR"/>
+                <w:i/>
+                <w:szCs w:val="24"/>
+                <w:lang w:val="uk-UA" w:eastAsia="en-US"/>
+              </w:rPr>
+            </m:ctrlPr>
+          </m:sSubPr>
+          <m:e>
+            <m:r>
+              <w:rPr>
+                <w:rFonts w:ascii="Cambria Math" w:eastAsiaTheme="minorEastAsia" w:hAnsi="Cambria Math" w:cs="Times New Roman CYR"/>
+                <w:szCs w:val="24"/>
+                <w:lang w:val="uk-UA" w:eastAsia="en-US"/>
+              </w:rPr>
+              <m:t>u</m:t>
+            </m:r>
+          </m:e>
+          <m:sub>
+            <m:r>
+              <w:rPr>
+                <w:rFonts w:ascii="Cambria Math" w:eastAsiaTheme="minorEastAsia" w:hAnsi="Cambria Math" w:cs="Times New Roman CYR"/>
+                <w:szCs w:val="24"/>
+                <w:lang w:val="uk-UA" w:eastAsia="en-US"/>
+              </w:rPr>
+              <m:t>N,ij</m:t>
+            </m:r>
+          </m:sub>
+        </m:sSub>
+      </m:oMath>
+      <w:r>
+        <w:rPr>
+          <w:rFonts w:ascii="Times New Roman CYR" w:eastAsiaTheme="minorEastAsia" w:hAnsi="Times New Roman CYR" w:cs="Times New Roman CYR"/>
+          <w:szCs w:val="24"/>
+          <w:lang w:val="uk-UA" w:eastAsia="en-US"/>
+        </w:rPr>
+        <w:t xml:space="preserve"> – північна складова вітру, </w:t>
+      </w:r>
+      <m:oMath>
+        <m:sSub>
+          <m:sSubPr>
+            <m:ctrlPr>
+              <w:rPr>
+                <w:rFonts w:ascii="Cambria Math" w:eastAsiaTheme="minorEastAsia" w:hAnsi="Cambria Math" w:cs="Times New Roman CYR"/>
+                <w:i/>
+                <w:szCs w:val="24"/>
+                <w:lang w:val="uk-UA" w:eastAsia="en-US"/>
+              </w:rPr>
+            </m:ctrlPr>
+          </m:sSubPr>
+          <m:e>
+            <m:r>
+              <w:rPr>
+                <w:rFonts w:ascii="Cambria Math" w:eastAsiaTheme="minorEastAsia" w:hAnsi="Cambria Math" w:cs="Times New Roman CYR"/>
+                <w:szCs w:val="24"/>
+                <w:lang w:val="uk-UA" w:eastAsia="en-US"/>
+              </w:rPr>
+              <m:t>χ</m:t>
+            </m:r>
+          </m:e>
+          <m:sub>
+            <m:r>
+              <w:rPr>
+                <w:rFonts w:ascii="Cambria Math" w:eastAsiaTheme="minorEastAsia" w:hAnsi="Cambria Math" w:cs="Times New Roman CYR"/>
+                <w:szCs w:val="24"/>
+                <w:lang w:val="uk-UA" w:eastAsia="en-US"/>
+              </w:rPr>
+              <m:t>F,ij</m:t>
+            </m:r>
+          </m:sub>
+        </m:sSub>
+        <m:r>
+          <w:rPr>
+            <w:rFonts w:ascii="Cambria Math" w:eastAsiaTheme="minorEastAsia" w:hAnsi="Cambria Math" w:cs="Times New Roman CYR"/>
+            <w:szCs w:val="24"/>
+            <w:lang w:val="uk-UA" w:eastAsia="en-US"/>
+          </w:rPr>
+          <m:t>∈</m:t>
+        </m:r>
+        <m:r>
+          <w:rPr>
+            <w:rFonts w:ascii="Cambria Math" w:eastAsiaTheme="minorEastAsia" w:hAnsi="Cambria Math" w:cs="Times New Roman CYR"/>
+            <w:szCs w:val="24"/>
+            <w:lang w:val="en-US" w:eastAsia="en-US"/>
+          </w:rPr>
+          <m:t>{0,1}</m:t>
+        </m:r>
+      </m:oMath>
+      <w:r>
+        <w:rPr>
+          <w:rFonts w:ascii="Times New Roman CYR" w:eastAsiaTheme="minorEastAsia" w:hAnsi="Times New Roman CYR" w:cs="Times New Roman CYR"/>
+          <w:szCs w:val="24"/>
+          <w:lang w:val="uk-UA" w:eastAsia="en-US"/>
+        </w:rPr>
+        <w:t xml:space="preserve"> – ознака перетину комірки з зоною, де проліт заборонено. </w:t>
+      </w:r>
+    </w:p>
+    <w:p>
+      <w:pPr>
+        <w:pStyle w:val="BodyTextIndent"/>
+        <w:ind w:firstLine="567"/>
+        <w:jc w:val="both"/>
+        <w:rPr>
+          <w:rFonts w:ascii="Times New Roman CYR" w:hAnsi="Times New Roman CYR" w:cs="Times New Roman CYR"/>
+          <w:szCs w:val="24"/>
+          <w:lang w:val="uk-UA" w:eastAsia="en-US"/>
+        </w:rPr>
+      </w:pPr>
+      <w:r>
+        <w:rPr>
+          <w:rFonts w:ascii="Times New Roman CYR" w:hAnsi="Times New Roman CYR" w:cs="Times New Roman CYR"/>
+          <w:szCs w:val="24"/>
+          <w:lang w:val="uk-UA" w:eastAsia="en-US"/>
+        </w:rPr>
+        <w:t xml:space="preserve">Опишемо обрахунок </w:t>
+      </w:r>
+      <m:oMath>
+        <m:sSub>
+          <m:sSubPr>
+            <m:ctrlPr>
+              <w:rPr>
+                <w:rFonts w:ascii="Cambria Math" w:hAnsi="Cambria Math" w:cs="Times New Roman"/>
+                <w:i/>
+                <w:color w:val="000000"/>
+                <w:szCs w:val="24"/>
+                <w:lang w:val="uk-UA" w:eastAsia="en-US"/>
+              </w:rPr>
+            </m:ctrlPr>
+          </m:sSubPr>
+          <m:e>
+            <m:r>
+              <w:rPr>
+                <w:rFonts w:ascii="Cambria Math" w:hAnsi="Cambria Math" w:cs="Times New Roman"/>
+                <w:color w:val="000000"/>
+                <w:szCs w:val="24"/>
+                <w:lang w:val="uk-UA" w:eastAsia="en-US"/>
+              </w:rPr>
+              <m:t>φ</m:t>
+            </m:r>
+          </m:e>
+          <m:sub>
+            <m:r>
+              <w:rPr>
+                <w:rFonts w:ascii="Cambria Math" w:hAnsi="Cambria Math" w:cs="Times New Roman"/>
+                <w:color w:val="000000"/>
+                <w:szCs w:val="24"/>
+                <w:lang w:val="uk-UA" w:eastAsia="en-US"/>
+              </w:rPr>
+              <m:t>vis</m:t>
+            </m:r>
+          </m:sub>
+        </m:sSub>
+      </m:oMath>
+      <w:r>
+        <w:rPr>
+          <w:rFonts w:ascii="Times New Roman CYR" w:eastAsiaTheme="minorEastAsia" w:hAnsi="Times New Roman CYR" w:cs="Times New Roman CYR"/>
+          <w:color w:val="000000"/>
+          <w:szCs w:val="24"/>
+          <w:lang w:val="uk-UA" w:eastAsia="en-US"/>
+        </w:rPr>
+        <w:t xml:space="preserve"> для кожної комірки. Даний показник характеризує придатність зображення місцевості для візуального визначення місцезнаходження. Його значення обраховується на основі геометричної виразності та текстурної інформативності. </w:t>
+      </w:r>
+      <w:r>
+        <w:rPr>
+          <w:rFonts w:ascii="Times New Roman CYR" w:eastAsiaTheme="minorEastAsia" w:hAnsi="Times New Roman CYR" w:cs="Times New Roman CYR"/>
+          <w:color w:val="000000"/>
+          <w:szCs w:val="24"/>
+          <w:lang w:val="uk-UA" w:eastAsia="en-US"/>
+        </w:rPr>
+        <w:t xml:space="preserve">Геометрична виразність визначається за критерієм </w:t>
+      </w:r>
+      <w:proofErr w:type="spellStart"/>
+      <w:r>
+        <w:rPr>
+          <w:rFonts w:ascii="Times New Roman CYR" w:eastAsiaTheme="minorEastAsia" w:hAnsi="Times New Roman CYR" w:cs="Times New Roman CYR"/>
+          <w:color w:val="000000"/>
+          <w:szCs w:val="24"/>
+          <w:lang w:val="uk-UA" w:eastAsia="en-US"/>
+        </w:rPr>
+        <w:t>Ши</w:t>
+      </w:r>
+      <w:proofErr w:type="spellEnd"/>
+      <w:r>
+        <w:rPr>
+          <w:rFonts w:ascii="Times New Roman CYR" w:eastAsiaTheme="minorEastAsia" w:hAnsi="Times New Roman CYR" w:cs="Times New Roman CYR"/>
+          <w:color w:val="000000"/>
+          <w:szCs w:val="24"/>
+          <w:lang w:val="uk-UA" w:eastAsia="en-US"/>
+        </w:rPr>
+        <w:t xml:space="preserve">-Томасі </w:t>
+      </w:r>
+      <w:r>
+        <w:rPr>
+          <w:rFonts w:ascii="Times New Roman CYR" w:eastAsiaTheme="minorEastAsia" w:hAnsi="Times New Roman CYR" w:cs="Times New Roman CYR"/>
+          <w:color w:val="000000"/>
+          <w:szCs w:val="24"/>
+          <w:highlight w:val="yellow"/>
+          <w:lang w:val="en-US" w:eastAsia="en-US"/>
+        </w:rPr>
+        <w:t>[</w:t>
+      </w:r>
+      <w:r>
+        <w:rPr>
+          <w:rFonts w:ascii="Times New Roman CYR" w:eastAsiaTheme="minorEastAsia" w:hAnsi="Times New Roman CYR" w:cs="Times New Roman CYR"/>
+          <w:color w:val="000000"/>
+          <w:szCs w:val="24"/>
+          <w:highlight w:val="yellow"/>
+          <w:lang w:val="uk-UA" w:eastAsia="en-US"/>
+        </w:rPr>
+        <w:t>додати джерело</w:t>
+      </w:r>
+      <w:r>
+        <w:rPr>
+          <w:rFonts w:ascii="Times New Roman CYR" w:eastAsiaTheme="minorEastAsia" w:hAnsi="Times New Roman CYR" w:cs="Times New Roman CYR"/>
+          <w:color w:val="000000"/>
+          <w:szCs w:val="24"/>
+          <w:highlight w:val="yellow"/>
+          <w:lang w:val="en-US" w:eastAsia="en-US"/>
+        </w:rPr>
+        <w:t>]</w:t>
+      </w:r>
+    </w:p>
+    <w:p>
+      <w:pPr>
+        <w:pStyle w:val="BodyTextIndent"/>
+        <w:ind w:firstLine="567"/>
+        <w:jc w:val="both"/>
+        <w:rPr>
+          <w:rFonts w:ascii="Times New Roman CYR" w:hAnsi="Times New Roman CYR" w:cs="Times New Roman CYR"/>
+          <w:szCs w:val="24"/>
+          <w:lang w:val="uk-UA" w:eastAsia="en-US"/>
+        </w:rPr>
+      </w:pPr>
+      <w:r>
+        <w:rPr>
+          <w:rFonts w:ascii="Times New Roman CYR" w:hAnsi="Times New Roman CYR" w:cs="Times New Roman CYR"/>
+          <w:szCs w:val="24"/>
+          <w:lang w:val="uk-UA" w:eastAsia="en-US"/>
+        </w:rPr>
+        <w:t xml:space="preserve">Наведемо формалізований запис </w:t>
+      </w:r>
+      <w:r>
+        <w:rPr>
+          <w:rFonts w:ascii="Times New Roman CYR" w:hAnsi="Times New Roman CYR" w:cs="Times New Roman CYR"/>
+          <w:szCs w:val="24"/>
+          <w:lang w:val="uk-UA" w:eastAsia="en-US"/>
+        </w:rPr>
+        <w:t>задачі</w:t>
+      </w:r>
+      <w:r>
+        <w:rPr>
+          <w:rFonts w:ascii="Times New Roman CYR" w:hAnsi="Times New Roman CYR" w:cs="Times New Roman CYR"/>
+          <w:szCs w:val="24"/>
+          <w:lang w:val="uk-UA" w:eastAsia="en-US"/>
+        </w:rPr>
+        <w:t xml:space="preserve"> планування маршруту руху. Маршрут являє собою шлях</w:t>
       </w:r>
       <w:r>
         <w:rPr>
@@ -3817,7 +6009,25 @@
           <w:szCs w:val="24"/>
           <w:lang w:val="uk-UA" w:eastAsia="en-US"/>
         </w:rPr>
-        <w:t>Множина ребер маршруту:</w:t>
+        <w:t xml:space="preserve">Множина </w:t>
+      </w:r>
+      <w:proofErr w:type="spellStart"/>
+      <w:r>
+        <w:rPr>
+          <w:rFonts w:eastAsiaTheme="minorEastAsia" w:cs="Times New Roman"/>
+          <w:szCs w:val="24"/>
+          <w:lang w:val="uk-UA" w:eastAsia="en-US"/>
+        </w:rPr>
+        <w:t>ребер</w:t>
+      </w:r>
+      <w:proofErr w:type="spellEnd"/>
+      <w:r>
+        <w:rPr>
+          <w:rFonts w:eastAsiaTheme="minorEastAsia" w:cs="Times New Roman"/>
+          <w:szCs w:val="24"/>
+          <w:lang w:val="uk-UA" w:eastAsia="en-US"/>
+        </w:rPr>
+        <w:t xml:space="preserve"> маршруту:</w:t>
       </w:r>
     </w:p>
     <w:p>
@@ -4011,7 +6221,27 @@
           <w:szCs w:val="24"/>
           <w:lang w:val="uk-UA" w:eastAsia="en-US"/>
         </w:rPr>
-        <w:t>у важливість тривалості польоту, запишемо функцію для часу польоту:</w:t>
+        <w:t xml:space="preserve">у важливість тривалості польоту, </w:t>
+      </w:r>
+      <w:proofErr w:type="spellStart"/>
+      <w:r>
+        <w:rPr>
+          <w:rFonts w:eastAsiaTheme="minorEastAsia" w:cs="Times New Roman"/>
+          <w:color w:val="000000"/>
+          <w:szCs w:val="24"/>
+          <w:lang w:val="uk-UA" w:eastAsia="en-US"/>
+        </w:rPr>
+        <w:t>запишемо</w:t>
+      </w:r>
+      <w:proofErr w:type="spellEnd"/>
+      <w:r>
+        <w:rPr>
+          <w:rFonts w:eastAsiaTheme="minorEastAsia" w:cs="Times New Roman"/>
+          <w:color w:val="000000"/>
+          <w:szCs w:val="24"/>
+          <w:lang w:val="uk-UA" w:eastAsia="en-US"/>
+        </w:rPr>
+        <w:t xml:space="preserve"> функцію для часу польоту:</w:t>
       </w:r>
     </w:p>
     <w:p>
@@ -4330,6 +6560,7 @@
               <w:rFonts w:ascii="Cambria Math" w:eastAsiaTheme="minorEastAsia" w:hAnsi="Cambria Math" w:cs="Times New Roman"/>
               <w:color w:val="000000"/>
               <w:szCs w:val="24"/>
+              <w:highlight w:val="yellow"/>
               <w:lang w:val="uk-UA" w:eastAsia="en-US"/>
             </w:rPr>
             <m:t xml:space="preserve">де </m:t>
@@ -4342,6 +6573,7 @@
                   <w:i/>
                   <w:color w:val="000000"/>
                   <w:szCs w:val="24"/>
+                  <w:highlight w:val="yellow"/>
                   <w:lang w:val="uk-UA" w:eastAsia="en-US"/>
                 </w:rPr>
               </m:ctrlPr>
@@ -4352,6 +6584,7 @@
                   <w:rFonts w:ascii="Cambria Math" w:hAnsi="Cambria Math" w:cs="Times New Roman"/>
                   <w:color w:val="000000"/>
                   <w:szCs w:val="24"/>
+                  <w:highlight w:val="yellow"/>
                   <w:lang w:val="uk-UA" w:eastAsia="en-US"/>
                 </w:rPr>
                 <m:t>v</m:t>
@@ -4363,6 +6596,7 @@
                   <w:rFonts w:ascii="Cambria Math" w:hAnsi="Cambria Math" w:cs="Times New Roman"/>
                   <w:color w:val="000000"/>
                   <w:szCs w:val="24"/>
+                  <w:highlight w:val="yellow"/>
                   <w:lang w:val="uk-UA" w:eastAsia="en-US"/>
                 </w:rPr>
                 <m:t>g</m:t>
@@ -4374,6 +6608,7 @@
               <w:rFonts w:ascii="Cambria Math" w:eastAsiaTheme="minorEastAsia" w:hAnsi="Cambria Math" w:cs="Times New Roman"/>
               <w:color w:val="000000"/>
               <w:szCs w:val="24"/>
+              <w:highlight w:val="yellow"/>
               <w:lang w:val="uk-UA" w:eastAsia="en-US"/>
             </w:rPr>
             <m:t>=</m:t>
@@ -4387,6 +6622,7 @@
                   <w:i/>
                   <w:color w:val="000000"/>
                   <w:szCs w:val="24"/>
+                  <w:highlight w:val="yellow"/>
                   <w:lang w:val="uk-UA" w:eastAsia="en-US"/>
                 </w:rPr>
               </m:ctrlPr>
@@ -4401,6 +6637,7 @@
                       <w:i/>
                       <w:color w:val="000000"/>
                       <w:szCs w:val="24"/>
+                      <w:highlight w:val="yellow"/>
                       <w:lang w:val="en-US" w:eastAsia="en-US"/>
                     </w:rPr>
                   </m:ctrlPr>
@@ -4411,6 +6648,7 @@
                       <w:rFonts w:ascii="Cambria Math" w:eastAsiaTheme="minorEastAsia" w:hAnsi="Cambria Math" w:cs="Times New Roman"/>
                       <w:color w:val="000000"/>
                       <w:szCs w:val="24"/>
+                      <w:highlight w:val="yellow"/>
                       <w:lang w:val="en-US" w:eastAsia="en-US"/>
                     </w:rPr>
                     <m:t>v</m:t>
@@ -4422,6 +6660,7 @@
                       <w:rFonts w:ascii="Cambria Math" w:eastAsiaTheme="minorEastAsia" w:hAnsi="Cambria Math" w:cs="Times New Roman"/>
                       <w:color w:val="000000"/>
                       <w:szCs w:val="24"/>
+                      <w:highlight w:val="yellow"/>
                       <w:lang w:val="en-US" w:eastAsia="en-US"/>
                     </w:rPr>
                     <m:t>air</m:t>
@@ -4433,6 +6672,7 @@
                       <w:rFonts w:ascii="Cambria Math" w:eastAsiaTheme="minorEastAsia" w:hAnsi="Cambria Math" w:cs="Times New Roman"/>
                       <w:color w:val="000000"/>
                       <w:szCs w:val="24"/>
+                      <w:highlight w:val="yellow"/>
                       <w:lang w:val="en-US" w:eastAsia="en-US"/>
                     </w:rPr>
                     <m:t>2</m:t>
@@ -4444,6 +6684,7 @@
                   <w:rFonts w:ascii="Cambria Math" w:eastAsiaTheme="minorEastAsia" w:hAnsi="Cambria Math" w:cs="Times New Roman"/>
                   <w:color w:val="000000"/>
                   <w:szCs w:val="24"/>
+                  <w:highlight w:val="yellow"/>
                   <w:lang w:val="en-US" w:eastAsia="en-US"/>
                 </w:rPr>
                 <m:t>-</m:t>
@@ -4456,6 +6697,7 @@
                       <w:i/>
                       <w:color w:val="000000"/>
                       <w:szCs w:val="24"/>
+                      <w:highlight w:val="yellow"/>
                       <w:lang w:val="en-US" w:eastAsia="en-US"/>
                     </w:rPr>
                   </m:ctrlPr>
@@ -4469,6 +6711,7 @@
                           <w:i/>
                           <w:color w:val="000000"/>
                           <w:szCs w:val="24"/>
+                          <w:highlight w:val="yellow"/>
                           <w:lang w:val="en-US" w:eastAsia="en-US"/>
                         </w:rPr>
                       </m:ctrlPr>
@@ -4479,6 +6722,7 @@
                           <w:rFonts w:ascii="Cambria Math" w:eastAsiaTheme="minorEastAsia" w:hAnsi="Cambria Math" w:cs="Times New Roman"/>
                           <w:color w:val="000000"/>
                           <w:szCs w:val="24"/>
+                          <w:highlight w:val="yellow"/>
                           <w:lang w:val="en-US" w:eastAsia="en-US"/>
                         </w:rPr>
                         <m:t>(u</m:t>
@@ -4490,6 +6734,7 @@
                           <w:rFonts w:ascii="Cambria Math" w:eastAsiaTheme="minorEastAsia" w:hAnsi="Cambria Math" w:cs="Times New Roman"/>
                           <w:color w:val="000000"/>
                           <w:szCs w:val="24"/>
+                          <w:highlight w:val="yellow"/>
                           <w:lang w:val="en-US" w:eastAsia="en-US"/>
                         </w:rPr>
                         <m:t>cross</m:t>
@@ -4501,6 +6746,7 @@
                       <w:rFonts w:ascii="Cambria Math" w:eastAsiaTheme="minorEastAsia" w:hAnsi="Cambria Math" w:cs="Times New Roman"/>
                       <w:color w:val="000000"/>
                       <w:szCs w:val="24"/>
+                      <w:highlight w:val="yellow"/>
                       <w:lang w:val="en-US" w:eastAsia="en-US"/>
                     </w:rPr>
                     <m:t>(e))</m:t>
@@ -4512,6 +6758,7 @@
                       <w:rFonts w:ascii="Cambria Math" w:eastAsiaTheme="minorEastAsia" w:hAnsi="Cambria Math" w:cs="Times New Roman"/>
                       <w:color w:val="000000"/>
                       <w:szCs w:val="24"/>
+                      <w:highlight w:val="yellow"/>
                       <w:lang w:val="en-US" w:eastAsia="en-US"/>
                     </w:rPr>
                     <m:t>2</m:t>
@@ -4525,6 +6772,7 @@
               <w:rFonts w:ascii="Cambria Math" w:eastAsiaTheme="minorEastAsia" w:hAnsi="Cambria Math" w:cs="Times New Roman"/>
               <w:color w:val="000000"/>
               <w:szCs w:val="24"/>
+              <w:highlight w:val="yellow"/>
               <w:lang w:val="uk-UA" w:eastAsia="en-US"/>
             </w:rPr>
             <m:t>+</m:t>
@@ -4537,6 +6785,7 @@
                   <w:i/>
                   <w:color w:val="000000"/>
                   <w:szCs w:val="24"/>
+                  <w:highlight w:val="yellow"/>
                   <w:lang w:val="uk-UA" w:eastAsia="en-US"/>
                 </w:rPr>
               </m:ctrlPr>
@@ -4547,6 +6796,7 @@
                   <w:rFonts w:ascii="Cambria Math" w:eastAsiaTheme="minorEastAsia" w:hAnsi="Cambria Math" w:cs="Times New Roman"/>
                   <w:color w:val="000000"/>
                   <w:szCs w:val="24"/>
+                  <w:highlight w:val="yellow"/>
                   <w:lang w:val="uk-UA" w:eastAsia="en-US"/>
                 </w:rPr>
                 <m:t>u</m:t>
@@ -4558,6 +6808,7 @@
                   <w:rFonts w:ascii="Cambria Math" w:eastAsiaTheme="minorEastAsia" w:hAnsi="Cambria Math" w:cs="Times New Roman"/>
                   <w:color w:val="000000"/>
                   <w:szCs w:val="24"/>
+                  <w:highlight w:val="yellow"/>
                   <w:lang w:val="uk-UA" w:eastAsia="en-US"/>
                 </w:rPr>
                 <m:t>along</m:t>
@@ -4569,9 +6820,19 @@
               <w:rFonts w:ascii="Cambria Math" w:eastAsiaTheme="minorEastAsia" w:hAnsi="Cambria Math" w:cs="Times New Roman"/>
               <w:color w:val="000000"/>
               <w:szCs w:val="24"/>
+              <w:highlight w:val="yellow"/>
               <w:lang w:val="uk-UA" w:eastAsia="en-US"/>
             </w:rPr>
-            <m:t xml:space="preserve">(e) </m:t>
+            <m:t>(e)</m:t>
+          </m:r>
+          <m:r>
+            <w:rPr>
+              <w:rFonts w:ascii="Cambria Math" w:eastAsiaTheme="minorEastAsia" w:hAnsi="Cambria Math" w:cs="Times New Roman"/>
+              <w:color w:val="000000"/>
+              <w:szCs w:val="24"/>
+              <w:lang w:val="uk-UA" w:eastAsia="en-US"/>
+            </w:rPr>
+            <m:t xml:space="preserve"> </m:t>
           </m:r>
         </m:oMath>
       </m:oMathPara>
@@ -5887,17 +8148,7 @@
           <w:szCs w:val="24"/>
           <w:lang w:val="uk-UA" w:eastAsia="en-US"/>
         </w:rPr>
-        <w:t xml:space="preserve">Так як підхід до </w:t>
-      </w:r>
-      <w:r>
-        <w:rPr>
-          <w:rFonts w:eastAsiaTheme="minorEastAsia" w:cs="Times New Roman"/>
-          <w:color w:val="000000"/>
-          <w:szCs w:val="24"/>
-          <w:lang w:val="uk-UA" w:eastAsia="en-US"/>
-        </w:rPr>
-        <w:lastRenderedPageBreak/>
-        <w:t xml:space="preserve">визначення місцезнаходження БПС покладається на візуальні дані отримані з бортової камери, то слід обирати такі ребра, де погіршення видимості </w:t>
+        <w:t xml:space="preserve">Так як підхід до визначення місцезнаходження БПС покладається на візуальні дані отримані з бортової камери, то слід обирати такі ребра, де погіршення видимості </w:t>
       </w:r>
       <w:r>
         <w:rPr>
@@ -5926,14 +8177,25 @@
         </w:rPr>
         <w:t xml:space="preserve">, </w:t>
       </w:r>
-      <w:r>
-        <w:rPr>
-          <w:rFonts w:eastAsiaTheme="minorEastAsia" w:cs="Times New Roman"/>
-          <w:color w:val="000000"/>
-          <w:szCs w:val="24"/>
-          <w:lang w:val="uk-UA" w:eastAsia="en-US"/>
-        </w:rPr>
-        <w:t>запишемо функцію для видимості</w:t>
+      <w:proofErr w:type="spellStart"/>
+      <w:r>
+        <w:rPr>
+          <w:rFonts w:eastAsiaTheme="minorEastAsia" w:cs="Times New Roman"/>
+          <w:color w:val="000000"/>
+          <w:szCs w:val="24"/>
+          <w:lang w:val="uk-UA" w:eastAsia="en-US"/>
+        </w:rPr>
+        <w:t>запишемо</w:t>
+      </w:r>
+      <w:proofErr w:type="spellEnd"/>
+      <w:r>
+        <w:rPr>
+          <w:rFonts w:eastAsiaTheme="minorEastAsia" w:cs="Times New Roman"/>
+          <w:color w:val="000000"/>
+          <w:szCs w:val="24"/>
+          <w:lang w:val="uk-UA" w:eastAsia="en-US"/>
+        </w:rPr>
+        <w:t xml:space="preserve"> функцію для видимості</w:t>
       </w:r>
       <w:r>
         <w:rPr>
@@ -10127,7 +12389,27 @@
           <w:szCs w:val="24"/>
           <w:lang w:val="uk-UA" w:eastAsia="en-US"/>
         </w:rPr>
-        <w:t>Рішенням задачі має бути множина Парето-оптимальних маршрутів</w:t>
+        <w:t xml:space="preserve">Рішенням задачі має бути множина </w:t>
+      </w:r>
+      <w:proofErr w:type="spellStart"/>
+      <w:r>
+        <w:rPr>
+          <w:rFonts w:eastAsiaTheme="minorEastAsia" w:cs="Times New Roman"/>
+          <w:color w:val="000000"/>
+          <w:szCs w:val="24"/>
+          <w:lang w:val="uk-UA" w:eastAsia="en-US"/>
+        </w:rPr>
+        <w:t>Парето</w:t>
+      </w:r>
+      <w:proofErr w:type="spellEnd"/>
+      <w:r>
+        <w:rPr>
+          <w:rFonts w:eastAsiaTheme="minorEastAsia" w:cs="Times New Roman"/>
+          <w:color w:val="000000"/>
+          <w:szCs w:val="24"/>
+          <w:lang w:val="uk-UA" w:eastAsia="en-US"/>
+        </w:rPr>
+        <w:t>-оптимальних маршрутів</w:t>
       </w:r>
       <w:r>
         <w:rPr>
@@ -10398,17 +12680,27 @@
           <w:szCs w:val="24"/>
           <w:lang w:val="uk-UA" w:eastAsia="en-US"/>
         </w:rPr>
-        <w:t xml:space="preserve">повинен </w:t>
-      </w:r>
-      <w:r>
-        <w:rPr>
-          <w:rFonts w:eastAsiaTheme="minorEastAsia" w:cs="Times New Roman"/>
-          <w:color w:val="000000"/>
-          <w:szCs w:val="24"/>
-          <w:lang w:val="uk-UA" w:eastAsia="en-US"/>
-        </w:rPr>
-        <w:lastRenderedPageBreak/>
-        <w:t xml:space="preserve">забезпечувати множину Парето-оптимальних </w:t>
+        <w:t xml:space="preserve">повинен забезпечувати множину </w:t>
+      </w:r>
+      <w:proofErr w:type="spellStart"/>
+      <w:r>
+        <w:rPr>
+          <w:rFonts w:eastAsiaTheme="minorEastAsia" w:cs="Times New Roman"/>
+          <w:color w:val="000000"/>
+          <w:szCs w:val="24"/>
+          <w:lang w:val="uk-UA" w:eastAsia="en-US"/>
+        </w:rPr>
+        <w:t>Парето</w:t>
+      </w:r>
+      <w:proofErr w:type="spellEnd"/>
+      <w:r>
+        <w:rPr>
+          <w:rFonts w:eastAsiaTheme="minorEastAsia" w:cs="Times New Roman"/>
+          <w:color w:val="000000"/>
+          <w:szCs w:val="24"/>
+          <w:lang w:val="uk-UA" w:eastAsia="en-US"/>
+        </w:rPr>
+        <w:t xml:space="preserve">-оптимальних </w:t>
       </w:r>
       <w:r>
         <w:rPr>
@@ -10579,7 +12871,29 @@
           <w:highlight w:val="yellow"/>
           <w:lang w:val="uk-UA" w:eastAsia="en-US"/>
         </w:rPr>
-        <w:t>множини Парето-оптимальних рішень</w:t>
+        <w:t xml:space="preserve">множини </w:t>
+      </w:r>
+      <w:proofErr w:type="spellStart"/>
+      <w:r>
+        <w:rPr>
+          <w:rFonts w:eastAsiaTheme="minorEastAsia" w:cs="Times New Roman"/>
+          <w:color w:val="000000"/>
+          <w:szCs w:val="24"/>
+          <w:highlight w:val="yellow"/>
+          <w:lang w:val="uk-UA" w:eastAsia="en-US"/>
+        </w:rPr>
+        <w:t>Парето</w:t>
+      </w:r>
+      <w:proofErr w:type="spellEnd"/>
+      <w:r>
+        <w:rPr>
+          <w:rFonts w:eastAsiaTheme="minorEastAsia" w:cs="Times New Roman"/>
+          <w:color w:val="000000"/>
+          <w:szCs w:val="24"/>
+          <w:highlight w:val="yellow"/>
+          <w:lang w:val="uk-UA" w:eastAsia="en-US"/>
+        </w:rPr>
+        <w:t>-оптимальних рішень</w:t>
       </w:r>
       <w:r>
         <w:rPr>
@@ -10642,8 +12956,29 @@
           <w:szCs w:val="24"/>
           <w:lang w:val="uk-UA" w:eastAsia="en-US"/>
         </w:rPr>
-        <w:t xml:space="preserve">ена в дискретизованому просторі, для її рішення недоцільно застосовувати </w:t>
-      </w:r>
+        <w:t xml:space="preserve">ена в </w:t>
+      </w:r>
+      <w:proofErr w:type="spellStart"/>
+      <w:r>
+        <w:rPr>
+          <w:rFonts w:eastAsiaTheme="minorEastAsia" w:cs="Times New Roman"/>
+          <w:color w:val="000000"/>
+          <w:szCs w:val="24"/>
+          <w:lang w:val="uk-UA" w:eastAsia="en-US"/>
+        </w:rPr>
+        <w:t>дискретизованому</w:t>
+      </w:r>
+      <w:proofErr w:type="spellEnd"/>
+      <w:r>
+        <w:rPr>
+          <w:rFonts w:eastAsiaTheme="minorEastAsia" w:cs="Times New Roman"/>
+          <w:color w:val="000000"/>
+          <w:szCs w:val="24"/>
+          <w:lang w:val="uk-UA" w:eastAsia="en-US"/>
+        </w:rPr>
+        <w:t xml:space="preserve"> просторі, для її рішення недоцільно застосовувати </w:t>
+      </w:r>
+      <w:proofErr w:type="spellStart"/>
       <w:r>
         <w:rPr>
           <w:rFonts w:eastAsiaTheme="minorEastAsia" w:cs="Times New Roman"/>
@@ -10651,8 +12986,9 @@
           <w:szCs w:val="24"/>
           <w:lang w:val="en-US" w:eastAsia="en-US"/>
         </w:rPr>
-        <w:t>методи, засн</w:t>
-      </w:r>
+        <w:t>методи</w:t>
+      </w:r>
+      <w:proofErr w:type="spellEnd"/>
       <w:r>
         <w:rPr>
           <w:rFonts w:eastAsiaTheme="minorEastAsia" w:cs="Times New Roman"/>
@@ -10660,7 +12996,76 @@
           <w:szCs w:val="24"/>
           <w:lang w:val="en-US" w:eastAsia="en-US"/>
         </w:rPr>
-        <w:t xml:space="preserve">овані на вибірці </w:t>
+        <w:t xml:space="preserve">, </w:t>
+      </w:r>
+      <w:proofErr w:type="spellStart"/>
+      <w:r>
+        <w:rPr>
+          <w:rFonts w:eastAsiaTheme="minorEastAsia" w:cs="Times New Roman"/>
+          <w:color w:val="000000"/>
+          <w:szCs w:val="24"/>
+          <w:lang w:val="en-US" w:eastAsia="en-US"/>
+        </w:rPr>
+        <w:t>засн</w:t>
+      </w:r>
+      <w:r>
+        <w:rPr>
+          <w:rFonts w:eastAsiaTheme="minorEastAsia" w:cs="Times New Roman"/>
+          <w:color w:val="000000"/>
+          <w:szCs w:val="24"/>
+          <w:lang w:val="en-US" w:eastAsia="en-US"/>
+        </w:rPr>
+        <w:t>овані</w:t>
+      </w:r>
+      <w:proofErr w:type="spellEnd"/>
+      <w:r>
+        <w:rPr>
+          <w:rFonts w:eastAsiaTheme="minorEastAsia" w:cs="Times New Roman"/>
+          <w:color w:val="000000"/>
+          <w:szCs w:val="24"/>
+          <w:lang w:val="en-US" w:eastAsia="en-US"/>
+        </w:rPr>
+        <w:t xml:space="preserve"> </w:t>
+      </w:r>
+      <w:proofErr w:type="spellStart"/>
+      <w:r>
+        <w:rPr>
+          <w:rFonts w:eastAsiaTheme="minorEastAsia" w:cs="Times New Roman"/>
+          <w:color w:val="000000"/>
+          <w:szCs w:val="24"/>
+          <w:lang w:val="en-US" w:eastAsia="en-US"/>
+        </w:rPr>
+        <w:t>на</w:t>
+      </w:r>
+      <w:proofErr w:type="spellEnd"/>
+      <w:r>
+        <w:rPr>
+          <w:rFonts w:eastAsiaTheme="minorEastAsia" w:cs="Times New Roman"/>
+          <w:color w:val="000000"/>
+          <w:szCs w:val="24"/>
+          <w:lang w:val="en-US" w:eastAsia="en-US"/>
+        </w:rPr>
+        <w:t xml:space="preserve"> </w:t>
+      </w:r>
+      <w:proofErr w:type="spellStart"/>
+      <w:r>
+        <w:rPr>
+          <w:rFonts w:eastAsiaTheme="minorEastAsia" w:cs="Times New Roman"/>
+          <w:color w:val="000000"/>
+          <w:szCs w:val="24"/>
+          <w:lang w:val="en-US" w:eastAsia="en-US"/>
+        </w:rPr>
+        <w:t>вибірці</w:t>
+      </w:r>
+      <w:proofErr w:type="spellEnd"/>
+      <w:r>
+        <w:rPr>
+          <w:rFonts w:eastAsiaTheme="minorEastAsia" w:cs="Times New Roman"/>
+          <w:color w:val="000000"/>
+          <w:szCs w:val="24"/>
+          <w:lang w:val="en-US" w:eastAsia="en-US"/>
+        </w:rPr>
+        <w:t xml:space="preserve"> </w:t>
       </w:r>
       <w:r>
         <w:rPr>
@@ -10744,7 +13149,17 @@
           <w:szCs w:val="24"/>
           <w:lang w:val="uk-UA" w:eastAsia="en-US"/>
         </w:rPr>
-        <w:t xml:space="preserve">Також такі методи непридатні для </w:t>
+        <w:t xml:space="preserve">Також такі методи </w:t>
+      </w:r>
+      <w:r>
+        <w:rPr>
+          <w:rFonts w:eastAsiaTheme="minorEastAsia" w:cs="Times New Roman"/>
+          <w:color w:val="000000"/>
+          <w:szCs w:val="24"/>
+          <w:lang w:val="uk-UA" w:eastAsia="en-US"/>
+        </w:rPr>
+        <w:lastRenderedPageBreak/>
+        <w:t xml:space="preserve">непридатні для </w:t>
       </w:r>
       <w:r>
         <w:rPr>
@@ -10816,7 +13231,27 @@
           <w:szCs w:val="24"/>
           <w:lang w:val="uk-UA" w:eastAsia="en-US"/>
         </w:rPr>
-        <w:t>Отримавши множину Парето-оптимальних рішень відповідальна особа матиме можливість обрати один із множини маршрутів, виходячи з потреб і контексту виконання завдання</w:t>
+        <w:t xml:space="preserve">Отримавши множину </w:t>
+      </w:r>
+      <w:proofErr w:type="spellStart"/>
+      <w:r>
+        <w:rPr>
+          <w:rFonts w:eastAsiaTheme="minorEastAsia" w:cs="Times New Roman"/>
+          <w:color w:val="000000"/>
+          <w:szCs w:val="24"/>
+          <w:lang w:val="uk-UA" w:eastAsia="en-US"/>
+        </w:rPr>
+        <w:t>Парето</w:t>
+      </w:r>
+      <w:proofErr w:type="spellEnd"/>
+      <w:r>
+        <w:rPr>
+          <w:rFonts w:eastAsiaTheme="minorEastAsia" w:cs="Times New Roman"/>
+          <w:color w:val="000000"/>
+          <w:szCs w:val="24"/>
+          <w:lang w:val="uk-UA" w:eastAsia="en-US"/>
+        </w:rPr>
+        <w:t>-оптимальних рішень відповідальна особа матиме можливість обрати один із множини маршрутів, виходячи з потреб і контексту виконання завдання</w:t>
       </w:r>
       <w:r>
         <w:rPr>

</xml_diff>